<commit_message>
Blue task gets the same finished-early reading as Green
The Switzer line only appeared on the Green page, so Blue students had
nothing to move on to. Same sentence, same formatting, after part (b).

Co-Authored-By: Claude Opus 5 (1M context) <noreply@anthropic.com>
</commit_message>
<xml_diff>
--- a/week-2-listening-questioning/week-2-thinker-doer.docx
+++ b/week-2-listening-questioning/week-2-thinker-doer.docx
@@ -6876,6 +6876,21 @@
     </w:p>
     <w:p>
       <w:pPr>
+        <w:spacing w:after="200" w:line="276" w:lineRule="auto"/>
+      </w:pPr>
+      <w:r>
+        <w:rPr>
+          <w:rFonts w:ascii="Calibri" w:hAnsi="Calibri" w:eastAsia="ＭＳ 明朝" w:cs="Calibri" w:eastAsiaTheme="minorEastAsia"/>
+          <w:i/>
+          <w:iCs/>
+          <w:sz w:val="22"/>
+          <w:szCs w:val="22"/>
+        </w:rPr>
+        <w:t>Finished early? Start reading the Hundred Chart Challenge (Switzer) for the clinic.</w:t>
+      </w:r>
+    </w:p>
+    <w:p>
+      <w:pPr>
         <w:pageBreakBefore/>
         <w:spacing w:after="200" w:line="276" w:lineRule="auto"/>
       </w:pPr>

</xml_diff>

<commit_message>
Tighten the Blue task figure back to its original footprint
The rebuilt charts had drifted to 440-twip cells with padding stacked above
and below them. Cells are back to 345 twips -- the exact size the original
chart image printed at (2.396" square) -- and the box no longer carries a
heading, intro line, or full-height filler paragraphs around the figure.

Blue box height drops by roughly a third.

Co-Authored-By: Claude Opus 5 (1M context) <noreply@anthropic.com>
</commit_message>
<xml_diff>
--- a/week-2-listening-questioning/week-2-thinker-doer.docx
+++ b/week-2-listening-questioning/week-2-thinker-doer.docx
@@ -85,38 +85,9 @@
               <w:right w:w="108" w:type="dxa"/>
             </w:tcMar>
           </w:tcPr>
-          <w:p>
-            <w:pPr>
-              <w:spacing w:after="200" w:line="276" w:lineRule="auto"/>
-            </w:pPr>
-            <w:r>
-              <w:rPr>
-                <w:rFonts w:ascii="Calibri" w:hAnsi="Calibri" w:eastAsia="ＭＳ 明朝" w:cs="Calibri" w:eastAsiaTheme="minorEastAsia"/>
-                <w:b/>
-                <w:bCs/>
-                <w:color w:val="1F4E96"/>
-                <w:sz w:val="28"/>
-                <w:szCs w:val="22"/>
-              </w:rPr>
-              <w:t>Squares on Hundred Charts</w:t>
-            </w:r>
-          </w:p>
-          <w:p>
-            <w:pPr>
-              <w:spacing w:after="200" w:line="276" w:lineRule="auto"/>
-            </w:pPr>
-            <w:r>
-              <w:rPr>
-                <w:rFonts w:ascii="Calibri" w:hAnsi="Calibri" w:eastAsia="ＭＳ 明朝" w:cs="Calibri" w:eastAsiaTheme="minorEastAsia"/>
-                <w:sz w:val="22"/>
-                <w:szCs w:val="22"/>
-              </w:rPr>
-              <w:t>Here are three 2×2 squares drawn on a hundred chart. Each of these are 2×2 "hundred chart squares."</w:t>
-            </w:r>
-          </w:p>
           <w:tbl>
             <w:tblPr>
-              <w:tblW w:w="9200" w:type="dxa"/>
+              <w:tblW w:w="7200" w:type="dxa"/>
               <w:tblLayout w:type="fixed"/>
               <w:jc w:val="center"/>
               <w:tblBorders>
@@ -135,9 +106,9 @@
               </w:tblCellMar>
             </w:tblPr>
             <w:tblGrid>
-              <w:gridCol w:w="4400"/>
-              <w:gridCol w:w="400"/>
-              <w:gridCol w:w="4400"/>
+              <w:gridCol w:w="3450"/>
+              <w:gridCol w:w="300"/>
+              <w:gridCol w:w="3450"/>
             </w:tblGrid>
             <w:tr>
               <w:trPr>
@@ -145,7 +116,7 @@
               </w:trPr>
               <w:tc>
                 <w:tcPr>
-                  <w:tcW w:w="4400" w:type="dxa"/>
+                  <w:tcW w:w="3450" w:type="dxa"/>
                   <w:tcBorders>
                     <w:top w:val="nil"/>
                     <w:left w:val="nil"/>
@@ -162,7 +133,7 @@
                 <w:p>
                   <w:pPr>
                     <w:jc w:val="center"/>
-                    <w:spacing w:before="0" w:after="60" w:line="240" w:lineRule="auto"/>
+                    <w:spacing w:before="80" w:after="40" w:line="240" w:lineRule="auto"/>
                   </w:pPr>
                   <w:r>
                     <w:rPr>
@@ -176,7 +147,7 @@
                 </w:p>
                 <w:tbl>
                   <w:tblPr>
-                    <w:tblW w:w="4400" w:type="dxa"/>
+                    <w:tblW w:w="3450" w:type="dxa"/>
                     <w:tblLayout w:type="fixed"/>
                     <w:tblBorders>
                       <w:top w:val="single" w:sz="4" w:space="0" w:color="auto"/>
@@ -194,24 +165,24 @@
                     </w:tblCellMar>
                   </w:tblPr>
                   <w:tblGrid>
-                    <w:gridCol w:w="440"/>
-                    <w:gridCol w:w="440"/>
-                    <w:gridCol w:w="440"/>
-                    <w:gridCol w:w="440"/>
-                    <w:gridCol w:w="440"/>
-                    <w:gridCol w:w="440"/>
-                    <w:gridCol w:w="440"/>
-                    <w:gridCol w:w="440"/>
-                    <w:gridCol w:w="440"/>
-                    <w:gridCol w:w="440"/>
+                    <w:gridCol w:w="345"/>
+                    <w:gridCol w:w="345"/>
+                    <w:gridCol w:w="345"/>
+                    <w:gridCol w:w="345"/>
+                    <w:gridCol w:w="345"/>
+                    <w:gridCol w:w="345"/>
+                    <w:gridCol w:w="345"/>
+                    <w:gridCol w:w="345"/>
+                    <w:gridCol w:w="345"/>
+                    <w:gridCol w:w="345"/>
                   </w:tblGrid>
                   <w:tr>
                     <w:trPr>
-                      <w:trHeight w:hRule="exact" w:val="440"/>
+                      <w:trHeight w:hRule="exact" w:val="345"/>
                     </w:trPr>
                     <w:tc>
                       <w:tcPr>
-                        <w:tcW w:w="440" w:type="dxa"/>
+                        <w:tcW w:w="345" w:type="dxa"/>
                         <w:tcBorders>
                           <w:top w:val="single" w:sz="4" w:space="0" w:color="auto"/>
                           <w:left w:val="single" w:sz="4" w:space="0" w:color="auto"/>
@@ -234,8 +205,8 @@
                         <w:r>
                           <w:rPr>
                             <w:rFonts w:ascii="Calibri" w:hAnsi="Calibri" w:cs="Calibri"/>
-                            <w:sz w:val="16"/>
-                            <w:szCs w:val="16"/>
+                            <w:sz w:val="18"/>
+                            <w:szCs w:val="18"/>
                           </w:rPr>
                           <w:t>1</w:t>
                         </w:r>
@@ -243,7 +214,7 @@
                     </w:tc>
                     <w:tc>
                       <w:tcPr>
-                        <w:tcW w:w="440" w:type="dxa"/>
+                        <w:tcW w:w="345" w:type="dxa"/>
                         <w:tcBorders>
                           <w:top w:val="single" w:sz="4" w:space="0" w:color="auto"/>
                           <w:left w:val="single" w:sz="4" w:space="0" w:color="auto"/>
@@ -266,8 +237,8 @@
                         <w:r>
                           <w:rPr>
                             <w:rFonts w:ascii="Calibri" w:hAnsi="Calibri" w:cs="Calibri"/>
-                            <w:sz w:val="16"/>
-                            <w:szCs w:val="16"/>
+                            <w:sz w:val="18"/>
+                            <w:szCs w:val="18"/>
                           </w:rPr>
                           <w:t>2</w:t>
                         </w:r>
@@ -275,7 +246,7 @@
                     </w:tc>
                     <w:tc>
                       <w:tcPr>
-                        <w:tcW w:w="440" w:type="dxa"/>
+                        <w:tcW w:w="345" w:type="dxa"/>
                         <w:tcBorders>
                           <w:top w:val="single" w:sz="4" w:space="0" w:color="auto"/>
                           <w:left w:val="single" w:sz="4" w:space="0" w:color="auto"/>
@@ -298,8 +269,8 @@
                         <w:r>
                           <w:rPr>
                             <w:rFonts w:ascii="Calibri" w:hAnsi="Calibri" w:cs="Calibri"/>
-                            <w:sz w:val="16"/>
-                            <w:szCs w:val="16"/>
+                            <w:sz w:val="18"/>
+                            <w:szCs w:val="18"/>
                           </w:rPr>
                           <w:t>3</w:t>
                         </w:r>
@@ -307,7 +278,7 @@
                     </w:tc>
                     <w:tc>
                       <w:tcPr>
-                        <w:tcW w:w="440" w:type="dxa"/>
+                        <w:tcW w:w="345" w:type="dxa"/>
                         <w:tcBorders>
                           <w:top w:val="single" w:sz="4" w:space="0" w:color="auto"/>
                           <w:left w:val="single" w:sz="4" w:space="0" w:color="auto"/>
@@ -330,8 +301,8 @@
                         <w:r>
                           <w:rPr>
                             <w:rFonts w:ascii="Calibri" w:hAnsi="Calibri" w:cs="Calibri"/>
-                            <w:sz w:val="16"/>
-                            <w:szCs w:val="16"/>
+                            <w:sz w:val="18"/>
+                            <w:szCs w:val="18"/>
                           </w:rPr>
                           <w:t>4</w:t>
                         </w:r>
@@ -339,7 +310,7 @@
                     </w:tc>
                     <w:tc>
                       <w:tcPr>
-                        <w:tcW w:w="440" w:type="dxa"/>
+                        <w:tcW w:w="345" w:type="dxa"/>
                         <w:tcBorders>
                           <w:top w:val="single" w:sz="4" w:space="0" w:color="auto"/>
                           <w:left w:val="single" w:sz="4" w:space="0" w:color="auto"/>
@@ -362,8 +333,8 @@
                         <w:r>
                           <w:rPr>
                             <w:rFonts w:ascii="Calibri" w:hAnsi="Calibri" w:cs="Calibri"/>
-                            <w:sz w:val="16"/>
-                            <w:szCs w:val="16"/>
+                            <w:sz w:val="18"/>
+                            <w:szCs w:val="18"/>
                           </w:rPr>
                           <w:t>5</w:t>
                         </w:r>
@@ -371,7 +342,7 @@
                     </w:tc>
                     <w:tc>
                       <w:tcPr>
-                        <w:tcW w:w="440" w:type="dxa"/>
+                        <w:tcW w:w="345" w:type="dxa"/>
                         <w:tcBorders>
                           <w:top w:val="single" w:sz="4" w:space="0" w:color="auto"/>
                           <w:left w:val="single" w:sz="4" w:space="0" w:color="auto"/>
@@ -394,8 +365,8 @@
                         <w:r>
                           <w:rPr>
                             <w:rFonts w:ascii="Calibri" w:hAnsi="Calibri" w:cs="Calibri"/>
-                            <w:sz w:val="16"/>
-                            <w:szCs w:val="16"/>
+                            <w:sz w:val="18"/>
+                            <w:szCs w:val="18"/>
                           </w:rPr>
                           <w:t>6</w:t>
                         </w:r>
@@ -403,7 +374,7 @@
                     </w:tc>
                     <w:tc>
                       <w:tcPr>
-                        <w:tcW w:w="440" w:type="dxa"/>
+                        <w:tcW w:w="345" w:type="dxa"/>
                         <w:tcBorders>
                           <w:top w:val="single" w:sz="4" w:space="0" w:color="auto"/>
                           <w:left w:val="single" w:sz="4" w:space="0" w:color="auto"/>
@@ -426,8 +397,8 @@
                         <w:r>
                           <w:rPr>
                             <w:rFonts w:ascii="Calibri" w:hAnsi="Calibri" w:cs="Calibri"/>
-                            <w:sz w:val="16"/>
-                            <w:szCs w:val="16"/>
+                            <w:sz w:val="18"/>
+                            <w:szCs w:val="18"/>
                           </w:rPr>
                           <w:t>7</w:t>
                         </w:r>
@@ -435,7 +406,7 @@
                     </w:tc>
                     <w:tc>
                       <w:tcPr>
-                        <w:tcW w:w="440" w:type="dxa"/>
+                        <w:tcW w:w="345" w:type="dxa"/>
                         <w:tcBorders>
                           <w:top w:val="single" w:sz="4" w:space="0" w:color="auto"/>
                           <w:left w:val="single" w:sz="4" w:space="0" w:color="auto"/>
@@ -458,8 +429,8 @@
                         <w:r>
                           <w:rPr>
                             <w:rFonts w:ascii="Calibri" w:hAnsi="Calibri" w:cs="Calibri"/>
-                            <w:sz w:val="16"/>
-                            <w:szCs w:val="16"/>
+                            <w:sz w:val="18"/>
+                            <w:szCs w:val="18"/>
                           </w:rPr>
                           <w:t>8</w:t>
                         </w:r>
@@ -467,7 +438,7 @@
                     </w:tc>
                     <w:tc>
                       <w:tcPr>
-                        <w:tcW w:w="440" w:type="dxa"/>
+                        <w:tcW w:w="345" w:type="dxa"/>
                         <w:tcBorders>
                           <w:top w:val="single" w:sz="4" w:space="0" w:color="auto"/>
                           <w:left w:val="single" w:sz="4" w:space="0" w:color="auto"/>
@@ -490,8 +461,8 @@
                         <w:r>
                           <w:rPr>
                             <w:rFonts w:ascii="Calibri" w:hAnsi="Calibri" w:cs="Calibri"/>
-                            <w:sz w:val="16"/>
-                            <w:szCs w:val="16"/>
+                            <w:sz w:val="18"/>
+                            <w:szCs w:val="18"/>
                           </w:rPr>
                           <w:t>9</w:t>
                         </w:r>
@@ -499,7 +470,7 @@
                     </w:tc>
                     <w:tc>
                       <w:tcPr>
-                        <w:tcW w:w="440" w:type="dxa"/>
+                        <w:tcW w:w="345" w:type="dxa"/>
                         <w:tcBorders>
                           <w:top w:val="single" w:sz="4" w:space="0" w:color="auto"/>
                           <w:left w:val="single" w:sz="4" w:space="0" w:color="auto"/>
@@ -522,8 +493,8 @@
                         <w:r>
                           <w:rPr>
                             <w:rFonts w:ascii="Calibri" w:hAnsi="Calibri" w:cs="Calibri"/>
-                            <w:sz w:val="16"/>
-                            <w:szCs w:val="16"/>
+                            <w:sz w:val="18"/>
+                            <w:szCs w:val="18"/>
                           </w:rPr>
                           <w:t>10</w:t>
                         </w:r>
@@ -532,11 +503,11 @@
                   </w:tr>
                   <w:tr>
                     <w:trPr>
-                      <w:trHeight w:hRule="exact" w:val="440"/>
+                      <w:trHeight w:hRule="exact" w:val="345"/>
                     </w:trPr>
                     <w:tc>
                       <w:tcPr>
-                        <w:tcW w:w="440" w:type="dxa"/>
+                        <w:tcW w:w="345" w:type="dxa"/>
                         <w:tcBorders>
                           <w:top w:val="single" w:sz="4" w:space="0" w:color="auto"/>
                           <w:left w:val="single" w:sz="4" w:space="0" w:color="auto"/>
@@ -559,8 +530,8 @@
                         <w:r>
                           <w:rPr>
                             <w:rFonts w:ascii="Calibri" w:hAnsi="Calibri" w:cs="Calibri"/>
-                            <w:sz w:val="16"/>
-                            <w:szCs w:val="16"/>
+                            <w:sz w:val="18"/>
+                            <w:szCs w:val="18"/>
                           </w:rPr>
                           <w:t>11</w:t>
                         </w:r>
@@ -568,7 +539,7 @@
                     </w:tc>
                     <w:tc>
                       <w:tcPr>
-                        <w:tcW w:w="440" w:type="dxa"/>
+                        <w:tcW w:w="345" w:type="dxa"/>
                         <w:tcBorders>
                           <w:top w:val="single" w:sz="4" w:space="0" w:color="auto"/>
                           <w:left w:val="single" w:sz="4" w:space="0" w:color="auto"/>
@@ -591,8 +562,8 @@
                         <w:r>
                           <w:rPr>
                             <w:rFonts w:ascii="Calibri" w:hAnsi="Calibri" w:cs="Calibri"/>
-                            <w:sz w:val="16"/>
-                            <w:szCs w:val="16"/>
+                            <w:sz w:val="18"/>
+                            <w:szCs w:val="18"/>
                           </w:rPr>
                           <w:t>12</w:t>
                         </w:r>
@@ -600,7 +571,7 @@
                     </w:tc>
                     <w:tc>
                       <w:tcPr>
-                        <w:tcW w:w="440" w:type="dxa"/>
+                        <w:tcW w:w="345" w:type="dxa"/>
                         <w:tcBorders>
                           <w:top w:val="single" w:sz="4" w:space="0" w:color="auto"/>
                           <w:left w:val="single" w:sz="4" w:space="0" w:color="auto"/>
@@ -623,8 +594,8 @@
                         <w:r>
                           <w:rPr>
                             <w:rFonts w:ascii="Calibri" w:hAnsi="Calibri" w:cs="Calibri"/>
-                            <w:sz w:val="16"/>
-                            <w:szCs w:val="16"/>
+                            <w:sz w:val="18"/>
+                            <w:szCs w:val="18"/>
                           </w:rPr>
                           <w:t>13</w:t>
                         </w:r>
@@ -632,7 +603,7 @@
                     </w:tc>
                     <w:tc>
                       <w:tcPr>
-                        <w:tcW w:w="440" w:type="dxa"/>
+                        <w:tcW w:w="345" w:type="dxa"/>
                         <w:tcBorders>
                           <w:top w:val="single" w:sz="4" w:space="0" w:color="auto"/>
                           <w:left w:val="single" w:sz="4" w:space="0" w:color="auto"/>
@@ -655,8 +626,8 @@
                         <w:r>
                           <w:rPr>
                             <w:rFonts w:ascii="Calibri" w:hAnsi="Calibri" w:cs="Calibri"/>
-                            <w:sz w:val="16"/>
-                            <w:szCs w:val="16"/>
+                            <w:sz w:val="18"/>
+                            <w:szCs w:val="18"/>
                           </w:rPr>
                           <w:t>14</w:t>
                         </w:r>
@@ -664,7 +635,7 @@
                     </w:tc>
                     <w:tc>
                       <w:tcPr>
-                        <w:tcW w:w="440" w:type="dxa"/>
+                        <w:tcW w:w="345" w:type="dxa"/>
                         <w:tcBorders>
                           <w:top w:val="single" w:sz="4" w:space="0" w:color="auto"/>
                           <w:left w:val="single" w:sz="4" w:space="0" w:color="auto"/>
@@ -687,8 +658,8 @@
                         <w:r>
                           <w:rPr>
                             <w:rFonts w:ascii="Calibri" w:hAnsi="Calibri" w:cs="Calibri"/>
-                            <w:sz w:val="16"/>
-                            <w:szCs w:val="16"/>
+                            <w:sz w:val="18"/>
+                            <w:szCs w:val="18"/>
                           </w:rPr>
                           <w:t>15</w:t>
                         </w:r>
@@ -696,7 +667,7 @@
                     </w:tc>
                     <w:tc>
                       <w:tcPr>
-                        <w:tcW w:w="440" w:type="dxa"/>
+                        <w:tcW w:w="345" w:type="dxa"/>
                         <w:tcBorders>
                           <w:top w:val="single" w:sz="4" w:space="0" w:color="auto"/>
                           <w:left w:val="single" w:sz="4" w:space="0" w:color="auto"/>
@@ -719,8 +690,8 @@
                         <w:r>
                           <w:rPr>
                             <w:rFonts w:ascii="Calibri" w:hAnsi="Calibri" w:cs="Calibri"/>
-                            <w:sz w:val="16"/>
-                            <w:szCs w:val="16"/>
+                            <w:sz w:val="18"/>
+                            <w:szCs w:val="18"/>
                           </w:rPr>
                           <w:t>16</w:t>
                         </w:r>
@@ -728,7 +699,7 @@
                     </w:tc>
                     <w:tc>
                       <w:tcPr>
-                        <w:tcW w:w="440" w:type="dxa"/>
+                        <w:tcW w:w="345" w:type="dxa"/>
                         <w:tcBorders>
                           <w:top w:val="single" w:sz="4" w:space="0" w:color="auto"/>
                           <w:left w:val="single" w:sz="4" w:space="0" w:color="auto"/>
@@ -751,8 +722,8 @@
                         <w:r>
                           <w:rPr>
                             <w:rFonts w:ascii="Calibri" w:hAnsi="Calibri" w:cs="Calibri"/>
-                            <w:sz w:val="16"/>
-                            <w:szCs w:val="16"/>
+                            <w:sz w:val="18"/>
+                            <w:szCs w:val="18"/>
                           </w:rPr>
                           <w:t>17</w:t>
                         </w:r>
@@ -760,7 +731,7 @@
                     </w:tc>
                     <w:tc>
                       <w:tcPr>
-                        <w:tcW w:w="440" w:type="dxa"/>
+                        <w:tcW w:w="345" w:type="dxa"/>
                         <w:tcBorders>
                           <w:top w:val="single" w:sz="4" w:space="0" w:color="auto"/>
                           <w:left w:val="single" w:sz="4" w:space="0" w:color="auto"/>
@@ -783,8 +754,8 @@
                         <w:r>
                           <w:rPr>
                             <w:rFonts w:ascii="Calibri" w:hAnsi="Calibri" w:cs="Calibri"/>
-                            <w:sz w:val="16"/>
-                            <w:szCs w:val="16"/>
+                            <w:sz w:val="18"/>
+                            <w:szCs w:val="18"/>
                           </w:rPr>
                           <w:t>18</w:t>
                         </w:r>
@@ -792,7 +763,7 @@
                     </w:tc>
                     <w:tc>
                       <w:tcPr>
-                        <w:tcW w:w="440" w:type="dxa"/>
+                        <w:tcW w:w="345" w:type="dxa"/>
                         <w:tcBorders>
                           <w:top w:val="single" w:sz="4" w:space="0" w:color="auto"/>
                           <w:left w:val="single" w:sz="4" w:space="0" w:color="auto"/>
@@ -815,8 +786,8 @@
                         <w:r>
                           <w:rPr>
                             <w:rFonts w:ascii="Calibri" w:hAnsi="Calibri" w:cs="Calibri"/>
-                            <w:sz w:val="16"/>
-                            <w:szCs w:val="16"/>
+                            <w:sz w:val="18"/>
+                            <w:szCs w:val="18"/>
                           </w:rPr>
                           <w:t>19</w:t>
                         </w:r>
@@ -824,7 +795,7 @@
                     </w:tc>
                     <w:tc>
                       <w:tcPr>
-                        <w:tcW w:w="440" w:type="dxa"/>
+                        <w:tcW w:w="345" w:type="dxa"/>
                         <w:tcBorders>
                           <w:top w:val="single" w:sz="4" w:space="0" w:color="auto"/>
                           <w:left w:val="single" w:sz="4" w:space="0" w:color="auto"/>
@@ -847,8 +818,8 @@
                         <w:r>
                           <w:rPr>
                             <w:rFonts w:ascii="Calibri" w:hAnsi="Calibri" w:cs="Calibri"/>
-                            <w:sz w:val="16"/>
-                            <w:szCs w:val="16"/>
+                            <w:sz w:val="18"/>
+                            <w:szCs w:val="18"/>
                           </w:rPr>
                           <w:t>20</w:t>
                         </w:r>
@@ -857,11 +828,11 @@
                   </w:tr>
                   <w:tr>
                     <w:trPr>
-                      <w:trHeight w:hRule="exact" w:val="440"/>
+                      <w:trHeight w:hRule="exact" w:val="345"/>
                     </w:trPr>
                     <w:tc>
                       <w:tcPr>
-                        <w:tcW w:w="440" w:type="dxa"/>
+                        <w:tcW w:w="345" w:type="dxa"/>
                         <w:tcBorders>
                           <w:top w:val="single" w:sz="4" w:space="0" w:color="auto"/>
                           <w:left w:val="single" w:sz="4" w:space="0" w:color="auto"/>
@@ -884,8 +855,8 @@
                         <w:r>
                           <w:rPr>
                             <w:rFonts w:ascii="Calibri" w:hAnsi="Calibri" w:cs="Calibri"/>
-                            <w:sz w:val="16"/>
-                            <w:szCs w:val="16"/>
+                            <w:sz w:val="18"/>
+                            <w:szCs w:val="18"/>
                           </w:rPr>
                           <w:t>21</w:t>
                         </w:r>
@@ -893,7 +864,7 @@
                     </w:tc>
                     <w:tc>
                       <w:tcPr>
-                        <w:tcW w:w="440" w:type="dxa"/>
+                        <w:tcW w:w="345" w:type="dxa"/>
                         <w:tcBorders>
                           <w:top w:val="single" w:sz="4" w:space="0" w:color="auto"/>
                           <w:left w:val="single" w:sz="4" w:space="0" w:color="auto"/>
@@ -916,8 +887,8 @@
                         <w:r>
                           <w:rPr>
                             <w:rFonts w:ascii="Calibri" w:hAnsi="Calibri" w:cs="Calibri"/>
-                            <w:sz w:val="16"/>
-                            <w:szCs w:val="16"/>
+                            <w:sz w:val="18"/>
+                            <w:szCs w:val="18"/>
                           </w:rPr>
                           <w:t>22</w:t>
                         </w:r>
@@ -925,7 +896,7 @@
                     </w:tc>
                     <w:tc>
                       <w:tcPr>
-                        <w:tcW w:w="440" w:type="dxa"/>
+                        <w:tcW w:w="345" w:type="dxa"/>
                         <w:tcBorders>
                           <w:top w:val="single" w:sz="4" w:space="0" w:color="auto"/>
                           <w:left w:val="single" w:sz="4" w:space="0" w:color="auto"/>
@@ -949,8 +920,8 @@
                         <w:r>
                           <w:rPr>
                             <w:rFonts w:ascii="Calibri" w:hAnsi="Calibri" w:cs="Calibri"/>
-                            <w:sz w:val="16"/>
-                            <w:szCs w:val="16"/>
+                            <w:sz w:val="18"/>
+                            <w:szCs w:val="18"/>
                           </w:rPr>
                           <w:t>23</w:t>
                         </w:r>
@@ -958,7 +929,7 @@
                     </w:tc>
                     <w:tc>
                       <w:tcPr>
-                        <w:tcW w:w="440" w:type="dxa"/>
+                        <w:tcW w:w="345" w:type="dxa"/>
                         <w:tcBorders>
                           <w:top w:val="single" w:sz="4" w:space="0" w:color="auto"/>
                           <w:left w:val="single" w:sz="4" w:space="0" w:color="auto"/>
@@ -982,8 +953,8 @@
                         <w:r>
                           <w:rPr>
                             <w:rFonts w:ascii="Calibri" w:hAnsi="Calibri" w:cs="Calibri"/>
-                            <w:sz w:val="16"/>
-                            <w:szCs w:val="16"/>
+                            <w:sz w:val="18"/>
+                            <w:szCs w:val="18"/>
                           </w:rPr>
                           <w:t>24</w:t>
                         </w:r>
@@ -991,7 +962,7 @@
                     </w:tc>
                     <w:tc>
                       <w:tcPr>
-                        <w:tcW w:w="440" w:type="dxa"/>
+                        <w:tcW w:w="345" w:type="dxa"/>
                         <w:tcBorders>
                           <w:top w:val="single" w:sz="4" w:space="0" w:color="auto"/>
                           <w:left w:val="single" w:sz="4" w:space="0" w:color="auto"/>
@@ -1014,8 +985,8 @@
                         <w:r>
                           <w:rPr>
                             <w:rFonts w:ascii="Calibri" w:hAnsi="Calibri" w:cs="Calibri"/>
-                            <w:sz w:val="16"/>
-                            <w:szCs w:val="16"/>
+                            <w:sz w:val="18"/>
+                            <w:szCs w:val="18"/>
                           </w:rPr>
                           <w:t>25</w:t>
                         </w:r>
@@ -1023,7 +994,7 @@
                     </w:tc>
                     <w:tc>
                       <w:tcPr>
-                        <w:tcW w:w="440" w:type="dxa"/>
+                        <w:tcW w:w="345" w:type="dxa"/>
                         <w:tcBorders>
                           <w:top w:val="single" w:sz="4" w:space="0" w:color="auto"/>
                           <w:left w:val="single" w:sz="4" w:space="0" w:color="auto"/>
@@ -1046,8 +1017,8 @@
                         <w:r>
                           <w:rPr>
                             <w:rFonts w:ascii="Calibri" w:hAnsi="Calibri" w:cs="Calibri"/>
-                            <w:sz w:val="16"/>
-                            <w:szCs w:val="16"/>
+                            <w:sz w:val="18"/>
+                            <w:szCs w:val="18"/>
                           </w:rPr>
                           <w:t>26</w:t>
                         </w:r>
@@ -1055,7 +1026,7 @@
                     </w:tc>
                     <w:tc>
                       <w:tcPr>
-                        <w:tcW w:w="440" w:type="dxa"/>
+                        <w:tcW w:w="345" w:type="dxa"/>
                         <w:tcBorders>
                           <w:top w:val="single" w:sz="4" w:space="0" w:color="auto"/>
                           <w:left w:val="single" w:sz="4" w:space="0" w:color="auto"/>
@@ -1078,8 +1049,8 @@
                         <w:r>
                           <w:rPr>
                             <w:rFonts w:ascii="Calibri" w:hAnsi="Calibri" w:cs="Calibri"/>
-                            <w:sz w:val="16"/>
-                            <w:szCs w:val="16"/>
+                            <w:sz w:val="18"/>
+                            <w:szCs w:val="18"/>
                           </w:rPr>
                           <w:t>27</w:t>
                         </w:r>
@@ -1087,7 +1058,7 @@
                     </w:tc>
                     <w:tc>
                       <w:tcPr>
-                        <w:tcW w:w="440" w:type="dxa"/>
+                        <w:tcW w:w="345" w:type="dxa"/>
                         <w:tcBorders>
                           <w:top w:val="single" w:sz="4" w:space="0" w:color="auto"/>
                           <w:left w:val="single" w:sz="4" w:space="0" w:color="auto"/>
@@ -1110,8 +1081,8 @@
                         <w:r>
                           <w:rPr>
                             <w:rFonts w:ascii="Calibri" w:hAnsi="Calibri" w:cs="Calibri"/>
-                            <w:sz w:val="16"/>
-                            <w:szCs w:val="16"/>
+                            <w:sz w:val="18"/>
+                            <w:szCs w:val="18"/>
                           </w:rPr>
                           <w:t>28</w:t>
                         </w:r>
@@ -1119,7 +1090,7 @@
                     </w:tc>
                     <w:tc>
                       <w:tcPr>
-                        <w:tcW w:w="440" w:type="dxa"/>
+                        <w:tcW w:w="345" w:type="dxa"/>
                         <w:tcBorders>
                           <w:top w:val="single" w:sz="4" w:space="0" w:color="auto"/>
                           <w:left w:val="single" w:sz="4" w:space="0" w:color="auto"/>
@@ -1142,8 +1113,8 @@
                         <w:r>
                           <w:rPr>
                             <w:rFonts w:ascii="Calibri" w:hAnsi="Calibri" w:cs="Calibri"/>
-                            <w:sz w:val="16"/>
-                            <w:szCs w:val="16"/>
+                            <w:sz w:val="18"/>
+                            <w:szCs w:val="18"/>
                           </w:rPr>
                           <w:t>29</w:t>
                         </w:r>
@@ -1151,7 +1122,7 @@
                     </w:tc>
                     <w:tc>
                       <w:tcPr>
-                        <w:tcW w:w="440" w:type="dxa"/>
+                        <w:tcW w:w="345" w:type="dxa"/>
                         <w:tcBorders>
                           <w:top w:val="single" w:sz="4" w:space="0" w:color="auto"/>
                           <w:left w:val="single" w:sz="4" w:space="0" w:color="auto"/>
@@ -1174,8 +1145,8 @@
                         <w:r>
                           <w:rPr>
                             <w:rFonts w:ascii="Calibri" w:hAnsi="Calibri" w:cs="Calibri"/>
-                            <w:sz w:val="16"/>
-                            <w:szCs w:val="16"/>
+                            <w:sz w:val="18"/>
+                            <w:szCs w:val="18"/>
                           </w:rPr>
                           <w:t>30</w:t>
                         </w:r>
@@ -1184,11 +1155,11 @@
                   </w:tr>
                   <w:tr>
                     <w:trPr>
-                      <w:trHeight w:hRule="exact" w:val="440"/>
+                      <w:trHeight w:hRule="exact" w:val="345"/>
                     </w:trPr>
                     <w:tc>
                       <w:tcPr>
-                        <w:tcW w:w="440" w:type="dxa"/>
+                        <w:tcW w:w="345" w:type="dxa"/>
                         <w:tcBorders>
                           <w:top w:val="single" w:sz="4" w:space="0" w:color="auto"/>
                           <w:left w:val="single" w:sz="4" w:space="0" w:color="auto"/>
@@ -1211,8 +1182,8 @@
                         <w:r>
                           <w:rPr>
                             <w:rFonts w:ascii="Calibri" w:hAnsi="Calibri" w:cs="Calibri"/>
-                            <w:sz w:val="16"/>
-                            <w:szCs w:val="16"/>
+                            <w:sz w:val="18"/>
+                            <w:szCs w:val="18"/>
                           </w:rPr>
                           <w:t>31</w:t>
                         </w:r>
@@ -1220,7 +1191,7 @@
                     </w:tc>
                     <w:tc>
                       <w:tcPr>
-                        <w:tcW w:w="440" w:type="dxa"/>
+                        <w:tcW w:w="345" w:type="dxa"/>
                         <w:tcBorders>
                           <w:top w:val="single" w:sz="4" w:space="0" w:color="auto"/>
                           <w:left w:val="single" w:sz="4" w:space="0" w:color="auto"/>
@@ -1243,8 +1214,8 @@
                         <w:r>
                           <w:rPr>
                             <w:rFonts w:ascii="Calibri" w:hAnsi="Calibri" w:cs="Calibri"/>
-                            <w:sz w:val="16"/>
-                            <w:szCs w:val="16"/>
+                            <w:sz w:val="18"/>
+                            <w:szCs w:val="18"/>
                           </w:rPr>
                           <w:t>32</w:t>
                         </w:r>
@@ -1252,7 +1223,7 @@
                     </w:tc>
                     <w:tc>
                       <w:tcPr>
-                        <w:tcW w:w="440" w:type="dxa"/>
+                        <w:tcW w:w="345" w:type="dxa"/>
                         <w:tcBorders>
                           <w:top w:val="single" w:sz="4" w:space="0" w:color="auto"/>
                           <w:left w:val="single" w:sz="4" w:space="0" w:color="auto"/>
@@ -1276,8 +1247,8 @@
                         <w:r>
                           <w:rPr>
                             <w:rFonts w:ascii="Calibri" w:hAnsi="Calibri" w:cs="Calibri"/>
-                            <w:sz w:val="16"/>
-                            <w:szCs w:val="16"/>
+                            <w:sz w:val="18"/>
+                            <w:szCs w:val="18"/>
                           </w:rPr>
                           <w:t>33</w:t>
                         </w:r>
@@ -1285,7 +1256,7 @@
                     </w:tc>
                     <w:tc>
                       <w:tcPr>
-                        <w:tcW w:w="440" w:type="dxa"/>
+                        <w:tcW w:w="345" w:type="dxa"/>
                         <w:tcBorders>
                           <w:top w:val="single" w:sz="4" w:space="0" w:color="auto"/>
                           <w:left w:val="single" w:sz="4" w:space="0" w:color="auto"/>
@@ -1309,8 +1280,8 @@
                         <w:r>
                           <w:rPr>
                             <w:rFonts w:ascii="Calibri" w:hAnsi="Calibri" w:cs="Calibri"/>
-                            <w:sz w:val="16"/>
-                            <w:szCs w:val="16"/>
+                            <w:sz w:val="18"/>
+                            <w:szCs w:val="18"/>
                           </w:rPr>
                           <w:t>34</w:t>
                         </w:r>
@@ -1318,7 +1289,7 @@
                     </w:tc>
                     <w:tc>
                       <w:tcPr>
-                        <w:tcW w:w="440" w:type="dxa"/>
+                        <w:tcW w:w="345" w:type="dxa"/>
                         <w:tcBorders>
                           <w:top w:val="single" w:sz="4" w:space="0" w:color="auto"/>
                           <w:left w:val="single" w:sz="4" w:space="0" w:color="auto"/>
@@ -1341,8 +1312,8 @@
                         <w:r>
                           <w:rPr>
                             <w:rFonts w:ascii="Calibri" w:hAnsi="Calibri" w:cs="Calibri"/>
-                            <w:sz w:val="16"/>
-                            <w:szCs w:val="16"/>
+                            <w:sz w:val="18"/>
+                            <w:szCs w:val="18"/>
                           </w:rPr>
                           <w:t>35</w:t>
                         </w:r>
@@ -1350,7 +1321,7 @@
                     </w:tc>
                     <w:tc>
                       <w:tcPr>
-                        <w:tcW w:w="440" w:type="dxa"/>
+                        <w:tcW w:w="345" w:type="dxa"/>
                         <w:tcBorders>
                           <w:top w:val="single" w:sz="4" w:space="0" w:color="auto"/>
                           <w:left w:val="single" w:sz="4" w:space="0" w:color="auto"/>
@@ -1373,8 +1344,8 @@
                         <w:r>
                           <w:rPr>
                             <w:rFonts w:ascii="Calibri" w:hAnsi="Calibri" w:cs="Calibri"/>
-                            <w:sz w:val="16"/>
-                            <w:szCs w:val="16"/>
+                            <w:sz w:val="18"/>
+                            <w:szCs w:val="18"/>
                           </w:rPr>
                           <w:t>36</w:t>
                         </w:r>
@@ -1382,7 +1353,7 @@
                     </w:tc>
                     <w:tc>
                       <w:tcPr>
-                        <w:tcW w:w="440" w:type="dxa"/>
+                        <w:tcW w:w="345" w:type="dxa"/>
                         <w:tcBorders>
                           <w:top w:val="single" w:sz="4" w:space="0" w:color="auto"/>
                           <w:left w:val="single" w:sz="4" w:space="0" w:color="auto"/>
@@ -1405,8 +1376,8 @@
                         <w:r>
                           <w:rPr>
                             <w:rFonts w:ascii="Calibri" w:hAnsi="Calibri" w:cs="Calibri"/>
-                            <w:sz w:val="16"/>
-                            <w:szCs w:val="16"/>
+                            <w:sz w:val="18"/>
+                            <w:szCs w:val="18"/>
                           </w:rPr>
                           <w:t>37</w:t>
                         </w:r>
@@ -1414,7 +1385,7 @@
                     </w:tc>
                     <w:tc>
                       <w:tcPr>
-                        <w:tcW w:w="440" w:type="dxa"/>
+                        <w:tcW w:w="345" w:type="dxa"/>
                         <w:tcBorders>
                           <w:top w:val="single" w:sz="4" w:space="0" w:color="auto"/>
                           <w:left w:val="single" w:sz="4" w:space="0" w:color="auto"/>
@@ -1437,8 +1408,8 @@
                         <w:r>
                           <w:rPr>
                             <w:rFonts w:ascii="Calibri" w:hAnsi="Calibri" w:cs="Calibri"/>
-                            <w:sz w:val="16"/>
-                            <w:szCs w:val="16"/>
+                            <w:sz w:val="18"/>
+                            <w:szCs w:val="18"/>
                           </w:rPr>
                           <w:t>38</w:t>
                         </w:r>
@@ -1446,7 +1417,7 @@
                     </w:tc>
                     <w:tc>
                       <w:tcPr>
-                        <w:tcW w:w="440" w:type="dxa"/>
+                        <w:tcW w:w="345" w:type="dxa"/>
                         <w:tcBorders>
                           <w:top w:val="single" w:sz="4" w:space="0" w:color="auto"/>
                           <w:left w:val="single" w:sz="4" w:space="0" w:color="auto"/>
@@ -1469,8 +1440,8 @@
                         <w:r>
                           <w:rPr>
                             <w:rFonts w:ascii="Calibri" w:hAnsi="Calibri" w:cs="Calibri"/>
-                            <w:sz w:val="16"/>
-                            <w:szCs w:val="16"/>
+                            <w:sz w:val="18"/>
+                            <w:szCs w:val="18"/>
                           </w:rPr>
                           <w:t>39</w:t>
                         </w:r>
@@ -1478,7 +1449,7 @@
                     </w:tc>
                     <w:tc>
                       <w:tcPr>
-                        <w:tcW w:w="440" w:type="dxa"/>
+                        <w:tcW w:w="345" w:type="dxa"/>
                         <w:tcBorders>
                           <w:top w:val="single" w:sz="4" w:space="0" w:color="auto"/>
                           <w:left w:val="single" w:sz="4" w:space="0" w:color="auto"/>
@@ -1501,8 +1472,8 @@
                         <w:r>
                           <w:rPr>
                             <w:rFonts w:ascii="Calibri" w:hAnsi="Calibri" w:cs="Calibri"/>
-                            <w:sz w:val="16"/>
-                            <w:szCs w:val="16"/>
+                            <w:sz w:val="18"/>
+                            <w:szCs w:val="18"/>
                           </w:rPr>
                           <w:t>40</w:t>
                         </w:r>
@@ -1511,11 +1482,11 @@
                   </w:tr>
                   <w:tr>
                     <w:trPr>
-                      <w:trHeight w:hRule="exact" w:val="440"/>
+                      <w:trHeight w:hRule="exact" w:val="345"/>
                     </w:trPr>
                     <w:tc>
                       <w:tcPr>
-                        <w:tcW w:w="440" w:type="dxa"/>
+                        <w:tcW w:w="345" w:type="dxa"/>
                         <w:tcBorders>
                           <w:top w:val="single" w:sz="4" w:space="0" w:color="auto"/>
                           <w:left w:val="single" w:sz="4" w:space="0" w:color="auto"/>
@@ -1538,8 +1509,8 @@
                         <w:r>
                           <w:rPr>
                             <w:rFonts w:ascii="Calibri" w:hAnsi="Calibri" w:cs="Calibri"/>
-                            <w:sz w:val="16"/>
-                            <w:szCs w:val="16"/>
+                            <w:sz w:val="18"/>
+                            <w:szCs w:val="18"/>
                           </w:rPr>
                           <w:t>41</w:t>
                         </w:r>
@@ -1547,7 +1518,7 @@
                     </w:tc>
                     <w:tc>
                       <w:tcPr>
-                        <w:tcW w:w="440" w:type="dxa"/>
+                        <w:tcW w:w="345" w:type="dxa"/>
                         <w:tcBorders>
                           <w:top w:val="single" w:sz="4" w:space="0" w:color="auto"/>
                           <w:left w:val="single" w:sz="4" w:space="0" w:color="auto"/>
@@ -1570,8 +1541,8 @@
                         <w:r>
                           <w:rPr>
                             <w:rFonts w:ascii="Calibri" w:hAnsi="Calibri" w:cs="Calibri"/>
-                            <w:sz w:val="16"/>
-                            <w:szCs w:val="16"/>
+                            <w:sz w:val="18"/>
+                            <w:szCs w:val="18"/>
                           </w:rPr>
                           <w:t>42</w:t>
                         </w:r>
@@ -1579,7 +1550,7 @@
                     </w:tc>
                     <w:tc>
                       <w:tcPr>
-                        <w:tcW w:w="440" w:type="dxa"/>
+                        <w:tcW w:w="345" w:type="dxa"/>
                         <w:tcBorders>
                           <w:top w:val="single" w:sz="4" w:space="0" w:color="auto"/>
                           <w:left w:val="single" w:sz="4" w:space="0" w:color="auto"/>
@@ -1602,8 +1573,8 @@
                         <w:r>
                           <w:rPr>
                             <w:rFonts w:ascii="Calibri" w:hAnsi="Calibri" w:cs="Calibri"/>
-                            <w:sz w:val="16"/>
-                            <w:szCs w:val="16"/>
+                            <w:sz w:val="18"/>
+                            <w:szCs w:val="18"/>
                           </w:rPr>
                           <w:t>43</w:t>
                         </w:r>
@@ -1611,7 +1582,7 @@
                     </w:tc>
                     <w:tc>
                       <w:tcPr>
-                        <w:tcW w:w="440" w:type="dxa"/>
+                        <w:tcW w:w="345" w:type="dxa"/>
                         <w:tcBorders>
                           <w:top w:val="single" w:sz="4" w:space="0" w:color="auto"/>
                           <w:left w:val="single" w:sz="4" w:space="0" w:color="auto"/>
@@ -1634,8 +1605,8 @@
                         <w:r>
                           <w:rPr>
                             <w:rFonts w:ascii="Calibri" w:hAnsi="Calibri" w:cs="Calibri"/>
-                            <w:sz w:val="16"/>
-                            <w:szCs w:val="16"/>
+                            <w:sz w:val="18"/>
+                            <w:szCs w:val="18"/>
                           </w:rPr>
                           <w:t>44</w:t>
                         </w:r>
@@ -1643,7 +1614,7 @@
                     </w:tc>
                     <w:tc>
                       <w:tcPr>
-                        <w:tcW w:w="440" w:type="dxa"/>
+                        <w:tcW w:w="345" w:type="dxa"/>
                         <w:tcBorders>
                           <w:top w:val="single" w:sz="4" w:space="0" w:color="auto"/>
                           <w:left w:val="single" w:sz="4" w:space="0" w:color="auto"/>
@@ -1666,8 +1637,8 @@
                         <w:r>
                           <w:rPr>
                             <w:rFonts w:ascii="Calibri" w:hAnsi="Calibri" w:cs="Calibri"/>
-                            <w:sz w:val="16"/>
-                            <w:szCs w:val="16"/>
+                            <w:sz w:val="18"/>
+                            <w:szCs w:val="18"/>
                           </w:rPr>
                           <w:t>45</w:t>
                         </w:r>
@@ -1675,7 +1646,7 @@
                     </w:tc>
                     <w:tc>
                       <w:tcPr>
-                        <w:tcW w:w="440" w:type="dxa"/>
+                        <w:tcW w:w="345" w:type="dxa"/>
                         <w:tcBorders>
                           <w:top w:val="single" w:sz="4" w:space="0" w:color="auto"/>
                           <w:left w:val="single" w:sz="4" w:space="0" w:color="auto"/>
@@ -1699,8 +1670,8 @@
                         <w:r>
                           <w:rPr>
                             <w:rFonts w:ascii="Calibri" w:hAnsi="Calibri" w:cs="Calibri"/>
-                            <w:sz w:val="16"/>
-                            <w:szCs w:val="16"/>
+                            <w:sz w:val="18"/>
+                            <w:szCs w:val="18"/>
                           </w:rPr>
                           <w:t>46</w:t>
                         </w:r>
@@ -1708,7 +1679,7 @@
                     </w:tc>
                     <w:tc>
                       <w:tcPr>
-                        <w:tcW w:w="440" w:type="dxa"/>
+                        <w:tcW w:w="345" w:type="dxa"/>
                         <w:tcBorders>
                           <w:top w:val="single" w:sz="4" w:space="0" w:color="auto"/>
                           <w:left w:val="single" w:sz="4" w:space="0" w:color="auto"/>
@@ -1732,8 +1703,8 @@
                         <w:r>
                           <w:rPr>
                             <w:rFonts w:ascii="Calibri" w:hAnsi="Calibri" w:cs="Calibri"/>
-                            <w:sz w:val="16"/>
-                            <w:szCs w:val="16"/>
+                            <w:sz w:val="18"/>
+                            <w:szCs w:val="18"/>
                           </w:rPr>
                           <w:t>47</w:t>
                         </w:r>
@@ -1741,7 +1712,7 @@
                     </w:tc>
                     <w:tc>
                       <w:tcPr>
-                        <w:tcW w:w="440" w:type="dxa"/>
+                        <w:tcW w:w="345" w:type="dxa"/>
                         <w:tcBorders>
                           <w:top w:val="single" w:sz="4" w:space="0" w:color="auto"/>
                           <w:left w:val="single" w:sz="4" w:space="0" w:color="auto"/>
@@ -1764,8 +1735,8 @@
                         <w:r>
                           <w:rPr>
                             <w:rFonts w:ascii="Calibri" w:hAnsi="Calibri" w:cs="Calibri"/>
-                            <w:sz w:val="16"/>
-                            <w:szCs w:val="16"/>
+                            <w:sz w:val="18"/>
+                            <w:szCs w:val="18"/>
                           </w:rPr>
                           <w:t>48</w:t>
                         </w:r>
@@ -1773,7 +1744,7 @@
                     </w:tc>
                     <w:tc>
                       <w:tcPr>
-                        <w:tcW w:w="440" w:type="dxa"/>
+                        <w:tcW w:w="345" w:type="dxa"/>
                         <w:tcBorders>
                           <w:top w:val="single" w:sz="4" w:space="0" w:color="auto"/>
                           <w:left w:val="single" w:sz="4" w:space="0" w:color="auto"/>
@@ -1796,8 +1767,8 @@
                         <w:r>
                           <w:rPr>
                             <w:rFonts w:ascii="Calibri" w:hAnsi="Calibri" w:cs="Calibri"/>
-                            <w:sz w:val="16"/>
-                            <w:szCs w:val="16"/>
+                            <w:sz w:val="18"/>
+                            <w:szCs w:val="18"/>
                           </w:rPr>
                           <w:t>49</w:t>
                         </w:r>
@@ -1805,7 +1776,7 @@
                     </w:tc>
                     <w:tc>
                       <w:tcPr>
-                        <w:tcW w:w="440" w:type="dxa"/>
+                        <w:tcW w:w="345" w:type="dxa"/>
                         <w:tcBorders>
                           <w:top w:val="single" w:sz="4" w:space="0" w:color="auto"/>
                           <w:left w:val="single" w:sz="4" w:space="0" w:color="auto"/>
@@ -1828,8 +1799,8 @@
                         <w:r>
                           <w:rPr>
                             <w:rFonts w:ascii="Calibri" w:hAnsi="Calibri" w:cs="Calibri"/>
-                            <w:sz w:val="16"/>
-                            <w:szCs w:val="16"/>
+                            <w:sz w:val="18"/>
+                            <w:szCs w:val="18"/>
                           </w:rPr>
                           <w:t>50</w:t>
                         </w:r>
@@ -1838,11 +1809,11 @@
                   </w:tr>
                   <w:tr>
                     <w:trPr>
-                      <w:trHeight w:hRule="exact" w:val="440"/>
+                      <w:trHeight w:hRule="exact" w:val="345"/>
                     </w:trPr>
                     <w:tc>
                       <w:tcPr>
-                        <w:tcW w:w="440" w:type="dxa"/>
+                        <w:tcW w:w="345" w:type="dxa"/>
                         <w:tcBorders>
                           <w:top w:val="single" w:sz="4" w:space="0" w:color="auto"/>
                           <w:left w:val="single" w:sz="4" w:space="0" w:color="auto"/>
@@ -1865,8 +1836,8 @@
                         <w:r>
                           <w:rPr>
                             <w:rFonts w:ascii="Calibri" w:hAnsi="Calibri" w:cs="Calibri"/>
-                            <w:sz w:val="16"/>
-                            <w:szCs w:val="16"/>
+                            <w:sz w:val="18"/>
+                            <w:szCs w:val="18"/>
                           </w:rPr>
                           <w:t>51</w:t>
                         </w:r>
@@ -1874,7 +1845,7 @@
                     </w:tc>
                     <w:tc>
                       <w:tcPr>
-                        <w:tcW w:w="440" w:type="dxa"/>
+                        <w:tcW w:w="345" w:type="dxa"/>
                         <w:tcBorders>
                           <w:top w:val="single" w:sz="4" w:space="0" w:color="auto"/>
                           <w:left w:val="single" w:sz="4" w:space="0" w:color="auto"/>
@@ -1897,8 +1868,8 @@
                         <w:r>
                           <w:rPr>
                             <w:rFonts w:ascii="Calibri" w:hAnsi="Calibri" w:cs="Calibri"/>
-                            <w:sz w:val="16"/>
-                            <w:szCs w:val="16"/>
+                            <w:sz w:val="18"/>
+                            <w:szCs w:val="18"/>
                           </w:rPr>
                           <w:t>52</w:t>
                         </w:r>
@@ -1906,7 +1877,7 @@
                     </w:tc>
                     <w:tc>
                       <w:tcPr>
-                        <w:tcW w:w="440" w:type="dxa"/>
+                        <w:tcW w:w="345" w:type="dxa"/>
                         <w:tcBorders>
                           <w:top w:val="single" w:sz="4" w:space="0" w:color="auto"/>
                           <w:left w:val="single" w:sz="4" w:space="0" w:color="auto"/>
@@ -1929,8 +1900,8 @@
                         <w:r>
                           <w:rPr>
                             <w:rFonts w:ascii="Calibri" w:hAnsi="Calibri" w:cs="Calibri"/>
-                            <w:sz w:val="16"/>
-                            <w:szCs w:val="16"/>
+                            <w:sz w:val="18"/>
+                            <w:szCs w:val="18"/>
                           </w:rPr>
                           <w:t>53</w:t>
                         </w:r>
@@ -1938,7 +1909,7 @@
                     </w:tc>
                     <w:tc>
                       <w:tcPr>
-                        <w:tcW w:w="440" w:type="dxa"/>
+                        <w:tcW w:w="345" w:type="dxa"/>
                         <w:tcBorders>
                           <w:top w:val="single" w:sz="4" w:space="0" w:color="auto"/>
                           <w:left w:val="single" w:sz="4" w:space="0" w:color="auto"/>
@@ -1961,8 +1932,8 @@
                         <w:r>
                           <w:rPr>
                             <w:rFonts w:ascii="Calibri" w:hAnsi="Calibri" w:cs="Calibri"/>
-                            <w:sz w:val="16"/>
-                            <w:szCs w:val="16"/>
+                            <w:sz w:val="18"/>
+                            <w:szCs w:val="18"/>
                           </w:rPr>
                           <w:t>54</w:t>
                         </w:r>
@@ -1970,7 +1941,7 @@
                     </w:tc>
                     <w:tc>
                       <w:tcPr>
-                        <w:tcW w:w="440" w:type="dxa"/>
+                        <w:tcW w:w="345" w:type="dxa"/>
                         <w:tcBorders>
                           <w:top w:val="single" w:sz="4" w:space="0" w:color="auto"/>
                           <w:left w:val="single" w:sz="4" w:space="0" w:color="auto"/>
@@ -1993,8 +1964,8 @@
                         <w:r>
                           <w:rPr>
                             <w:rFonts w:ascii="Calibri" w:hAnsi="Calibri" w:cs="Calibri"/>
-                            <w:sz w:val="16"/>
-                            <w:szCs w:val="16"/>
+                            <w:sz w:val="18"/>
+                            <w:szCs w:val="18"/>
                           </w:rPr>
                           <w:t>55</w:t>
                         </w:r>
@@ -2002,7 +1973,7 @@
                     </w:tc>
                     <w:tc>
                       <w:tcPr>
-                        <w:tcW w:w="440" w:type="dxa"/>
+                        <w:tcW w:w="345" w:type="dxa"/>
                         <w:tcBorders>
                           <w:top w:val="single" w:sz="4" w:space="0" w:color="auto"/>
                           <w:left w:val="single" w:sz="4" w:space="0" w:color="auto"/>
@@ -2026,8 +1997,8 @@
                         <w:r>
                           <w:rPr>
                             <w:rFonts w:ascii="Calibri" w:hAnsi="Calibri" w:cs="Calibri"/>
-                            <w:sz w:val="16"/>
-                            <w:szCs w:val="16"/>
+                            <w:sz w:val="18"/>
+                            <w:szCs w:val="18"/>
                           </w:rPr>
                           <w:t>56</w:t>
                         </w:r>
@@ -2035,7 +2006,7 @@
                     </w:tc>
                     <w:tc>
                       <w:tcPr>
-                        <w:tcW w:w="440" w:type="dxa"/>
+                        <w:tcW w:w="345" w:type="dxa"/>
                         <w:tcBorders>
                           <w:top w:val="single" w:sz="4" w:space="0" w:color="auto"/>
                           <w:left w:val="single" w:sz="4" w:space="0" w:color="auto"/>
@@ -2059,8 +2030,8 @@
                         <w:r>
                           <w:rPr>
                             <w:rFonts w:ascii="Calibri" w:hAnsi="Calibri" w:cs="Calibri"/>
-                            <w:sz w:val="16"/>
-                            <w:szCs w:val="16"/>
+                            <w:sz w:val="18"/>
+                            <w:szCs w:val="18"/>
                           </w:rPr>
                           <w:t>57</w:t>
                         </w:r>
@@ -2068,7 +2039,7 @@
                     </w:tc>
                     <w:tc>
                       <w:tcPr>
-                        <w:tcW w:w="440" w:type="dxa"/>
+                        <w:tcW w:w="345" w:type="dxa"/>
                         <w:tcBorders>
                           <w:top w:val="single" w:sz="4" w:space="0" w:color="auto"/>
                           <w:left w:val="single" w:sz="4" w:space="0" w:color="auto"/>
@@ -2091,8 +2062,8 @@
                         <w:r>
                           <w:rPr>
                             <w:rFonts w:ascii="Calibri" w:hAnsi="Calibri" w:cs="Calibri"/>
-                            <w:sz w:val="16"/>
-                            <w:szCs w:val="16"/>
+                            <w:sz w:val="18"/>
+                            <w:szCs w:val="18"/>
                           </w:rPr>
                           <w:t>58</w:t>
                         </w:r>
@@ -2100,7 +2071,7 @@
                     </w:tc>
                     <w:tc>
                       <w:tcPr>
-                        <w:tcW w:w="440" w:type="dxa"/>
+                        <w:tcW w:w="345" w:type="dxa"/>
                         <w:tcBorders>
                           <w:top w:val="single" w:sz="4" w:space="0" w:color="auto"/>
                           <w:left w:val="single" w:sz="4" w:space="0" w:color="auto"/>
@@ -2123,8 +2094,8 @@
                         <w:r>
                           <w:rPr>
                             <w:rFonts w:ascii="Calibri" w:hAnsi="Calibri" w:cs="Calibri"/>
-                            <w:sz w:val="16"/>
-                            <w:szCs w:val="16"/>
+                            <w:sz w:val="18"/>
+                            <w:szCs w:val="18"/>
                           </w:rPr>
                           <w:t>59</w:t>
                         </w:r>
@@ -2132,7 +2103,7 @@
                     </w:tc>
                     <w:tc>
                       <w:tcPr>
-                        <w:tcW w:w="440" w:type="dxa"/>
+                        <w:tcW w:w="345" w:type="dxa"/>
                         <w:tcBorders>
                           <w:top w:val="single" w:sz="4" w:space="0" w:color="auto"/>
                           <w:left w:val="single" w:sz="4" w:space="0" w:color="auto"/>
@@ -2155,8 +2126,8 @@
                         <w:r>
                           <w:rPr>
                             <w:rFonts w:ascii="Calibri" w:hAnsi="Calibri" w:cs="Calibri"/>
-                            <w:sz w:val="16"/>
-                            <w:szCs w:val="16"/>
+                            <w:sz w:val="18"/>
+                            <w:szCs w:val="18"/>
                           </w:rPr>
                           <w:t>60</w:t>
                         </w:r>
@@ -2165,11 +2136,11 @@
                   </w:tr>
                   <w:tr>
                     <w:trPr>
-                      <w:trHeight w:hRule="exact" w:val="440"/>
+                      <w:trHeight w:hRule="exact" w:val="345"/>
                     </w:trPr>
                     <w:tc>
                       <w:tcPr>
-                        <w:tcW w:w="440" w:type="dxa"/>
+                        <w:tcW w:w="345" w:type="dxa"/>
                         <w:tcBorders>
                           <w:top w:val="single" w:sz="4" w:space="0" w:color="auto"/>
                           <w:left w:val="single" w:sz="4" w:space="0" w:color="auto"/>
@@ -2192,8 +2163,8 @@
                         <w:r>
                           <w:rPr>
                             <w:rFonts w:ascii="Calibri" w:hAnsi="Calibri" w:cs="Calibri"/>
-                            <w:sz w:val="16"/>
-                            <w:szCs w:val="16"/>
+                            <w:sz w:val="18"/>
+                            <w:szCs w:val="18"/>
                           </w:rPr>
                           <w:t>61</w:t>
                         </w:r>
@@ -2201,7 +2172,7 @@
                     </w:tc>
                     <w:tc>
                       <w:tcPr>
-                        <w:tcW w:w="440" w:type="dxa"/>
+                        <w:tcW w:w="345" w:type="dxa"/>
                         <w:tcBorders>
                           <w:top w:val="single" w:sz="4" w:space="0" w:color="auto"/>
                           <w:left w:val="single" w:sz="4" w:space="0" w:color="auto"/>
@@ -2224,8 +2195,8 @@
                         <w:r>
                           <w:rPr>
                             <w:rFonts w:ascii="Calibri" w:hAnsi="Calibri" w:cs="Calibri"/>
-                            <w:sz w:val="16"/>
-                            <w:szCs w:val="16"/>
+                            <w:sz w:val="18"/>
+                            <w:szCs w:val="18"/>
                           </w:rPr>
                           <w:t>62</w:t>
                         </w:r>
@@ -2233,7 +2204,7 @@
                     </w:tc>
                     <w:tc>
                       <w:tcPr>
-                        <w:tcW w:w="440" w:type="dxa"/>
+                        <w:tcW w:w="345" w:type="dxa"/>
                         <w:tcBorders>
                           <w:top w:val="single" w:sz="4" w:space="0" w:color="auto"/>
                           <w:left w:val="single" w:sz="4" w:space="0" w:color="auto"/>
@@ -2256,8 +2227,8 @@
                         <w:r>
                           <w:rPr>
                             <w:rFonts w:ascii="Calibri" w:hAnsi="Calibri" w:cs="Calibri"/>
-                            <w:sz w:val="16"/>
-                            <w:szCs w:val="16"/>
+                            <w:sz w:val="18"/>
+                            <w:szCs w:val="18"/>
                           </w:rPr>
                           <w:t>63</w:t>
                         </w:r>
@@ -2265,7 +2236,7 @@
                     </w:tc>
                     <w:tc>
                       <w:tcPr>
-                        <w:tcW w:w="440" w:type="dxa"/>
+                        <w:tcW w:w="345" w:type="dxa"/>
                         <w:tcBorders>
                           <w:top w:val="single" w:sz="4" w:space="0" w:color="auto"/>
                           <w:left w:val="single" w:sz="4" w:space="0" w:color="auto"/>
@@ -2288,8 +2259,8 @@
                         <w:r>
                           <w:rPr>
                             <w:rFonts w:ascii="Calibri" w:hAnsi="Calibri" w:cs="Calibri"/>
-                            <w:sz w:val="16"/>
-                            <w:szCs w:val="16"/>
+                            <w:sz w:val="18"/>
+                            <w:szCs w:val="18"/>
                           </w:rPr>
                           <w:t>64</w:t>
                         </w:r>
@@ -2297,7 +2268,7 @@
                     </w:tc>
                     <w:tc>
                       <w:tcPr>
-                        <w:tcW w:w="440" w:type="dxa"/>
+                        <w:tcW w:w="345" w:type="dxa"/>
                         <w:tcBorders>
                           <w:top w:val="single" w:sz="4" w:space="0" w:color="auto"/>
                           <w:left w:val="single" w:sz="4" w:space="0" w:color="auto"/>
@@ -2320,8 +2291,8 @@
                         <w:r>
                           <w:rPr>
                             <w:rFonts w:ascii="Calibri" w:hAnsi="Calibri" w:cs="Calibri"/>
-                            <w:sz w:val="16"/>
-                            <w:szCs w:val="16"/>
+                            <w:sz w:val="18"/>
+                            <w:szCs w:val="18"/>
                           </w:rPr>
                           <w:t>65</w:t>
                         </w:r>
@@ -2329,7 +2300,7 @@
                     </w:tc>
                     <w:tc>
                       <w:tcPr>
-                        <w:tcW w:w="440" w:type="dxa"/>
+                        <w:tcW w:w="345" w:type="dxa"/>
                         <w:tcBorders>
                           <w:top w:val="single" w:sz="4" w:space="0" w:color="auto"/>
                           <w:left w:val="single" w:sz="4" w:space="0" w:color="auto"/>
@@ -2352,8 +2323,8 @@
                         <w:r>
                           <w:rPr>
                             <w:rFonts w:ascii="Calibri" w:hAnsi="Calibri" w:cs="Calibri"/>
-                            <w:sz w:val="16"/>
-                            <w:szCs w:val="16"/>
+                            <w:sz w:val="18"/>
+                            <w:szCs w:val="18"/>
                           </w:rPr>
                           <w:t>66</w:t>
                         </w:r>
@@ -2361,7 +2332,7 @@
                     </w:tc>
                     <w:tc>
                       <w:tcPr>
-                        <w:tcW w:w="440" w:type="dxa"/>
+                        <w:tcW w:w="345" w:type="dxa"/>
                         <w:tcBorders>
                           <w:top w:val="single" w:sz="4" w:space="0" w:color="auto"/>
                           <w:left w:val="single" w:sz="4" w:space="0" w:color="auto"/>
@@ -2384,8 +2355,8 @@
                         <w:r>
                           <w:rPr>
                             <w:rFonts w:ascii="Calibri" w:hAnsi="Calibri" w:cs="Calibri"/>
-                            <w:sz w:val="16"/>
-                            <w:szCs w:val="16"/>
+                            <w:sz w:val="18"/>
+                            <w:szCs w:val="18"/>
                           </w:rPr>
                           <w:t>67</w:t>
                         </w:r>
@@ -2393,7 +2364,7 @@
                     </w:tc>
                     <w:tc>
                       <w:tcPr>
-                        <w:tcW w:w="440" w:type="dxa"/>
+                        <w:tcW w:w="345" w:type="dxa"/>
                         <w:tcBorders>
                           <w:top w:val="single" w:sz="4" w:space="0" w:color="auto"/>
                           <w:left w:val="single" w:sz="4" w:space="0" w:color="auto"/>
@@ -2416,8 +2387,8 @@
                         <w:r>
                           <w:rPr>
                             <w:rFonts w:ascii="Calibri" w:hAnsi="Calibri" w:cs="Calibri"/>
-                            <w:sz w:val="16"/>
-                            <w:szCs w:val="16"/>
+                            <w:sz w:val="18"/>
+                            <w:szCs w:val="18"/>
                           </w:rPr>
                           <w:t>68</w:t>
                         </w:r>
@@ -2425,7 +2396,7 @@
                     </w:tc>
                     <w:tc>
                       <w:tcPr>
-                        <w:tcW w:w="440" w:type="dxa"/>
+                        <w:tcW w:w="345" w:type="dxa"/>
                         <w:tcBorders>
                           <w:top w:val="single" w:sz="4" w:space="0" w:color="auto"/>
                           <w:left w:val="single" w:sz="4" w:space="0" w:color="auto"/>
@@ -2448,8 +2419,8 @@
                         <w:r>
                           <w:rPr>
                             <w:rFonts w:ascii="Calibri" w:hAnsi="Calibri" w:cs="Calibri"/>
-                            <w:sz w:val="16"/>
-                            <w:szCs w:val="16"/>
+                            <w:sz w:val="18"/>
+                            <w:szCs w:val="18"/>
                           </w:rPr>
                           <w:t>69</w:t>
                         </w:r>
@@ -2457,7 +2428,7 @@
                     </w:tc>
                     <w:tc>
                       <w:tcPr>
-                        <w:tcW w:w="440" w:type="dxa"/>
+                        <w:tcW w:w="345" w:type="dxa"/>
                         <w:tcBorders>
                           <w:top w:val="single" w:sz="4" w:space="0" w:color="auto"/>
                           <w:left w:val="single" w:sz="4" w:space="0" w:color="auto"/>
@@ -2480,8 +2451,8 @@
                         <w:r>
                           <w:rPr>
                             <w:rFonts w:ascii="Calibri" w:hAnsi="Calibri" w:cs="Calibri"/>
-                            <w:sz w:val="16"/>
-                            <w:szCs w:val="16"/>
+                            <w:sz w:val="18"/>
+                            <w:szCs w:val="18"/>
                           </w:rPr>
                           <w:t>70</w:t>
                         </w:r>
@@ -2490,11 +2461,11 @@
                   </w:tr>
                   <w:tr>
                     <w:trPr>
-                      <w:trHeight w:hRule="exact" w:val="440"/>
+                      <w:trHeight w:hRule="exact" w:val="345"/>
                     </w:trPr>
                     <w:tc>
                       <w:tcPr>
-                        <w:tcW w:w="440" w:type="dxa"/>
+                        <w:tcW w:w="345" w:type="dxa"/>
                         <w:tcBorders>
                           <w:top w:val="single" w:sz="4" w:space="0" w:color="auto"/>
                           <w:left w:val="single" w:sz="4" w:space="0" w:color="auto"/>
@@ -2517,8 +2488,8 @@
                         <w:r>
                           <w:rPr>
                             <w:rFonts w:ascii="Calibri" w:hAnsi="Calibri" w:cs="Calibri"/>
-                            <w:sz w:val="16"/>
-                            <w:szCs w:val="16"/>
+                            <w:sz w:val="18"/>
+                            <w:szCs w:val="18"/>
                           </w:rPr>
                           <w:t>71</w:t>
                         </w:r>
@@ -2526,7 +2497,7 @@
                     </w:tc>
                     <w:tc>
                       <w:tcPr>
-                        <w:tcW w:w="440" w:type="dxa"/>
+                        <w:tcW w:w="345" w:type="dxa"/>
                         <w:tcBorders>
                           <w:top w:val="single" w:sz="4" w:space="0" w:color="auto"/>
                           <w:left w:val="single" w:sz="4" w:space="0" w:color="auto"/>
@@ -2549,8 +2520,8 @@
                         <w:r>
                           <w:rPr>
                             <w:rFonts w:ascii="Calibri" w:hAnsi="Calibri" w:cs="Calibri"/>
-                            <w:sz w:val="16"/>
-                            <w:szCs w:val="16"/>
+                            <w:sz w:val="18"/>
+                            <w:szCs w:val="18"/>
                           </w:rPr>
                           <w:t>72</w:t>
                         </w:r>
@@ -2558,7 +2529,7 @@
                     </w:tc>
                     <w:tc>
                       <w:tcPr>
-                        <w:tcW w:w="440" w:type="dxa"/>
+                        <w:tcW w:w="345" w:type="dxa"/>
                         <w:tcBorders>
                           <w:top w:val="single" w:sz="4" w:space="0" w:color="auto"/>
                           <w:left w:val="single" w:sz="4" w:space="0" w:color="auto"/>
@@ -2581,8 +2552,8 @@
                         <w:r>
                           <w:rPr>
                             <w:rFonts w:ascii="Calibri" w:hAnsi="Calibri" w:cs="Calibri"/>
-                            <w:sz w:val="16"/>
-                            <w:szCs w:val="16"/>
+                            <w:sz w:val="18"/>
+                            <w:szCs w:val="18"/>
                           </w:rPr>
                           <w:t>73</w:t>
                         </w:r>
@@ -2590,7 +2561,7 @@
                     </w:tc>
                     <w:tc>
                       <w:tcPr>
-                        <w:tcW w:w="440" w:type="dxa"/>
+                        <w:tcW w:w="345" w:type="dxa"/>
                         <w:tcBorders>
                           <w:top w:val="single" w:sz="4" w:space="0" w:color="auto"/>
                           <w:left w:val="single" w:sz="4" w:space="0" w:color="auto"/>
@@ -2613,8 +2584,8 @@
                         <w:r>
                           <w:rPr>
                             <w:rFonts w:ascii="Calibri" w:hAnsi="Calibri" w:cs="Calibri"/>
-                            <w:sz w:val="16"/>
-                            <w:szCs w:val="16"/>
+                            <w:sz w:val="18"/>
+                            <w:szCs w:val="18"/>
                           </w:rPr>
                           <w:t>74</w:t>
                         </w:r>
@@ -2622,7 +2593,7 @@
                     </w:tc>
                     <w:tc>
                       <w:tcPr>
-                        <w:tcW w:w="440" w:type="dxa"/>
+                        <w:tcW w:w="345" w:type="dxa"/>
                         <w:tcBorders>
                           <w:top w:val="single" w:sz="4" w:space="0" w:color="auto"/>
                           <w:left w:val="single" w:sz="4" w:space="0" w:color="auto"/>
@@ -2645,8 +2616,8 @@
                         <w:r>
                           <w:rPr>
                             <w:rFonts w:ascii="Calibri" w:hAnsi="Calibri" w:cs="Calibri"/>
-                            <w:sz w:val="16"/>
-                            <w:szCs w:val="16"/>
+                            <w:sz w:val="18"/>
+                            <w:szCs w:val="18"/>
                           </w:rPr>
                           <w:t>75</w:t>
                         </w:r>
@@ -2654,7 +2625,7 @@
                     </w:tc>
                     <w:tc>
                       <w:tcPr>
-                        <w:tcW w:w="440" w:type="dxa"/>
+                        <w:tcW w:w="345" w:type="dxa"/>
                         <w:tcBorders>
                           <w:top w:val="single" w:sz="4" w:space="0" w:color="auto"/>
                           <w:left w:val="single" w:sz="4" w:space="0" w:color="auto"/>
@@ -2677,8 +2648,8 @@
                         <w:r>
                           <w:rPr>
                             <w:rFonts w:ascii="Calibri" w:hAnsi="Calibri" w:cs="Calibri"/>
-                            <w:sz w:val="16"/>
-                            <w:szCs w:val="16"/>
+                            <w:sz w:val="18"/>
+                            <w:szCs w:val="18"/>
                           </w:rPr>
                           <w:t>76</w:t>
                         </w:r>
@@ -2686,7 +2657,7 @@
                     </w:tc>
                     <w:tc>
                       <w:tcPr>
-                        <w:tcW w:w="440" w:type="dxa"/>
+                        <w:tcW w:w="345" w:type="dxa"/>
                         <w:tcBorders>
                           <w:top w:val="single" w:sz="4" w:space="0" w:color="auto"/>
                           <w:left w:val="single" w:sz="4" w:space="0" w:color="auto"/>
@@ -2709,8 +2680,8 @@
                         <w:r>
                           <w:rPr>
                             <w:rFonts w:ascii="Calibri" w:hAnsi="Calibri" w:cs="Calibri"/>
-                            <w:sz w:val="16"/>
-                            <w:szCs w:val="16"/>
+                            <w:sz w:val="18"/>
+                            <w:szCs w:val="18"/>
                           </w:rPr>
                           <w:t>77</w:t>
                         </w:r>
@@ -2718,7 +2689,7 @@
                     </w:tc>
                     <w:tc>
                       <w:tcPr>
-                        <w:tcW w:w="440" w:type="dxa"/>
+                        <w:tcW w:w="345" w:type="dxa"/>
                         <w:tcBorders>
                           <w:top w:val="single" w:sz="4" w:space="0" w:color="auto"/>
                           <w:left w:val="single" w:sz="4" w:space="0" w:color="auto"/>
@@ -2742,8 +2713,8 @@
                         <w:r>
                           <w:rPr>
                             <w:rFonts w:ascii="Calibri" w:hAnsi="Calibri" w:cs="Calibri"/>
-                            <w:sz w:val="16"/>
-                            <w:szCs w:val="16"/>
+                            <w:sz w:val="18"/>
+                            <w:szCs w:val="18"/>
                           </w:rPr>
                           <w:t>78</w:t>
                         </w:r>
@@ -2751,7 +2722,7 @@
                     </w:tc>
                     <w:tc>
                       <w:tcPr>
-                        <w:tcW w:w="440" w:type="dxa"/>
+                        <w:tcW w:w="345" w:type="dxa"/>
                         <w:tcBorders>
                           <w:top w:val="single" w:sz="4" w:space="0" w:color="auto"/>
                           <w:left w:val="single" w:sz="4" w:space="0" w:color="auto"/>
@@ -2775,8 +2746,8 @@
                         <w:r>
                           <w:rPr>
                             <w:rFonts w:ascii="Calibri" w:hAnsi="Calibri" w:cs="Calibri"/>
-                            <w:sz w:val="16"/>
-                            <w:szCs w:val="16"/>
+                            <w:sz w:val="18"/>
+                            <w:szCs w:val="18"/>
                           </w:rPr>
                           <w:t>79</w:t>
                         </w:r>
@@ -2784,7 +2755,7 @@
                     </w:tc>
                     <w:tc>
                       <w:tcPr>
-                        <w:tcW w:w="440" w:type="dxa"/>
+                        <w:tcW w:w="345" w:type="dxa"/>
                         <w:tcBorders>
                           <w:top w:val="single" w:sz="4" w:space="0" w:color="auto"/>
                           <w:left w:val="single" w:sz="4" w:space="0" w:color="auto"/>
@@ -2807,8 +2778,8 @@
                         <w:r>
                           <w:rPr>
                             <w:rFonts w:ascii="Calibri" w:hAnsi="Calibri" w:cs="Calibri"/>
-                            <w:sz w:val="16"/>
-                            <w:szCs w:val="16"/>
+                            <w:sz w:val="18"/>
+                            <w:szCs w:val="18"/>
                           </w:rPr>
                           <w:t>80</w:t>
                         </w:r>
@@ -2817,11 +2788,11 @@
                   </w:tr>
                   <w:tr>
                     <w:trPr>
-                      <w:trHeight w:hRule="exact" w:val="440"/>
+                      <w:trHeight w:hRule="exact" w:val="345"/>
                     </w:trPr>
                     <w:tc>
                       <w:tcPr>
-                        <w:tcW w:w="440" w:type="dxa"/>
+                        <w:tcW w:w="345" w:type="dxa"/>
                         <w:tcBorders>
                           <w:top w:val="single" w:sz="4" w:space="0" w:color="auto"/>
                           <w:left w:val="single" w:sz="4" w:space="0" w:color="auto"/>
@@ -2844,8 +2815,8 @@
                         <w:r>
                           <w:rPr>
                             <w:rFonts w:ascii="Calibri" w:hAnsi="Calibri" w:cs="Calibri"/>
-                            <w:sz w:val="16"/>
-                            <w:szCs w:val="16"/>
+                            <w:sz w:val="18"/>
+                            <w:szCs w:val="18"/>
                           </w:rPr>
                           <w:t>81</w:t>
                         </w:r>
@@ -2853,7 +2824,7 @@
                     </w:tc>
                     <w:tc>
                       <w:tcPr>
-                        <w:tcW w:w="440" w:type="dxa"/>
+                        <w:tcW w:w="345" w:type="dxa"/>
                         <w:tcBorders>
                           <w:top w:val="single" w:sz="4" w:space="0" w:color="auto"/>
                           <w:left w:val="single" w:sz="4" w:space="0" w:color="auto"/>
@@ -2876,8 +2847,8 @@
                         <w:r>
                           <w:rPr>
                             <w:rFonts w:ascii="Calibri" w:hAnsi="Calibri" w:cs="Calibri"/>
-                            <w:sz w:val="16"/>
-                            <w:szCs w:val="16"/>
+                            <w:sz w:val="18"/>
+                            <w:szCs w:val="18"/>
                           </w:rPr>
                           <w:t>82</w:t>
                         </w:r>
@@ -2885,7 +2856,7 @@
                     </w:tc>
                     <w:tc>
                       <w:tcPr>
-                        <w:tcW w:w="440" w:type="dxa"/>
+                        <w:tcW w:w="345" w:type="dxa"/>
                         <w:tcBorders>
                           <w:top w:val="single" w:sz="4" w:space="0" w:color="auto"/>
                           <w:left w:val="single" w:sz="4" w:space="0" w:color="auto"/>
@@ -2908,8 +2879,8 @@
                         <w:r>
                           <w:rPr>
                             <w:rFonts w:ascii="Calibri" w:hAnsi="Calibri" w:cs="Calibri"/>
-                            <w:sz w:val="16"/>
-                            <w:szCs w:val="16"/>
+                            <w:sz w:val="18"/>
+                            <w:szCs w:val="18"/>
                           </w:rPr>
                           <w:t>83</w:t>
                         </w:r>
@@ -2917,7 +2888,7 @@
                     </w:tc>
                     <w:tc>
                       <w:tcPr>
-                        <w:tcW w:w="440" w:type="dxa"/>
+                        <w:tcW w:w="345" w:type="dxa"/>
                         <w:tcBorders>
                           <w:top w:val="single" w:sz="4" w:space="0" w:color="auto"/>
                           <w:left w:val="single" w:sz="4" w:space="0" w:color="auto"/>
@@ -2940,8 +2911,8 @@
                         <w:r>
                           <w:rPr>
                             <w:rFonts w:ascii="Calibri" w:hAnsi="Calibri" w:cs="Calibri"/>
-                            <w:sz w:val="16"/>
-                            <w:szCs w:val="16"/>
+                            <w:sz w:val="18"/>
+                            <w:szCs w:val="18"/>
                           </w:rPr>
                           <w:t>84</w:t>
                         </w:r>
@@ -2949,7 +2920,7 @@
                     </w:tc>
                     <w:tc>
                       <w:tcPr>
-                        <w:tcW w:w="440" w:type="dxa"/>
+                        <w:tcW w:w="345" w:type="dxa"/>
                         <w:tcBorders>
                           <w:top w:val="single" w:sz="4" w:space="0" w:color="auto"/>
                           <w:left w:val="single" w:sz="4" w:space="0" w:color="auto"/>
@@ -2972,8 +2943,8 @@
                         <w:r>
                           <w:rPr>
                             <w:rFonts w:ascii="Calibri" w:hAnsi="Calibri" w:cs="Calibri"/>
-                            <w:sz w:val="16"/>
-                            <w:szCs w:val="16"/>
+                            <w:sz w:val="18"/>
+                            <w:szCs w:val="18"/>
                           </w:rPr>
                           <w:t>85</w:t>
                         </w:r>
@@ -2981,7 +2952,7 @@
                     </w:tc>
                     <w:tc>
                       <w:tcPr>
-                        <w:tcW w:w="440" w:type="dxa"/>
+                        <w:tcW w:w="345" w:type="dxa"/>
                         <w:tcBorders>
                           <w:top w:val="single" w:sz="4" w:space="0" w:color="auto"/>
                           <w:left w:val="single" w:sz="4" w:space="0" w:color="auto"/>
@@ -3004,8 +2975,8 @@
                         <w:r>
                           <w:rPr>
                             <w:rFonts w:ascii="Calibri" w:hAnsi="Calibri" w:cs="Calibri"/>
-                            <w:sz w:val="16"/>
-                            <w:szCs w:val="16"/>
+                            <w:sz w:val="18"/>
+                            <w:szCs w:val="18"/>
                           </w:rPr>
                           <w:t>86</w:t>
                         </w:r>
@@ -3013,7 +2984,7 @@
                     </w:tc>
                     <w:tc>
                       <w:tcPr>
-                        <w:tcW w:w="440" w:type="dxa"/>
+                        <w:tcW w:w="345" w:type="dxa"/>
                         <w:tcBorders>
                           <w:top w:val="single" w:sz="4" w:space="0" w:color="auto"/>
                           <w:left w:val="single" w:sz="4" w:space="0" w:color="auto"/>
@@ -3036,8 +3007,8 @@
                         <w:r>
                           <w:rPr>
                             <w:rFonts w:ascii="Calibri" w:hAnsi="Calibri" w:cs="Calibri"/>
-                            <w:sz w:val="16"/>
-                            <w:szCs w:val="16"/>
+                            <w:sz w:val="18"/>
+                            <w:szCs w:val="18"/>
                           </w:rPr>
                           <w:t>87</w:t>
                         </w:r>
@@ -3045,7 +3016,7 @@
                     </w:tc>
                     <w:tc>
                       <w:tcPr>
-                        <w:tcW w:w="440" w:type="dxa"/>
+                        <w:tcW w:w="345" w:type="dxa"/>
                         <w:tcBorders>
                           <w:top w:val="single" w:sz="4" w:space="0" w:color="auto"/>
                           <w:left w:val="single" w:sz="4" w:space="0" w:color="auto"/>
@@ -3069,8 +3040,8 @@
                         <w:r>
                           <w:rPr>
                             <w:rFonts w:ascii="Calibri" w:hAnsi="Calibri" w:cs="Calibri"/>
-                            <w:sz w:val="16"/>
-                            <w:szCs w:val="16"/>
+                            <w:sz w:val="18"/>
+                            <w:szCs w:val="18"/>
                           </w:rPr>
                           <w:t>88</w:t>
                         </w:r>
@@ -3078,7 +3049,7 @@
                     </w:tc>
                     <w:tc>
                       <w:tcPr>
-                        <w:tcW w:w="440" w:type="dxa"/>
+                        <w:tcW w:w="345" w:type="dxa"/>
                         <w:tcBorders>
                           <w:top w:val="single" w:sz="4" w:space="0" w:color="auto"/>
                           <w:left w:val="single" w:sz="4" w:space="0" w:color="auto"/>
@@ -3102,8 +3073,8 @@
                         <w:r>
                           <w:rPr>
                             <w:rFonts w:ascii="Calibri" w:hAnsi="Calibri" w:cs="Calibri"/>
-                            <w:sz w:val="16"/>
-                            <w:szCs w:val="16"/>
+                            <w:sz w:val="18"/>
+                            <w:szCs w:val="18"/>
                           </w:rPr>
                           <w:t>89</w:t>
                         </w:r>
@@ -3111,7 +3082,7 @@
                     </w:tc>
                     <w:tc>
                       <w:tcPr>
-                        <w:tcW w:w="440" w:type="dxa"/>
+                        <w:tcW w:w="345" w:type="dxa"/>
                         <w:tcBorders>
                           <w:top w:val="single" w:sz="4" w:space="0" w:color="auto"/>
                           <w:left w:val="single" w:sz="4" w:space="0" w:color="auto"/>
@@ -3134,8 +3105,8 @@
                         <w:r>
                           <w:rPr>
                             <w:rFonts w:ascii="Calibri" w:hAnsi="Calibri" w:cs="Calibri"/>
-                            <w:sz w:val="16"/>
-                            <w:szCs w:val="16"/>
+                            <w:sz w:val="18"/>
+                            <w:szCs w:val="18"/>
                           </w:rPr>
                           <w:t>90</w:t>
                         </w:r>
@@ -3144,11 +3115,11 @@
                   </w:tr>
                   <w:tr>
                     <w:trPr>
-                      <w:trHeight w:hRule="exact" w:val="440"/>
+                      <w:trHeight w:hRule="exact" w:val="345"/>
                     </w:trPr>
                     <w:tc>
                       <w:tcPr>
-                        <w:tcW w:w="440" w:type="dxa"/>
+                        <w:tcW w:w="345" w:type="dxa"/>
                         <w:tcBorders>
                           <w:top w:val="single" w:sz="4" w:space="0" w:color="auto"/>
                           <w:left w:val="single" w:sz="4" w:space="0" w:color="auto"/>
@@ -3171,8 +3142,8 @@
                         <w:r>
                           <w:rPr>
                             <w:rFonts w:ascii="Calibri" w:hAnsi="Calibri" w:cs="Calibri"/>
-                            <w:sz w:val="16"/>
-                            <w:szCs w:val="16"/>
+                            <w:sz w:val="18"/>
+                            <w:szCs w:val="18"/>
                           </w:rPr>
                           <w:t>91</w:t>
                         </w:r>
@@ -3180,7 +3151,7 @@
                     </w:tc>
                     <w:tc>
                       <w:tcPr>
-                        <w:tcW w:w="440" w:type="dxa"/>
+                        <w:tcW w:w="345" w:type="dxa"/>
                         <w:tcBorders>
                           <w:top w:val="single" w:sz="4" w:space="0" w:color="auto"/>
                           <w:left w:val="single" w:sz="4" w:space="0" w:color="auto"/>
@@ -3203,8 +3174,8 @@
                         <w:r>
                           <w:rPr>
                             <w:rFonts w:ascii="Calibri" w:hAnsi="Calibri" w:cs="Calibri"/>
-                            <w:sz w:val="16"/>
-                            <w:szCs w:val="16"/>
+                            <w:sz w:val="18"/>
+                            <w:szCs w:val="18"/>
                           </w:rPr>
                           <w:t>92</w:t>
                         </w:r>
@@ -3212,7 +3183,7 @@
                     </w:tc>
                     <w:tc>
                       <w:tcPr>
-                        <w:tcW w:w="440" w:type="dxa"/>
+                        <w:tcW w:w="345" w:type="dxa"/>
                         <w:tcBorders>
                           <w:top w:val="single" w:sz="4" w:space="0" w:color="auto"/>
                           <w:left w:val="single" w:sz="4" w:space="0" w:color="auto"/>
@@ -3235,8 +3206,8 @@
                         <w:r>
                           <w:rPr>
                             <w:rFonts w:ascii="Calibri" w:hAnsi="Calibri" w:cs="Calibri"/>
-                            <w:sz w:val="16"/>
-                            <w:szCs w:val="16"/>
+                            <w:sz w:val="18"/>
+                            <w:szCs w:val="18"/>
                           </w:rPr>
                           <w:t>93</w:t>
                         </w:r>
@@ -3244,7 +3215,7 @@
                     </w:tc>
                     <w:tc>
                       <w:tcPr>
-                        <w:tcW w:w="440" w:type="dxa"/>
+                        <w:tcW w:w="345" w:type="dxa"/>
                         <w:tcBorders>
                           <w:top w:val="single" w:sz="4" w:space="0" w:color="auto"/>
                           <w:left w:val="single" w:sz="4" w:space="0" w:color="auto"/>
@@ -3267,8 +3238,8 @@
                         <w:r>
                           <w:rPr>
                             <w:rFonts w:ascii="Calibri" w:hAnsi="Calibri" w:cs="Calibri"/>
-                            <w:sz w:val="16"/>
-                            <w:szCs w:val="16"/>
+                            <w:sz w:val="18"/>
+                            <w:szCs w:val="18"/>
                           </w:rPr>
                           <w:t>94</w:t>
                         </w:r>
@@ -3276,7 +3247,7 @@
                     </w:tc>
                     <w:tc>
                       <w:tcPr>
-                        <w:tcW w:w="440" w:type="dxa"/>
+                        <w:tcW w:w="345" w:type="dxa"/>
                         <w:tcBorders>
                           <w:top w:val="single" w:sz="4" w:space="0" w:color="auto"/>
                           <w:left w:val="single" w:sz="4" w:space="0" w:color="auto"/>
@@ -3299,8 +3270,8 @@
                         <w:r>
                           <w:rPr>
                             <w:rFonts w:ascii="Calibri" w:hAnsi="Calibri" w:cs="Calibri"/>
-                            <w:sz w:val="16"/>
-                            <w:szCs w:val="16"/>
+                            <w:sz w:val="18"/>
+                            <w:szCs w:val="18"/>
                           </w:rPr>
                           <w:t>95</w:t>
                         </w:r>
@@ -3308,7 +3279,7 @@
                     </w:tc>
                     <w:tc>
                       <w:tcPr>
-                        <w:tcW w:w="440" w:type="dxa"/>
+                        <w:tcW w:w="345" w:type="dxa"/>
                         <w:tcBorders>
                           <w:top w:val="single" w:sz="4" w:space="0" w:color="auto"/>
                           <w:left w:val="single" w:sz="4" w:space="0" w:color="auto"/>
@@ -3331,8 +3302,8 @@
                         <w:r>
                           <w:rPr>
                             <w:rFonts w:ascii="Calibri" w:hAnsi="Calibri" w:cs="Calibri"/>
-                            <w:sz w:val="16"/>
-                            <w:szCs w:val="16"/>
+                            <w:sz w:val="18"/>
+                            <w:szCs w:val="18"/>
                           </w:rPr>
                           <w:t>96</w:t>
                         </w:r>
@@ -3340,7 +3311,7 @@
                     </w:tc>
                     <w:tc>
                       <w:tcPr>
-                        <w:tcW w:w="440" w:type="dxa"/>
+                        <w:tcW w:w="345" w:type="dxa"/>
                         <w:tcBorders>
                           <w:top w:val="single" w:sz="4" w:space="0" w:color="auto"/>
                           <w:left w:val="single" w:sz="4" w:space="0" w:color="auto"/>
@@ -3363,8 +3334,8 @@
                         <w:r>
                           <w:rPr>
                             <w:rFonts w:ascii="Calibri" w:hAnsi="Calibri" w:cs="Calibri"/>
-                            <w:sz w:val="16"/>
-                            <w:szCs w:val="16"/>
+                            <w:sz w:val="18"/>
+                            <w:szCs w:val="18"/>
                           </w:rPr>
                           <w:t>97</w:t>
                         </w:r>
@@ -3372,7 +3343,7 @@
                     </w:tc>
                     <w:tc>
                       <w:tcPr>
-                        <w:tcW w:w="440" w:type="dxa"/>
+                        <w:tcW w:w="345" w:type="dxa"/>
                         <w:tcBorders>
                           <w:top w:val="single" w:sz="4" w:space="0" w:color="auto"/>
                           <w:left w:val="single" w:sz="4" w:space="0" w:color="auto"/>
@@ -3395,8 +3366,8 @@
                         <w:r>
                           <w:rPr>
                             <w:rFonts w:ascii="Calibri" w:hAnsi="Calibri" w:cs="Calibri"/>
-                            <w:sz w:val="16"/>
-                            <w:szCs w:val="16"/>
+                            <w:sz w:val="18"/>
+                            <w:szCs w:val="18"/>
                           </w:rPr>
                           <w:t>98</w:t>
                         </w:r>
@@ -3404,7 +3375,7 @@
                     </w:tc>
                     <w:tc>
                       <w:tcPr>
-                        <w:tcW w:w="440" w:type="dxa"/>
+                        <w:tcW w:w="345" w:type="dxa"/>
                         <w:tcBorders>
                           <w:top w:val="single" w:sz="4" w:space="0" w:color="auto"/>
                           <w:left w:val="single" w:sz="4" w:space="0" w:color="auto"/>
@@ -3427,8 +3398,8 @@
                         <w:r>
                           <w:rPr>
                             <w:rFonts w:ascii="Calibri" w:hAnsi="Calibri" w:cs="Calibri"/>
-                            <w:sz w:val="16"/>
-                            <w:szCs w:val="16"/>
+                            <w:sz w:val="18"/>
+                            <w:szCs w:val="18"/>
                           </w:rPr>
                           <w:t>99</w:t>
                         </w:r>
@@ -3436,7 +3407,7 @@
                     </w:tc>
                     <w:tc>
                       <w:tcPr>
-                        <w:tcW w:w="440" w:type="dxa"/>
+                        <w:tcW w:w="345" w:type="dxa"/>
                         <w:tcBorders>
                           <w:top w:val="single" w:sz="4" w:space="0" w:color="auto"/>
                           <w:left w:val="single" w:sz="4" w:space="0" w:color="auto"/>
@@ -3459,8 +3430,8 @@
                         <w:r>
                           <w:rPr>
                             <w:rFonts w:ascii="Calibri" w:hAnsi="Calibri" w:cs="Calibri"/>
-                            <w:sz w:val="16"/>
-                            <w:szCs w:val="16"/>
+                            <w:sz w:val="18"/>
+                            <w:szCs w:val="18"/>
                           </w:rPr>
                           <w:t>100</w:t>
                         </w:r>
@@ -3470,13 +3441,17 @@
                 </w:tbl>
                 <w:p>
                   <w:pPr>
-                    <w:spacing w:before="0" w:after="0" w:line="240" w:lineRule="auto"/>
+                    <w:spacing w:before="0" w:after="0" w:line="20" w:lineRule="exact"/>
+                    <w:rPr>
+                      <w:sz w:val="2"/>
+                      <w:szCs w:val="2"/>
+                    </w:rPr>
                   </w:pPr>
                 </w:p>
               </w:tc>
               <w:tc>
                 <w:tcPr>
-                  <w:tcW w:w="400" w:type="dxa"/>
+                  <w:tcW w:w="300" w:type="dxa"/>
                   <w:tcBorders>
                     <w:top w:val="nil"/>
                     <w:left w:val="nil"/>
@@ -3492,13 +3467,17 @@
                 </w:tcPr>
                 <w:p>
                   <w:pPr>
-                    <w:spacing w:before="0" w:after="0" w:line="240" w:lineRule="auto"/>
+                    <w:spacing w:before="0" w:after="0" w:line="20" w:lineRule="exact"/>
+                    <w:rPr>
+                      <w:sz w:val="2"/>
+                      <w:szCs w:val="2"/>
+                    </w:rPr>
                   </w:pPr>
                 </w:p>
               </w:tc>
               <w:tc>
                 <w:tcPr>
-                  <w:tcW w:w="4400" w:type="dxa"/>
+                  <w:tcW w:w="3450" w:type="dxa"/>
                   <w:tcBorders>
                     <w:top w:val="nil"/>
                     <w:left w:val="nil"/>
@@ -3515,7 +3494,7 @@
                 <w:p>
                   <w:pPr>
                     <w:jc w:val="center"/>
-                    <w:spacing w:before="0" w:after="60" w:line="240" w:lineRule="auto"/>
+                    <w:spacing w:before="80" w:after="40" w:line="240" w:lineRule="auto"/>
                   </w:pPr>
                   <w:r>
                     <w:rPr>
@@ -3529,7 +3508,7 @@
                 </w:p>
                 <w:tbl>
                   <w:tblPr>
-                    <w:tblW w:w="4400" w:type="dxa"/>
+                    <w:tblW w:w="3450" w:type="dxa"/>
                     <w:tblLayout w:type="fixed"/>
                     <w:tblBorders>
                       <w:top w:val="single" w:sz="4" w:space="0" w:color="auto"/>
@@ -3547,24 +3526,24 @@
                     </w:tblCellMar>
                   </w:tblPr>
                   <w:tblGrid>
-                    <w:gridCol w:w="440"/>
-                    <w:gridCol w:w="440"/>
-                    <w:gridCol w:w="440"/>
-                    <w:gridCol w:w="440"/>
-                    <w:gridCol w:w="440"/>
-                    <w:gridCol w:w="440"/>
-                    <w:gridCol w:w="440"/>
-                    <w:gridCol w:w="440"/>
-                    <w:gridCol w:w="440"/>
-                    <w:gridCol w:w="440"/>
+                    <w:gridCol w:w="345"/>
+                    <w:gridCol w:w="345"/>
+                    <w:gridCol w:w="345"/>
+                    <w:gridCol w:w="345"/>
+                    <w:gridCol w:w="345"/>
+                    <w:gridCol w:w="345"/>
+                    <w:gridCol w:w="345"/>
+                    <w:gridCol w:w="345"/>
+                    <w:gridCol w:w="345"/>
+                    <w:gridCol w:w="345"/>
                   </w:tblGrid>
                   <w:tr>
                     <w:trPr>
-                      <w:trHeight w:hRule="exact" w:val="440"/>
+                      <w:trHeight w:hRule="exact" w:val="345"/>
                     </w:trPr>
                     <w:tc>
                       <w:tcPr>
-                        <w:tcW w:w="440" w:type="dxa"/>
+                        <w:tcW w:w="345" w:type="dxa"/>
                         <w:tcBorders>
                           <w:top w:val="single" w:sz="4" w:space="0" w:color="auto"/>
                           <w:left w:val="single" w:sz="4" w:space="0" w:color="auto"/>
@@ -3587,8 +3566,8 @@
                         <w:r>
                           <w:rPr>
                             <w:rFonts w:ascii="Calibri" w:hAnsi="Calibri" w:cs="Calibri"/>
-                            <w:sz w:val="16"/>
-                            <w:szCs w:val="16"/>
+                            <w:sz w:val="18"/>
+                            <w:szCs w:val="18"/>
                           </w:rPr>
                           <w:t>1</w:t>
                         </w:r>
@@ -3596,7 +3575,7 @@
                     </w:tc>
                     <w:tc>
                       <w:tcPr>
-                        <w:tcW w:w="440" w:type="dxa"/>
+                        <w:tcW w:w="345" w:type="dxa"/>
                         <w:tcBorders>
                           <w:top w:val="single" w:sz="4" w:space="0" w:color="auto"/>
                           <w:left w:val="single" w:sz="4" w:space="0" w:color="auto"/>
@@ -3619,8 +3598,8 @@
                         <w:r>
                           <w:rPr>
                             <w:rFonts w:ascii="Calibri" w:hAnsi="Calibri" w:cs="Calibri"/>
-                            <w:sz w:val="16"/>
-                            <w:szCs w:val="16"/>
+                            <w:sz w:val="18"/>
+                            <w:szCs w:val="18"/>
                           </w:rPr>
                           <w:t>2</w:t>
                         </w:r>
@@ -3628,7 +3607,7 @@
                     </w:tc>
                     <w:tc>
                       <w:tcPr>
-                        <w:tcW w:w="440" w:type="dxa"/>
+                        <w:tcW w:w="345" w:type="dxa"/>
                         <w:tcBorders>
                           <w:top w:val="single" w:sz="4" w:space="0" w:color="auto"/>
                           <w:left w:val="single" w:sz="4" w:space="0" w:color="auto"/>
@@ -3651,8 +3630,8 @@
                         <w:r>
                           <w:rPr>
                             <w:rFonts w:ascii="Calibri" w:hAnsi="Calibri" w:cs="Calibri"/>
-                            <w:sz w:val="16"/>
-                            <w:szCs w:val="16"/>
+                            <w:sz w:val="18"/>
+                            <w:szCs w:val="18"/>
                           </w:rPr>
                           <w:t>3</w:t>
                         </w:r>
@@ -3660,7 +3639,7 @@
                     </w:tc>
                     <w:tc>
                       <w:tcPr>
-                        <w:tcW w:w="440" w:type="dxa"/>
+                        <w:tcW w:w="345" w:type="dxa"/>
                         <w:tcBorders>
                           <w:top w:val="single" w:sz="4" w:space="0" w:color="auto"/>
                           <w:left w:val="single" w:sz="4" w:space="0" w:color="auto"/>
@@ -3683,8 +3662,8 @@
                         <w:r>
                           <w:rPr>
                             <w:rFonts w:ascii="Calibri" w:hAnsi="Calibri" w:cs="Calibri"/>
-                            <w:sz w:val="16"/>
-                            <w:szCs w:val="16"/>
+                            <w:sz w:val="18"/>
+                            <w:szCs w:val="18"/>
                           </w:rPr>
                           <w:t>4</w:t>
                         </w:r>
@@ -3692,7 +3671,7 @@
                     </w:tc>
                     <w:tc>
                       <w:tcPr>
-                        <w:tcW w:w="440" w:type="dxa"/>
+                        <w:tcW w:w="345" w:type="dxa"/>
                         <w:tcBorders>
                           <w:top w:val="single" w:sz="4" w:space="0" w:color="auto"/>
                           <w:left w:val="single" w:sz="4" w:space="0" w:color="auto"/>
@@ -3715,8 +3694,8 @@
                         <w:r>
                           <w:rPr>
                             <w:rFonts w:ascii="Calibri" w:hAnsi="Calibri" w:cs="Calibri"/>
-                            <w:sz w:val="16"/>
-                            <w:szCs w:val="16"/>
+                            <w:sz w:val="18"/>
+                            <w:szCs w:val="18"/>
                           </w:rPr>
                           <w:t>5</w:t>
                         </w:r>
@@ -3724,7 +3703,7 @@
                     </w:tc>
                     <w:tc>
                       <w:tcPr>
-                        <w:tcW w:w="440" w:type="dxa"/>
+                        <w:tcW w:w="345" w:type="dxa"/>
                         <w:tcBorders>
                           <w:top w:val="single" w:sz="4" w:space="0" w:color="auto"/>
                           <w:left w:val="single" w:sz="4" w:space="0" w:color="auto"/>
@@ -3747,8 +3726,8 @@
                         <w:r>
                           <w:rPr>
                             <w:rFonts w:ascii="Calibri" w:hAnsi="Calibri" w:cs="Calibri"/>
-                            <w:sz w:val="16"/>
-                            <w:szCs w:val="16"/>
+                            <w:sz w:val="18"/>
+                            <w:szCs w:val="18"/>
                           </w:rPr>
                           <w:t>6</w:t>
                         </w:r>
@@ -3756,7 +3735,7 @@
                     </w:tc>
                     <w:tc>
                       <w:tcPr>
-                        <w:tcW w:w="440" w:type="dxa"/>
+                        <w:tcW w:w="345" w:type="dxa"/>
                         <w:tcBorders>
                           <w:top w:val="single" w:sz="4" w:space="0" w:color="auto"/>
                           <w:left w:val="single" w:sz="4" w:space="0" w:color="auto"/>
@@ -3779,8 +3758,8 @@
                         <w:r>
                           <w:rPr>
                             <w:rFonts w:ascii="Calibri" w:hAnsi="Calibri" w:cs="Calibri"/>
-                            <w:sz w:val="16"/>
-                            <w:szCs w:val="16"/>
+                            <w:sz w:val="18"/>
+                            <w:szCs w:val="18"/>
                           </w:rPr>
                           <w:t>7</w:t>
                         </w:r>
@@ -3788,7 +3767,7 @@
                     </w:tc>
                     <w:tc>
                       <w:tcPr>
-                        <w:tcW w:w="440" w:type="dxa"/>
+                        <w:tcW w:w="345" w:type="dxa"/>
                         <w:tcBorders>
                           <w:top w:val="single" w:sz="4" w:space="0" w:color="auto"/>
                           <w:left w:val="single" w:sz="4" w:space="0" w:color="auto"/>
@@ -3811,8 +3790,8 @@
                         <w:r>
                           <w:rPr>
                             <w:rFonts w:ascii="Calibri" w:hAnsi="Calibri" w:cs="Calibri"/>
-                            <w:sz w:val="16"/>
-                            <w:szCs w:val="16"/>
+                            <w:sz w:val="18"/>
+                            <w:szCs w:val="18"/>
                           </w:rPr>
                           <w:t>8</w:t>
                         </w:r>
@@ -3820,7 +3799,7 @@
                     </w:tc>
                     <w:tc>
                       <w:tcPr>
-                        <w:tcW w:w="440" w:type="dxa"/>
+                        <w:tcW w:w="345" w:type="dxa"/>
                         <w:tcBorders>
                           <w:top w:val="single" w:sz="4" w:space="0" w:color="auto"/>
                           <w:left w:val="single" w:sz="4" w:space="0" w:color="auto"/>
@@ -3843,8 +3822,8 @@
                         <w:r>
                           <w:rPr>
                             <w:rFonts w:ascii="Calibri" w:hAnsi="Calibri" w:cs="Calibri"/>
-                            <w:sz w:val="16"/>
-                            <w:szCs w:val="16"/>
+                            <w:sz w:val="18"/>
+                            <w:szCs w:val="18"/>
                           </w:rPr>
                           <w:t>9</w:t>
                         </w:r>
@@ -3852,7 +3831,7 @@
                     </w:tc>
                     <w:tc>
                       <w:tcPr>
-                        <w:tcW w:w="440" w:type="dxa"/>
+                        <w:tcW w:w="345" w:type="dxa"/>
                         <w:tcBorders>
                           <w:top w:val="single" w:sz="4" w:space="0" w:color="auto"/>
                           <w:left w:val="single" w:sz="4" w:space="0" w:color="auto"/>
@@ -3875,8 +3854,8 @@
                         <w:r>
                           <w:rPr>
                             <w:rFonts w:ascii="Calibri" w:hAnsi="Calibri" w:cs="Calibri"/>
-                            <w:sz w:val="16"/>
-                            <w:szCs w:val="16"/>
+                            <w:sz w:val="18"/>
+                            <w:szCs w:val="18"/>
                           </w:rPr>
                           <w:t>10</w:t>
                         </w:r>
@@ -3885,11 +3864,11 @@
                   </w:tr>
                   <w:tr>
                     <w:trPr>
-                      <w:trHeight w:hRule="exact" w:val="440"/>
+                      <w:trHeight w:hRule="exact" w:val="345"/>
                     </w:trPr>
                     <w:tc>
                       <w:tcPr>
-                        <w:tcW w:w="440" w:type="dxa"/>
+                        <w:tcW w:w="345" w:type="dxa"/>
                         <w:tcBorders>
                           <w:top w:val="single" w:sz="4" w:space="0" w:color="auto"/>
                           <w:left w:val="single" w:sz="4" w:space="0" w:color="auto"/>
@@ -3912,8 +3891,8 @@
                         <w:r>
                           <w:rPr>
                             <w:rFonts w:ascii="Calibri" w:hAnsi="Calibri" w:cs="Calibri"/>
-                            <w:sz w:val="16"/>
-                            <w:szCs w:val="16"/>
+                            <w:sz w:val="18"/>
+                            <w:szCs w:val="18"/>
                           </w:rPr>
                           <w:t>20</w:t>
                         </w:r>
@@ -3921,7 +3900,7 @@
                     </w:tc>
                     <w:tc>
                       <w:tcPr>
-                        <w:tcW w:w="440" w:type="dxa"/>
+                        <w:tcW w:w="345" w:type="dxa"/>
                         <w:tcBorders>
                           <w:top w:val="single" w:sz="4" w:space="0" w:color="auto"/>
                           <w:left w:val="single" w:sz="4" w:space="0" w:color="auto"/>
@@ -3944,8 +3923,8 @@
                         <w:r>
                           <w:rPr>
                             <w:rFonts w:ascii="Calibri" w:hAnsi="Calibri" w:cs="Calibri"/>
-                            <w:sz w:val="16"/>
-                            <w:szCs w:val="16"/>
+                            <w:sz w:val="18"/>
+                            <w:szCs w:val="18"/>
                           </w:rPr>
                           <w:t>19</w:t>
                         </w:r>
@@ -3953,7 +3932,7 @@
                     </w:tc>
                     <w:tc>
                       <w:tcPr>
-                        <w:tcW w:w="440" w:type="dxa"/>
+                        <w:tcW w:w="345" w:type="dxa"/>
                         <w:tcBorders>
                           <w:top w:val="single" w:sz="4" w:space="0" w:color="auto"/>
                           <w:left w:val="single" w:sz="4" w:space="0" w:color="auto"/>
@@ -3976,8 +3955,8 @@
                         <w:r>
                           <w:rPr>
                             <w:rFonts w:ascii="Calibri" w:hAnsi="Calibri" w:cs="Calibri"/>
-                            <w:sz w:val="16"/>
-                            <w:szCs w:val="16"/>
+                            <w:sz w:val="18"/>
+                            <w:szCs w:val="18"/>
                           </w:rPr>
                           <w:t>18</w:t>
                         </w:r>
@@ -3985,7 +3964,7 @@
                     </w:tc>
                     <w:tc>
                       <w:tcPr>
-                        <w:tcW w:w="440" w:type="dxa"/>
+                        <w:tcW w:w="345" w:type="dxa"/>
                         <w:tcBorders>
                           <w:top w:val="single" w:sz="4" w:space="0" w:color="auto"/>
                           <w:left w:val="single" w:sz="4" w:space="0" w:color="auto"/>
@@ -4008,8 +3987,8 @@
                         <w:r>
                           <w:rPr>
                             <w:rFonts w:ascii="Calibri" w:hAnsi="Calibri" w:cs="Calibri"/>
-                            <w:sz w:val="16"/>
-                            <w:szCs w:val="16"/>
+                            <w:sz w:val="18"/>
+                            <w:szCs w:val="18"/>
                           </w:rPr>
                           <w:t>17</w:t>
                         </w:r>
@@ -4017,7 +3996,7 @@
                     </w:tc>
                     <w:tc>
                       <w:tcPr>
-                        <w:tcW w:w="440" w:type="dxa"/>
+                        <w:tcW w:w="345" w:type="dxa"/>
                         <w:tcBorders>
                           <w:top w:val="single" w:sz="4" w:space="0" w:color="auto"/>
                           <w:left w:val="single" w:sz="4" w:space="0" w:color="auto"/>
@@ -4040,8 +4019,8 @@
                         <w:r>
                           <w:rPr>
                             <w:rFonts w:ascii="Calibri" w:hAnsi="Calibri" w:cs="Calibri"/>
-                            <w:sz w:val="16"/>
-                            <w:szCs w:val="16"/>
+                            <w:sz w:val="18"/>
+                            <w:szCs w:val="18"/>
                           </w:rPr>
                           <w:t>16</w:t>
                         </w:r>
@@ -4049,7 +4028,7 @@
                     </w:tc>
                     <w:tc>
                       <w:tcPr>
-                        <w:tcW w:w="440" w:type="dxa"/>
+                        <w:tcW w:w="345" w:type="dxa"/>
                         <w:tcBorders>
                           <w:top w:val="single" w:sz="4" w:space="0" w:color="auto"/>
                           <w:left w:val="single" w:sz="4" w:space="0" w:color="auto"/>
@@ -4072,8 +4051,8 @@
                         <w:r>
                           <w:rPr>
                             <w:rFonts w:ascii="Calibri" w:hAnsi="Calibri" w:cs="Calibri"/>
-                            <w:sz w:val="16"/>
-                            <w:szCs w:val="16"/>
+                            <w:sz w:val="18"/>
+                            <w:szCs w:val="18"/>
                           </w:rPr>
                           <w:t>15</w:t>
                         </w:r>
@@ -4081,7 +4060,7 @@
                     </w:tc>
                     <w:tc>
                       <w:tcPr>
-                        <w:tcW w:w="440" w:type="dxa"/>
+                        <w:tcW w:w="345" w:type="dxa"/>
                         <w:tcBorders>
                           <w:top w:val="single" w:sz="4" w:space="0" w:color="auto"/>
                           <w:left w:val="single" w:sz="4" w:space="0" w:color="auto"/>
@@ -4104,8 +4083,8 @@
                         <w:r>
                           <w:rPr>
                             <w:rFonts w:ascii="Calibri" w:hAnsi="Calibri" w:cs="Calibri"/>
-                            <w:sz w:val="16"/>
-                            <w:szCs w:val="16"/>
+                            <w:sz w:val="18"/>
+                            <w:szCs w:val="18"/>
                           </w:rPr>
                           <w:t>14</w:t>
                         </w:r>
@@ -4113,7 +4092,7 @@
                     </w:tc>
                     <w:tc>
                       <w:tcPr>
-                        <w:tcW w:w="440" w:type="dxa"/>
+                        <w:tcW w:w="345" w:type="dxa"/>
                         <w:tcBorders>
                           <w:top w:val="single" w:sz="4" w:space="0" w:color="auto"/>
                           <w:left w:val="single" w:sz="4" w:space="0" w:color="auto"/>
@@ -4136,8 +4115,8 @@
                         <w:r>
                           <w:rPr>
                             <w:rFonts w:ascii="Calibri" w:hAnsi="Calibri" w:cs="Calibri"/>
-                            <w:sz w:val="16"/>
-                            <w:szCs w:val="16"/>
+                            <w:sz w:val="18"/>
+                            <w:szCs w:val="18"/>
                           </w:rPr>
                           <w:t>13</w:t>
                         </w:r>
@@ -4145,7 +4124,7 @@
                     </w:tc>
                     <w:tc>
                       <w:tcPr>
-                        <w:tcW w:w="440" w:type="dxa"/>
+                        <w:tcW w:w="345" w:type="dxa"/>
                         <w:tcBorders>
                           <w:top w:val="single" w:sz="4" w:space="0" w:color="auto"/>
                           <w:left w:val="single" w:sz="4" w:space="0" w:color="auto"/>
@@ -4168,8 +4147,8 @@
                         <w:r>
                           <w:rPr>
                             <w:rFonts w:ascii="Calibri" w:hAnsi="Calibri" w:cs="Calibri"/>
-                            <w:sz w:val="16"/>
-                            <w:szCs w:val="16"/>
+                            <w:sz w:val="18"/>
+                            <w:szCs w:val="18"/>
                           </w:rPr>
                           <w:t>12</w:t>
                         </w:r>
@@ -4177,7 +4156,7 @@
                     </w:tc>
                     <w:tc>
                       <w:tcPr>
-                        <w:tcW w:w="440" w:type="dxa"/>
+                        <w:tcW w:w="345" w:type="dxa"/>
                         <w:tcBorders>
                           <w:top w:val="single" w:sz="4" w:space="0" w:color="auto"/>
                           <w:left w:val="single" w:sz="4" w:space="0" w:color="auto"/>
@@ -4200,8 +4179,8 @@
                         <w:r>
                           <w:rPr>
                             <w:rFonts w:ascii="Calibri" w:hAnsi="Calibri" w:cs="Calibri"/>
-                            <w:sz w:val="16"/>
-                            <w:szCs w:val="16"/>
+                            <w:sz w:val="18"/>
+                            <w:szCs w:val="18"/>
                           </w:rPr>
                           <w:t>11</w:t>
                         </w:r>
@@ -4210,11 +4189,11 @@
                   </w:tr>
                   <w:tr>
                     <w:trPr>
-                      <w:trHeight w:hRule="exact" w:val="440"/>
+                      <w:trHeight w:hRule="exact" w:val="345"/>
                     </w:trPr>
                     <w:tc>
                       <w:tcPr>
-                        <w:tcW w:w="440" w:type="dxa"/>
+                        <w:tcW w:w="345" w:type="dxa"/>
                         <w:tcBorders>
                           <w:top w:val="single" w:sz="4" w:space="0" w:color="auto"/>
                           <w:left w:val="single" w:sz="4" w:space="0" w:color="auto"/>
@@ -4237,8 +4216,8 @@
                         <w:r>
                           <w:rPr>
                             <w:rFonts w:ascii="Calibri" w:hAnsi="Calibri" w:cs="Calibri"/>
-                            <w:sz w:val="16"/>
-                            <w:szCs w:val="16"/>
+                            <w:sz w:val="18"/>
+                            <w:szCs w:val="18"/>
                           </w:rPr>
                           <w:t>21</w:t>
                         </w:r>
@@ -4246,7 +4225,7 @@
                     </w:tc>
                     <w:tc>
                       <w:tcPr>
-                        <w:tcW w:w="440" w:type="dxa"/>
+                        <w:tcW w:w="345" w:type="dxa"/>
                         <w:tcBorders>
                           <w:top w:val="single" w:sz="4" w:space="0" w:color="auto"/>
                           <w:left w:val="single" w:sz="4" w:space="0" w:color="auto"/>
@@ -4269,8 +4248,8 @@
                         <w:r>
                           <w:rPr>
                             <w:rFonts w:ascii="Calibri" w:hAnsi="Calibri" w:cs="Calibri"/>
-                            <w:sz w:val="16"/>
-                            <w:szCs w:val="16"/>
+                            <w:sz w:val="18"/>
+                            <w:szCs w:val="18"/>
                           </w:rPr>
                           <w:t>22</w:t>
                         </w:r>
@@ -4278,7 +4257,7 @@
                     </w:tc>
                     <w:tc>
                       <w:tcPr>
-                        <w:tcW w:w="440" w:type="dxa"/>
+                        <w:tcW w:w="345" w:type="dxa"/>
                         <w:tcBorders>
                           <w:top w:val="single" w:sz="4" w:space="0" w:color="auto"/>
                           <w:left w:val="single" w:sz="4" w:space="0" w:color="auto"/>
@@ -4301,8 +4280,8 @@
                         <w:r>
                           <w:rPr>
                             <w:rFonts w:ascii="Calibri" w:hAnsi="Calibri" w:cs="Calibri"/>
-                            <w:sz w:val="16"/>
-                            <w:szCs w:val="16"/>
+                            <w:sz w:val="18"/>
+                            <w:szCs w:val="18"/>
                           </w:rPr>
                           <w:t>23</w:t>
                         </w:r>
@@ -4310,7 +4289,7 @@
                     </w:tc>
                     <w:tc>
                       <w:tcPr>
-                        <w:tcW w:w="440" w:type="dxa"/>
+                        <w:tcW w:w="345" w:type="dxa"/>
                         <w:tcBorders>
                           <w:top w:val="single" w:sz="4" w:space="0" w:color="auto"/>
                           <w:left w:val="single" w:sz="4" w:space="0" w:color="auto"/>
@@ -4333,8 +4312,8 @@
                         <w:r>
                           <w:rPr>
                             <w:rFonts w:ascii="Calibri" w:hAnsi="Calibri" w:cs="Calibri"/>
-                            <w:sz w:val="16"/>
-                            <w:szCs w:val="16"/>
+                            <w:sz w:val="18"/>
+                            <w:szCs w:val="18"/>
                           </w:rPr>
                           <w:t>24</w:t>
                         </w:r>
@@ -4342,7 +4321,7 @@
                     </w:tc>
                     <w:tc>
                       <w:tcPr>
-                        <w:tcW w:w="440" w:type="dxa"/>
+                        <w:tcW w:w="345" w:type="dxa"/>
                         <w:tcBorders>
                           <w:top w:val="single" w:sz="4" w:space="0" w:color="auto"/>
                           <w:left w:val="single" w:sz="4" w:space="0" w:color="auto"/>
@@ -4365,8 +4344,8 @@
                         <w:r>
                           <w:rPr>
                             <w:rFonts w:ascii="Calibri" w:hAnsi="Calibri" w:cs="Calibri"/>
-                            <w:sz w:val="16"/>
-                            <w:szCs w:val="16"/>
+                            <w:sz w:val="18"/>
+                            <w:szCs w:val="18"/>
                           </w:rPr>
                           <w:t>25</w:t>
                         </w:r>
@@ -4374,7 +4353,7 @@
                     </w:tc>
                     <w:tc>
                       <w:tcPr>
-                        <w:tcW w:w="440" w:type="dxa"/>
+                        <w:tcW w:w="345" w:type="dxa"/>
                         <w:tcBorders>
                           <w:top w:val="single" w:sz="4" w:space="0" w:color="auto"/>
                           <w:left w:val="single" w:sz="4" w:space="0" w:color="auto"/>
@@ -4397,8 +4376,8 @@
                         <w:r>
                           <w:rPr>
                             <w:rFonts w:ascii="Calibri" w:hAnsi="Calibri" w:cs="Calibri"/>
-                            <w:sz w:val="16"/>
-                            <w:szCs w:val="16"/>
+                            <w:sz w:val="18"/>
+                            <w:szCs w:val="18"/>
                           </w:rPr>
                           <w:t>26</w:t>
                         </w:r>
@@ -4406,7 +4385,7 @@
                     </w:tc>
                     <w:tc>
                       <w:tcPr>
-                        <w:tcW w:w="440" w:type="dxa"/>
+                        <w:tcW w:w="345" w:type="dxa"/>
                         <w:tcBorders>
                           <w:top w:val="single" w:sz="4" w:space="0" w:color="auto"/>
                           <w:left w:val="single" w:sz="4" w:space="0" w:color="auto"/>
@@ -4429,8 +4408,8 @@
                         <w:r>
                           <w:rPr>
                             <w:rFonts w:ascii="Calibri" w:hAnsi="Calibri" w:cs="Calibri"/>
-                            <w:sz w:val="16"/>
-                            <w:szCs w:val="16"/>
+                            <w:sz w:val="18"/>
+                            <w:szCs w:val="18"/>
                           </w:rPr>
                           <w:t>27</w:t>
                         </w:r>
@@ -4438,7 +4417,7 @@
                     </w:tc>
                     <w:tc>
                       <w:tcPr>
-                        <w:tcW w:w="440" w:type="dxa"/>
+                        <w:tcW w:w="345" w:type="dxa"/>
                         <w:tcBorders>
                           <w:top w:val="single" w:sz="4" w:space="0" w:color="auto"/>
                           <w:left w:val="single" w:sz="4" w:space="0" w:color="auto"/>
@@ -4461,8 +4440,8 @@
                         <w:r>
                           <w:rPr>
                             <w:rFonts w:ascii="Calibri" w:hAnsi="Calibri" w:cs="Calibri"/>
-                            <w:sz w:val="16"/>
-                            <w:szCs w:val="16"/>
+                            <w:sz w:val="18"/>
+                            <w:szCs w:val="18"/>
                           </w:rPr>
                           <w:t>28</w:t>
                         </w:r>
@@ -4470,7 +4449,7 @@
                     </w:tc>
                     <w:tc>
                       <w:tcPr>
-                        <w:tcW w:w="440" w:type="dxa"/>
+                        <w:tcW w:w="345" w:type="dxa"/>
                         <w:tcBorders>
                           <w:top w:val="single" w:sz="4" w:space="0" w:color="auto"/>
                           <w:left w:val="single" w:sz="4" w:space="0" w:color="auto"/>
@@ -4493,8 +4472,8 @@
                         <w:r>
                           <w:rPr>
                             <w:rFonts w:ascii="Calibri" w:hAnsi="Calibri" w:cs="Calibri"/>
-                            <w:sz w:val="16"/>
-                            <w:szCs w:val="16"/>
+                            <w:sz w:val="18"/>
+                            <w:szCs w:val="18"/>
                           </w:rPr>
                           <w:t>29</w:t>
                         </w:r>
@@ -4502,7 +4481,7 @@
                     </w:tc>
                     <w:tc>
                       <w:tcPr>
-                        <w:tcW w:w="440" w:type="dxa"/>
+                        <w:tcW w:w="345" w:type="dxa"/>
                         <w:tcBorders>
                           <w:top w:val="single" w:sz="4" w:space="0" w:color="auto"/>
                           <w:left w:val="single" w:sz="4" w:space="0" w:color="auto"/>
@@ -4525,8 +4504,8 @@
                         <w:r>
                           <w:rPr>
                             <w:rFonts w:ascii="Calibri" w:hAnsi="Calibri" w:cs="Calibri"/>
-                            <w:sz w:val="16"/>
-                            <w:szCs w:val="16"/>
+                            <w:sz w:val="18"/>
+                            <w:szCs w:val="18"/>
                           </w:rPr>
                           <w:t>30</w:t>
                         </w:r>
@@ -4535,11 +4514,11 @@
                   </w:tr>
                   <w:tr>
                     <w:trPr>
-                      <w:trHeight w:hRule="exact" w:val="440"/>
+                      <w:trHeight w:hRule="exact" w:val="345"/>
                     </w:trPr>
                     <w:tc>
                       <w:tcPr>
-                        <w:tcW w:w="440" w:type="dxa"/>
+                        <w:tcW w:w="345" w:type="dxa"/>
                         <w:tcBorders>
                           <w:top w:val="single" w:sz="4" w:space="0" w:color="auto"/>
                           <w:left w:val="single" w:sz="4" w:space="0" w:color="auto"/>
@@ -4562,8 +4541,8 @@
                         <w:r>
                           <w:rPr>
                             <w:rFonts w:ascii="Calibri" w:hAnsi="Calibri" w:cs="Calibri"/>
-                            <w:sz w:val="16"/>
-                            <w:szCs w:val="16"/>
+                            <w:sz w:val="18"/>
+                            <w:szCs w:val="18"/>
                           </w:rPr>
                           <w:t>40</w:t>
                         </w:r>
@@ -4571,7 +4550,7 @@
                     </w:tc>
                     <w:tc>
                       <w:tcPr>
-                        <w:tcW w:w="440" w:type="dxa"/>
+                        <w:tcW w:w="345" w:type="dxa"/>
                         <w:tcBorders>
                           <w:top w:val="single" w:sz="4" w:space="0" w:color="auto"/>
                           <w:left w:val="single" w:sz="4" w:space="0" w:color="auto"/>
@@ -4594,8 +4573,8 @@
                         <w:r>
                           <w:rPr>
                             <w:rFonts w:ascii="Calibri" w:hAnsi="Calibri" w:cs="Calibri"/>
-                            <w:sz w:val="16"/>
-                            <w:szCs w:val="16"/>
+                            <w:sz w:val="18"/>
+                            <w:szCs w:val="18"/>
                           </w:rPr>
                           <w:t>39</w:t>
                         </w:r>
@@ -4603,7 +4582,7 @@
                     </w:tc>
                     <w:tc>
                       <w:tcPr>
-                        <w:tcW w:w="440" w:type="dxa"/>
+                        <w:tcW w:w="345" w:type="dxa"/>
                         <w:tcBorders>
                           <w:top w:val="single" w:sz="4" w:space="0" w:color="auto"/>
                           <w:left w:val="single" w:sz="4" w:space="0" w:color="auto"/>
@@ -4626,8 +4605,8 @@
                         <w:r>
                           <w:rPr>
                             <w:rFonts w:ascii="Calibri" w:hAnsi="Calibri" w:cs="Calibri"/>
-                            <w:sz w:val="16"/>
-                            <w:szCs w:val="16"/>
+                            <w:sz w:val="18"/>
+                            <w:szCs w:val="18"/>
                           </w:rPr>
                           <w:t>38</w:t>
                         </w:r>
@@ -4635,7 +4614,7 @@
                     </w:tc>
                     <w:tc>
                       <w:tcPr>
-                        <w:tcW w:w="440" w:type="dxa"/>
+                        <w:tcW w:w="345" w:type="dxa"/>
                         <w:tcBorders>
                           <w:top w:val="single" w:sz="4" w:space="0" w:color="auto"/>
                           <w:left w:val="single" w:sz="4" w:space="0" w:color="auto"/>
@@ -4658,8 +4637,8 @@
                         <w:r>
                           <w:rPr>
                             <w:rFonts w:ascii="Calibri" w:hAnsi="Calibri" w:cs="Calibri"/>
-                            <w:sz w:val="16"/>
-                            <w:szCs w:val="16"/>
+                            <w:sz w:val="18"/>
+                            <w:szCs w:val="18"/>
                           </w:rPr>
                           <w:t>37</w:t>
                         </w:r>
@@ -4667,7 +4646,7 @@
                     </w:tc>
                     <w:tc>
                       <w:tcPr>
-                        <w:tcW w:w="440" w:type="dxa"/>
+                        <w:tcW w:w="345" w:type="dxa"/>
                         <w:tcBorders>
                           <w:top w:val="single" w:sz="4" w:space="0" w:color="auto"/>
                           <w:left w:val="single" w:sz="4" w:space="0" w:color="auto"/>
@@ -4690,8 +4669,8 @@
                         <w:r>
                           <w:rPr>
                             <w:rFonts w:ascii="Calibri" w:hAnsi="Calibri" w:cs="Calibri"/>
-                            <w:sz w:val="16"/>
-                            <w:szCs w:val="16"/>
+                            <w:sz w:val="18"/>
+                            <w:szCs w:val="18"/>
                           </w:rPr>
                           <w:t>36</w:t>
                         </w:r>
@@ -4699,7 +4678,7 @@
                     </w:tc>
                     <w:tc>
                       <w:tcPr>
-                        <w:tcW w:w="440" w:type="dxa"/>
+                        <w:tcW w:w="345" w:type="dxa"/>
                         <w:tcBorders>
                           <w:top w:val="single" w:sz="4" w:space="0" w:color="auto"/>
                           <w:left w:val="single" w:sz="4" w:space="0" w:color="auto"/>
@@ -4722,8 +4701,8 @@
                         <w:r>
                           <w:rPr>
                             <w:rFonts w:ascii="Calibri" w:hAnsi="Calibri" w:cs="Calibri"/>
-                            <w:sz w:val="16"/>
-                            <w:szCs w:val="16"/>
+                            <w:sz w:val="18"/>
+                            <w:szCs w:val="18"/>
                           </w:rPr>
                           <w:t>35</w:t>
                         </w:r>
@@ -4731,7 +4710,7 @@
                     </w:tc>
                     <w:tc>
                       <w:tcPr>
-                        <w:tcW w:w="440" w:type="dxa"/>
+                        <w:tcW w:w="345" w:type="dxa"/>
                         <w:tcBorders>
                           <w:top w:val="single" w:sz="4" w:space="0" w:color="auto"/>
                           <w:left w:val="single" w:sz="4" w:space="0" w:color="auto"/>
@@ -4754,8 +4733,8 @@
                         <w:r>
                           <w:rPr>
                             <w:rFonts w:ascii="Calibri" w:hAnsi="Calibri" w:cs="Calibri"/>
-                            <w:sz w:val="16"/>
-                            <w:szCs w:val="16"/>
+                            <w:sz w:val="18"/>
+                            <w:szCs w:val="18"/>
                           </w:rPr>
                           <w:t>34</w:t>
                         </w:r>
@@ -4763,7 +4742,7 @@
                     </w:tc>
                     <w:tc>
                       <w:tcPr>
-                        <w:tcW w:w="440" w:type="dxa"/>
+                        <w:tcW w:w="345" w:type="dxa"/>
                         <w:tcBorders>
                           <w:top w:val="single" w:sz="4" w:space="0" w:color="auto"/>
                           <w:left w:val="single" w:sz="4" w:space="0" w:color="auto"/>
@@ -4786,8 +4765,8 @@
                         <w:r>
                           <w:rPr>
                             <w:rFonts w:ascii="Calibri" w:hAnsi="Calibri" w:cs="Calibri"/>
-                            <w:sz w:val="16"/>
-                            <w:szCs w:val="16"/>
+                            <w:sz w:val="18"/>
+                            <w:szCs w:val="18"/>
                           </w:rPr>
                           <w:t>33</w:t>
                         </w:r>
@@ -4795,7 +4774,7 @@
                     </w:tc>
                     <w:tc>
                       <w:tcPr>
-                        <w:tcW w:w="440" w:type="dxa"/>
+                        <w:tcW w:w="345" w:type="dxa"/>
                         <w:tcBorders>
                           <w:top w:val="single" w:sz="4" w:space="0" w:color="auto"/>
                           <w:left w:val="single" w:sz="4" w:space="0" w:color="auto"/>
@@ -4818,8 +4797,8 @@
                         <w:r>
                           <w:rPr>
                             <w:rFonts w:ascii="Calibri" w:hAnsi="Calibri" w:cs="Calibri"/>
-                            <w:sz w:val="16"/>
-                            <w:szCs w:val="16"/>
+                            <w:sz w:val="18"/>
+                            <w:szCs w:val="18"/>
                           </w:rPr>
                           <w:t>32</w:t>
                         </w:r>
@@ -4827,7 +4806,7 @@
                     </w:tc>
                     <w:tc>
                       <w:tcPr>
-                        <w:tcW w:w="440" w:type="dxa"/>
+                        <w:tcW w:w="345" w:type="dxa"/>
                         <w:tcBorders>
                           <w:top w:val="single" w:sz="4" w:space="0" w:color="auto"/>
                           <w:left w:val="single" w:sz="4" w:space="0" w:color="auto"/>
@@ -4850,8 +4829,8 @@
                         <w:r>
                           <w:rPr>
                             <w:rFonts w:ascii="Calibri" w:hAnsi="Calibri" w:cs="Calibri"/>
-                            <w:sz w:val="16"/>
-                            <w:szCs w:val="16"/>
+                            <w:sz w:val="18"/>
+                            <w:szCs w:val="18"/>
                           </w:rPr>
                           <w:t>31</w:t>
                         </w:r>
@@ -4860,11 +4839,11 @@
                   </w:tr>
                   <w:tr>
                     <w:trPr>
-                      <w:trHeight w:hRule="exact" w:val="440"/>
+                      <w:trHeight w:hRule="exact" w:val="345"/>
                     </w:trPr>
                     <w:tc>
                       <w:tcPr>
-                        <w:tcW w:w="440" w:type="dxa"/>
+                        <w:tcW w:w="345" w:type="dxa"/>
                         <w:tcBorders>
                           <w:top w:val="single" w:sz="4" w:space="0" w:color="auto"/>
                           <w:left w:val="single" w:sz="4" w:space="0" w:color="auto"/>
@@ -4887,8 +4866,8 @@
                         <w:r>
                           <w:rPr>
                             <w:rFonts w:ascii="Calibri" w:hAnsi="Calibri" w:cs="Calibri"/>
-                            <w:sz w:val="16"/>
-                            <w:szCs w:val="16"/>
+                            <w:sz w:val="18"/>
+                            <w:szCs w:val="18"/>
                           </w:rPr>
                           <w:t>41</w:t>
                         </w:r>
@@ -4896,7 +4875,7 @@
                     </w:tc>
                     <w:tc>
                       <w:tcPr>
-                        <w:tcW w:w="440" w:type="dxa"/>
+                        <w:tcW w:w="345" w:type="dxa"/>
                         <w:tcBorders>
                           <w:top w:val="single" w:sz="4" w:space="0" w:color="auto"/>
                           <w:left w:val="single" w:sz="4" w:space="0" w:color="auto"/>
@@ -4919,8 +4898,8 @@
                         <w:r>
                           <w:rPr>
                             <w:rFonts w:ascii="Calibri" w:hAnsi="Calibri" w:cs="Calibri"/>
-                            <w:sz w:val="16"/>
-                            <w:szCs w:val="16"/>
+                            <w:sz w:val="18"/>
+                            <w:szCs w:val="18"/>
                           </w:rPr>
                           <w:t>42</w:t>
                         </w:r>
@@ -4928,7 +4907,7 @@
                     </w:tc>
                     <w:tc>
                       <w:tcPr>
-                        <w:tcW w:w="440" w:type="dxa"/>
+                        <w:tcW w:w="345" w:type="dxa"/>
                         <w:tcBorders>
                           <w:top w:val="single" w:sz="4" w:space="0" w:color="auto"/>
                           <w:left w:val="single" w:sz="4" w:space="0" w:color="auto"/>
@@ -4951,8 +4930,8 @@
                         <w:r>
                           <w:rPr>
                             <w:rFonts w:ascii="Calibri" w:hAnsi="Calibri" w:cs="Calibri"/>
-                            <w:sz w:val="16"/>
-                            <w:szCs w:val="16"/>
+                            <w:sz w:val="18"/>
+                            <w:szCs w:val="18"/>
                           </w:rPr>
                           <w:t>43</w:t>
                         </w:r>
@@ -4960,7 +4939,7 @@
                     </w:tc>
                     <w:tc>
                       <w:tcPr>
-                        <w:tcW w:w="440" w:type="dxa"/>
+                        <w:tcW w:w="345" w:type="dxa"/>
                         <w:tcBorders>
                           <w:top w:val="single" w:sz="4" w:space="0" w:color="auto"/>
                           <w:left w:val="single" w:sz="4" w:space="0" w:color="auto"/>
@@ -4983,8 +4962,8 @@
                         <w:r>
                           <w:rPr>
                             <w:rFonts w:ascii="Calibri" w:hAnsi="Calibri" w:cs="Calibri"/>
-                            <w:sz w:val="16"/>
-                            <w:szCs w:val="16"/>
+                            <w:sz w:val="18"/>
+                            <w:szCs w:val="18"/>
                           </w:rPr>
                           <w:t>44</w:t>
                         </w:r>
@@ -4992,7 +4971,7 @@
                     </w:tc>
                     <w:tc>
                       <w:tcPr>
-                        <w:tcW w:w="440" w:type="dxa"/>
+                        <w:tcW w:w="345" w:type="dxa"/>
                         <w:tcBorders>
                           <w:top w:val="single" w:sz="4" w:space="0" w:color="auto"/>
                           <w:left w:val="single" w:sz="4" w:space="0" w:color="auto"/>
@@ -5015,8 +4994,8 @@
                         <w:r>
                           <w:rPr>
                             <w:rFonts w:ascii="Calibri" w:hAnsi="Calibri" w:cs="Calibri"/>
-                            <w:sz w:val="16"/>
-                            <w:szCs w:val="16"/>
+                            <w:sz w:val="18"/>
+                            <w:szCs w:val="18"/>
                           </w:rPr>
                           <w:t>45</w:t>
                         </w:r>
@@ -5024,7 +5003,7 @@
                     </w:tc>
                     <w:tc>
                       <w:tcPr>
-                        <w:tcW w:w="440" w:type="dxa"/>
+                        <w:tcW w:w="345" w:type="dxa"/>
                         <w:tcBorders>
                           <w:top w:val="single" w:sz="4" w:space="0" w:color="auto"/>
                           <w:left w:val="single" w:sz="4" w:space="0" w:color="auto"/>
@@ -5047,8 +5026,8 @@
                         <w:r>
                           <w:rPr>
                             <w:rFonts w:ascii="Calibri" w:hAnsi="Calibri" w:cs="Calibri"/>
-                            <w:sz w:val="16"/>
-                            <w:szCs w:val="16"/>
+                            <w:sz w:val="18"/>
+                            <w:szCs w:val="18"/>
                           </w:rPr>
                           <w:t>46</w:t>
                         </w:r>
@@ -5056,7 +5035,7 @@
                     </w:tc>
                     <w:tc>
                       <w:tcPr>
-                        <w:tcW w:w="440" w:type="dxa"/>
+                        <w:tcW w:w="345" w:type="dxa"/>
                         <w:tcBorders>
                           <w:top w:val="single" w:sz="4" w:space="0" w:color="auto"/>
                           <w:left w:val="single" w:sz="4" w:space="0" w:color="auto"/>
@@ -5079,8 +5058,8 @@
                         <w:r>
                           <w:rPr>
                             <w:rFonts w:ascii="Calibri" w:hAnsi="Calibri" w:cs="Calibri"/>
-                            <w:sz w:val="16"/>
-                            <w:szCs w:val="16"/>
+                            <w:sz w:val="18"/>
+                            <w:szCs w:val="18"/>
                           </w:rPr>
                           <w:t>47</w:t>
                         </w:r>
@@ -5088,7 +5067,7 @@
                     </w:tc>
                     <w:tc>
                       <w:tcPr>
-                        <w:tcW w:w="440" w:type="dxa"/>
+                        <w:tcW w:w="345" w:type="dxa"/>
                         <w:tcBorders>
                           <w:top w:val="single" w:sz="4" w:space="0" w:color="auto"/>
                           <w:left w:val="single" w:sz="4" w:space="0" w:color="auto"/>
@@ -5111,8 +5090,8 @@
                         <w:r>
                           <w:rPr>
                             <w:rFonts w:ascii="Calibri" w:hAnsi="Calibri" w:cs="Calibri"/>
-                            <w:sz w:val="16"/>
-                            <w:szCs w:val="16"/>
+                            <w:sz w:val="18"/>
+                            <w:szCs w:val="18"/>
                           </w:rPr>
                           <w:t>48</w:t>
                         </w:r>
@@ -5120,7 +5099,7 @@
                     </w:tc>
                     <w:tc>
                       <w:tcPr>
-                        <w:tcW w:w="440" w:type="dxa"/>
+                        <w:tcW w:w="345" w:type="dxa"/>
                         <w:tcBorders>
                           <w:top w:val="single" w:sz="4" w:space="0" w:color="auto"/>
                           <w:left w:val="single" w:sz="4" w:space="0" w:color="auto"/>
@@ -5143,8 +5122,8 @@
                         <w:r>
                           <w:rPr>
                             <w:rFonts w:ascii="Calibri" w:hAnsi="Calibri" w:cs="Calibri"/>
-                            <w:sz w:val="16"/>
-                            <w:szCs w:val="16"/>
+                            <w:sz w:val="18"/>
+                            <w:szCs w:val="18"/>
                           </w:rPr>
                           <w:t>49</w:t>
                         </w:r>
@@ -5152,7 +5131,7 @@
                     </w:tc>
                     <w:tc>
                       <w:tcPr>
-                        <w:tcW w:w="440" w:type="dxa"/>
+                        <w:tcW w:w="345" w:type="dxa"/>
                         <w:tcBorders>
                           <w:top w:val="single" w:sz="4" w:space="0" w:color="auto"/>
                           <w:left w:val="single" w:sz="4" w:space="0" w:color="auto"/>
@@ -5175,8 +5154,8 @@
                         <w:r>
                           <w:rPr>
                             <w:rFonts w:ascii="Calibri" w:hAnsi="Calibri" w:cs="Calibri"/>
-                            <w:sz w:val="16"/>
-                            <w:szCs w:val="16"/>
+                            <w:sz w:val="18"/>
+                            <w:szCs w:val="18"/>
                           </w:rPr>
                           <w:t>50</w:t>
                         </w:r>
@@ -5185,11 +5164,11 @@
                   </w:tr>
                   <w:tr>
                     <w:trPr>
-                      <w:trHeight w:hRule="exact" w:val="440"/>
+                      <w:trHeight w:hRule="exact" w:val="345"/>
                     </w:trPr>
                     <w:tc>
                       <w:tcPr>
-                        <w:tcW w:w="440" w:type="dxa"/>
+                        <w:tcW w:w="345" w:type="dxa"/>
                         <w:tcBorders>
                           <w:top w:val="single" w:sz="4" w:space="0" w:color="auto"/>
                           <w:left w:val="single" w:sz="4" w:space="0" w:color="auto"/>
@@ -5212,8 +5191,8 @@
                         <w:r>
                           <w:rPr>
                             <w:rFonts w:ascii="Calibri" w:hAnsi="Calibri" w:cs="Calibri"/>
-                            <w:sz w:val="16"/>
-                            <w:szCs w:val="16"/>
+                            <w:sz w:val="18"/>
+                            <w:szCs w:val="18"/>
                           </w:rPr>
                           <w:t>60</w:t>
                         </w:r>
@@ -5221,7 +5200,7 @@
                     </w:tc>
                     <w:tc>
                       <w:tcPr>
-                        <w:tcW w:w="440" w:type="dxa"/>
+                        <w:tcW w:w="345" w:type="dxa"/>
                         <w:tcBorders>
                           <w:top w:val="single" w:sz="4" w:space="0" w:color="auto"/>
                           <w:left w:val="single" w:sz="4" w:space="0" w:color="auto"/>
@@ -5244,8 +5223,8 @@
                         <w:r>
                           <w:rPr>
                             <w:rFonts w:ascii="Calibri" w:hAnsi="Calibri" w:cs="Calibri"/>
-                            <w:sz w:val="16"/>
-                            <w:szCs w:val="16"/>
+                            <w:sz w:val="18"/>
+                            <w:szCs w:val="18"/>
                           </w:rPr>
                           <w:t>59</w:t>
                         </w:r>
@@ -5253,7 +5232,7 @@
                     </w:tc>
                     <w:tc>
                       <w:tcPr>
-                        <w:tcW w:w="440" w:type="dxa"/>
+                        <w:tcW w:w="345" w:type="dxa"/>
                         <w:tcBorders>
                           <w:top w:val="single" w:sz="4" w:space="0" w:color="auto"/>
                           <w:left w:val="single" w:sz="4" w:space="0" w:color="auto"/>
@@ -5276,8 +5255,8 @@
                         <w:r>
                           <w:rPr>
                             <w:rFonts w:ascii="Calibri" w:hAnsi="Calibri" w:cs="Calibri"/>
-                            <w:sz w:val="16"/>
-                            <w:szCs w:val="16"/>
+                            <w:sz w:val="18"/>
+                            <w:szCs w:val="18"/>
                           </w:rPr>
                           <w:t>58</w:t>
                         </w:r>
@@ -5285,7 +5264,7 @@
                     </w:tc>
                     <w:tc>
                       <w:tcPr>
-                        <w:tcW w:w="440" w:type="dxa"/>
+                        <w:tcW w:w="345" w:type="dxa"/>
                         <w:tcBorders>
                           <w:top w:val="single" w:sz="4" w:space="0" w:color="auto"/>
                           <w:left w:val="single" w:sz="4" w:space="0" w:color="auto"/>
@@ -5308,8 +5287,8 @@
                         <w:r>
                           <w:rPr>
                             <w:rFonts w:ascii="Calibri" w:hAnsi="Calibri" w:cs="Calibri"/>
-                            <w:sz w:val="16"/>
-                            <w:szCs w:val="16"/>
+                            <w:sz w:val="18"/>
+                            <w:szCs w:val="18"/>
                           </w:rPr>
                           <w:t>57</w:t>
                         </w:r>
@@ -5317,7 +5296,7 @@
                     </w:tc>
                     <w:tc>
                       <w:tcPr>
-                        <w:tcW w:w="440" w:type="dxa"/>
+                        <w:tcW w:w="345" w:type="dxa"/>
                         <w:tcBorders>
                           <w:top w:val="single" w:sz="4" w:space="0" w:color="auto"/>
                           <w:left w:val="single" w:sz="4" w:space="0" w:color="auto"/>
@@ -5340,8 +5319,8 @@
                         <w:r>
                           <w:rPr>
                             <w:rFonts w:ascii="Calibri" w:hAnsi="Calibri" w:cs="Calibri"/>
-                            <w:sz w:val="16"/>
-                            <w:szCs w:val="16"/>
+                            <w:sz w:val="18"/>
+                            <w:szCs w:val="18"/>
                           </w:rPr>
                           <w:t>56</w:t>
                         </w:r>
@@ -5349,7 +5328,7 @@
                     </w:tc>
                     <w:tc>
                       <w:tcPr>
-                        <w:tcW w:w="440" w:type="dxa"/>
+                        <w:tcW w:w="345" w:type="dxa"/>
                         <w:tcBorders>
                           <w:top w:val="single" w:sz="4" w:space="0" w:color="auto"/>
                           <w:left w:val="single" w:sz="4" w:space="0" w:color="auto"/>
@@ -5372,8 +5351,8 @@
                         <w:r>
                           <w:rPr>
                             <w:rFonts w:ascii="Calibri" w:hAnsi="Calibri" w:cs="Calibri"/>
-                            <w:sz w:val="16"/>
-                            <w:szCs w:val="16"/>
+                            <w:sz w:val="18"/>
+                            <w:szCs w:val="18"/>
                           </w:rPr>
                           <w:t>55</w:t>
                         </w:r>
@@ -5381,7 +5360,7 @@
                     </w:tc>
                     <w:tc>
                       <w:tcPr>
-                        <w:tcW w:w="440" w:type="dxa"/>
+                        <w:tcW w:w="345" w:type="dxa"/>
                         <w:tcBorders>
                           <w:top w:val="single" w:sz="4" w:space="0" w:color="auto"/>
                           <w:left w:val="single" w:sz="4" w:space="0" w:color="auto"/>
@@ -5404,8 +5383,8 @@
                         <w:r>
                           <w:rPr>
                             <w:rFonts w:ascii="Calibri" w:hAnsi="Calibri" w:cs="Calibri"/>
-                            <w:sz w:val="16"/>
-                            <w:szCs w:val="16"/>
+                            <w:sz w:val="18"/>
+                            <w:szCs w:val="18"/>
                           </w:rPr>
                           <w:t>54</w:t>
                         </w:r>
@@ -5413,7 +5392,7 @@
                     </w:tc>
                     <w:tc>
                       <w:tcPr>
-                        <w:tcW w:w="440" w:type="dxa"/>
+                        <w:tcW w:w="345" w:type="dxa"/>
                         <w:tcBorders>
                           <w:top w:val="single" w:sz="4" w:space="0" w:color="auto"/>
                           <w:left w:val="single" w:sz="4" w:space="0" w:color="auto"/>
@@ -5436,8 +5415,8 @@
                         <w:r>
                           <w:rPr>
                             <w:rFonts w:ascii="Calibri" w:hAnsi="Calibri" w:cs="Calibri"/>
-                            <w:sz w:val="16"/>
-                            <w:szCs w:val="16"/>
+                            <w:sz w:val="18"/>
+                            <w:szCs w:val="18"/>
                           </w:rPr>
                           <w:t>53</w:t>
                         </w:r>
@@ -5445,7 +5424,7 @@
                     </w:tc>
                     <w:tc>
                       <w:tcPr>
-                        <w:tcW w:w="440" w:type="dxa"/>
+                        <w:tcW w:w="345" w:type="dxa"/>
                         <w:tcBorders>
                           <w:top w:val="single" w:sz="4" w:space="0" w:color="auto"/>
                           <w:left w:val="single" w:sz="4" w:space="0" w:color="auto"/>
@@ -5468,8 +5447,8 @@
                         <w:r>
                           <w:rPr>
                             <w:rFonts w:ascii="Calibri" w:hAnsi="Calibri" w:cs="Calibri"/>
-                            <w:sz w:val="16"/>
-                            <w:szCs w:val="16"/>
+                            <w:sz w:val="18"/>
+                            <w:szCs w:val="18"/>
                           </w:rPr>
                           <w:t>52</w:t>
                         </w:r>
@@ -5477,7 +5456,7 @@
                     </w:tc>
                     <w:tc>
                       <w:tcPr>
-                        <w:tcW w:w="440" w:type="dxa"/>
+                        <w:tcW w:w="345" w:type="dxa"/>
                         <w:tcBorders>
                           <w:top w:val="single" w:sz="4" w:space="0" w:color="auto"/>
                           <w:left w:val="single" w:sz="4" w:space="0" w:color="auto"/>
@@ -5500,8 +5479,8 @@
                         <w:r>
                           <w:rPr>
                             <w:rFonts w:ascii="Calibri" w:hAnsi="Calibri" w:cs="Calibri"/>
-                            <w:sz w:val="16"/>
-                            <w:szCs w:val="16"/>
+                            <w:sz w:val="18"/>
+                            <w:szCs w:val="18"/>
                           </w:rPr>
                           <w:t>51</w:t>
                         </w:r>
@@ -5510,11 +5489,11 @@
                   </w:tr>
                   <w:tr>
                     <w:trPr>
-                      <w:trHeight w:hRule="exact" w:val="440"/>
+                      <w:trHeight w:hRule="exact" w:val="345"/>
                     </w:trPr>
                     <w:tc>
                       <w:tcPr>
-                        <w:tcW w:w="440" w:type="dxa"/>
+                        <w:tcW w:w="345" w:type="dxa"/>
                         <w:tcBorders>
                           <w:top w:val="single" w:sz="4" w:space="0" w:color="auto"/>
                           <w:left w:val="single" w:sz="4" w:space="0" w:color="auto"/>
@@ -5537,8 +5516,8 @@
                         <w:r>
                           <w:rPr>
                             <w:rFonts w:ascii="Calibri" w:hAnsi="Calibri" w:cs="Calibri"/>
-                            <w:sz w:val="16"/>
-                            <w:szCs w:val="16"/>
+                            <w:sz w:val="18"/>
+                            <w:szCs w:val="18"/>
                           </w:rPr>
                           <w:t>61</w:t>
                         </w:r>
@@ -5546,7 +5525,7 @@
                     </w:tc>
                     <w:tc>
                       <w:tcPr>
-                        <w:tcW w:w="440" w:type="dxa"/>
+                        <w:tcW w:w="345" w:type="dxa"/>
                         <w:tcBorders>
                           <w:top w:val="single" w:sz="4" w:space="0" w:color="auto"/>
                           <w:left w:val="single" w:sz="4" w:space="0" w:color="auto"/>
@@ -5569,8 +5548,8 @@
                         <w:r>
                           <w:rPr>
                             <w:rFonts w:ascii="Calibri" w:hAnsi="Calibri" w:cs="Calibri"/>
-                            <w:sz w:val="16"/>
-                            <w:szCs w:val="16"/>
+                            <w:sz w:val="18"/>
+                            <w:szCs w:val="18"/>
                           </w:rPr>
                           <w:t>62</w:t>
                         </w:r>
@@ -5578,7 +5557,7 @@
                     </w:tc>
                     <w:tc>
                       <w:tcPr>
-                        <w:tcW w:w="440" w:type="dxa"/>
+                        <w:tcW w:w="345" w:type="dxa"/>
                         <w:tcBorders>
                           <w:top w:val="single" w:sz="4" w:space="0" w:color="auto"/>
                           <w:left w:val="single" w:sz="4" w:space="0" w:color="auto"/>
@@ -5601,8 +5580,8 @@
                         <w:r>
                           <w:rPr>
                             <w:rFonts w:ascii="Calibri" w:hAnsi="Calibri" w:cs="Calibri"/>
-                            <w:sz w:val="16"/>
-                            <w:szCs w:val="16"/>
+                            <w:sz w:val="18"/>
+                            <w:szCs w:val="18"/>
                           </w:rPr>
                           <w:t>63</w:t>
                         </w:r>
@@ -5610,7 +5589,7 @@
                     </w:tc>
                     <w:tc>
                       <w:tcPr>
-                        <w:tcW w:w="440" w:type="dxa"/>
+                        <w:tcW w:w="345" w:type="dxa"/>
                         <w:tcBorders>
                           <w:top w:val="single" w:sz="4" w:space="0" w:color="auto"/>
                           <w:left w:val="single" w:sz="4" w:space="0" w:color="auto"/>
@@ -5633,8 +5612,8 @@
                         <w:r>
                           <w:rPr>
                             <w:rFonts w:ascii="Calibri" w:hAnsi="Calibri" w:cs="Calibri"/>
-                            <w:sz w:val="16"/>
-                            <w:szCs w:val="16"/>
+                            <w:sz w:val="18"/>
+                            <w:szCs w:val="18"/>
                           </w:rPr>
                           <w:t>64</w:t>
                         </w:r>
@@ -5642,7 +5621,7 @@
                     </w:tc>
                     <w:tc>
                       <w:tcPr>
-                        <w:tcW w:w="440" w:type="dxa"/>
+                        <w:tcW w:w="345" w:type="dxa"/>
                         <w:tcBorders>
                           <w:top w:val="single" w:sz="4" w:space="0" w:color="auto"/>
                           <w:left w:val="single" w:sz="4" w:space="0" w:color="auto"/>
@@ -5665,8 +5644,8 @@
                         <w:r>
                           <w:rPr>
                             <w:rFonts w:ascii="Calibri" w:hAnsi="Calibri" w:cs="Calibri"/>
-                            <w:sz w:val="16"/>
-                            <w:szCs w:val="16"/>
+                            <w:sz w:val="18"/>
+                            <w:szCs w:val="18"/>
                           </w:rPr>
                           <w:t>65</w:t>
                         </w:r>
@@ -5674,7 +5653,7 @@
                     </w:tc>
                     <w:tc>
                       <w:tcPr>
-                        <w:tcW w:w="440" w:type="dxa"/>
+                        <w:tcW w:w="345" w:type="dxa"/>
                         <w:tcBorders>
                           <w:top w:val="single" w:sz="4" w:space="0" w:color="auto"/>
                           <w:left w:val="single" w:sz="4" w:space="0" w:color="auto"/>
@@ -5697,8 +5676,8 @@
                         <w:r>
                           <w:rPr>
                             <w:rFonts w:ascii="Calibri" w:hAnsi="Calibri" w:cs="Calibri"/>
-                            <w:sz w:val="16"/>
-                            <w:szCs w:val="16"/>
+                            <w:sz w:val="18"/>
+                            <w:szCs w:val="18"/>
                           </w:rPr>
                           <w:t>66</w:t>
                         </w:r>
@@ -5706,7 +5685,7 @@
                     </w:tc>
                     <w:tc>
                       <w:tcPr>
-                        <w:tcW w:w="440" w:type="dxa"/>
+                        <w:tcW w:w="345" w:type="dxa"/>
                         <w:tcBorders>
                           <w:top w:val="single" w:sz="4" w:space="0" w:color="auto"/>
                           <w:left w:val="single" w:sz="4" w:space="0" w:color="auto"/>
@@ -5729,8 +5708,8 @@
                         <w:r>
                           <w:rPr>
                             <w:rFonts w:ascii="Calibri" w:hAnsi="Calibri" w:cs="Calibri"/>
-                            <w:sz w:val="16"/>
-                            <w:szCs w:val="16"/>
+                            <w:sz w:val="18"/>
+                            <w:szCs w:val="18"/>
                           </w:rPr>
                           <w:t>67</w:t>
                         </w:r>
@@ -5738,7 +5717,7 @@
                     </w:tc>
                     <w:tc>
                       <w:tcPr>
-                        <w:tcW w:w="440" w:type="dxa"/>
+                        <w:tcW w:w="345" w:type="dxa"/>
                         <w:tcBorders>
                           <w:top w:val="single" w:sz="4" w:space="0" w:color="auto"/>
                           <w:left w:val="single" w:sz="4" w:space="0" w:color="auto"/>
@@ -5761,8 +5740,8 @@
                         <w:r>
                           <w:rPr>
                             <w:rFonts w:ascii="Calibri" w:hAnsi="Calibri" w:cs="Calibri"/>
-                            <w:sz w:val="16"/>
-                            <w:szCs w:val="16"/>
+                            <w:sz w:val="18"/>
+                            <w:szCs w:val="18"/>
                           </w:rPr>
                           <w:t>68</w:t>
                         </w:r>
@@ -5770,7 +5749,7 @@
                     </w:tc>
                     <w:tc>
                       <w:tcPr>
-                        <w:tcW w:w="440" w:type="dxa"/>
+                        <w:tcW w:w="345" w:type="dxa"/>
                         <w:tcBorders>
                           <w:top w:val="single" w:sz="4" w:space="0" w:color="auto"/>
                           <w:left w:val="single" w:sz="4" w:space="0" w:color="auto"/>
@@ -5793,8 +5772,8 @@
                         <w:r>
                           <w:rPr>
                             <w:rFonts w:ascii="Calibri" w:hAnsi="Calibri" w:cs="Calibri"/>
-                            <w:sz w:val="16"/>
-                            <w:szCs w:val="16"/>
+                            <w:sz w:val="18"/>
+                            <w:szCs w:val="18"/>
                           </w:rPr>
                           <w:t>69</w:t>
                         </w:r>
@@ -5802,7 +5781,7 @@
                     </w:tc>
                     <w:tc>
                       <w:tcPr>
-                        <w:tcW w:w="440" w:type="dxa"/>
+                        <w:tcW w:w="345" w:type="dxa"/>
                         <w:tcBorders>
                           <w:top w:val="single" w:sz="4" w:space="0" w:color="auto"/>
                           <w:left w:val="single" w:sz="4" w:space="0" w:color="auto"/>
@@ -5825,8 +5804,8 @@
                         <w:r>
                           <w:rPr>
                             <w:rFonts w:ascii="Calibri" w:hAnsi="Calibri" w:cs="Calibri"/>
-                            <w:sz w:val="16"/>
-                            <w:szCs w:val="16"/>
+                            <w:sz w:val="18"/>
+                            <w:szCs w:val="18"/>
                           </w:rPr>
                           <w:t>70</w:t>
                         </w:r>
@@ -5835,11 +5814,11 @@
                   </w:tr>
                   <w:tr>
                     <w:trPr>
-                      <w:trHeight w:hRule="exact" w:val="440"/>
+                      <w:trHeight w:hRule="exact" w:val="345"/>
                     </w:trPr>
                     <w:tc>
                       <w:tcPr>
-                        <w:tcW w:w="440" w:type="dxa"/>
+                        <w:tcW w:w="345" w:type="dxa"/>
                         <w:tcBorders>
                           <w:top w:val="single" w:sz="4" w:space="0" w:color="auto"/>
                           <w:left w:val="single" w:sz="4" w:space="0" w:color="auto"/>
@@ -5862,8 +5841,8 @@
                         <w:r>
                           <w:rPr>
                             <w:rFonts w:ascii="Calibri" w:hAnsi="Calibri" w:cs="Calibri"/>
-                            <w:sz w:val="16"/>
-                            <w:szCs w:val="16"/>
+                            <w:sz w:val="18"/>
+                            <w:szCs w:val="18"/>
                           </w:rPr>
                           <w:t>80</w:t>
                         </w:r>
@@ -5871,7 +5850,7 @@
                     </w:tc>
                     <w:tc>
                       <w:tcPr>
-                        <w:tcW w:w="440" w:type="dxa"/>
+                        <w:tcW w:w="345" w:type="dxa"/>
                         <w:tcBorders>
                           <w:top w:val="single" w:sz="4" w:space="0" w:color="auto"/>
                           <w:left w:val="single" w:sz="4" w:space="0" w:color="auto"/>
@@ -5894,8 +5873,8 @@
                         <w:r>
                           <w:rPr>
                             <w:rFonts w:ascii="Calibri" w:hAnsi="Calibri" w:cs="Calibri"/>
-                            <w:sz w:val="16"/>
-                            <w:szCs w:val="16"/>
+                            <w:sz w:val="18"/>
+                            <w:szCs w:val="18"/>
                           </w:rPr>
                           <w:t>79</w:t>
                         </w:r>
@@ -5903,7 +5882,7 @@
                     </w:tc>
                     <w:tc>
                       <w:tcPr>
-                        <w:tcW w:w="440" w:type="dxa"/>
+                        <w:tcW w:w="345" w:type="dxa"/>
                         <w:tcBorders>
                           <w:top w:val="single" w:sz="4" w:space="0" w:color="auto"/>
                           <w:left w:val="single" w:sz="4" w:space="0" w:color="auto"/>
@@ -5926,8 +5905,8 @@
                         <w:r>
                           <w:rPr>
                             <w:rFonts w:ascii="Calibri" w:hAnsi="Calibri" w:cs="Calibri"/>
-                            <w:sz w:val="16"/>
-                            <w:szCs w:val="16"/>
+                            <w:sz w:val="18"/>
+                            <w:szCs w:val="18"/>
                           </w:rPr>
                           <w:t>78</w:t>
                         </w:r>
@@ -5935,7 +5914,7 @@
                     </w:tc>
                     <w:tc>
                       <w:tcPr>
-                        <w:tcW w:w="440" w:type="dxa"/>
+                        <w:tcW w:w="345" w:type="dxa"/>
                         <w:tcBorders>
                           <w:top w:val="single" w:sz="4" w:space="0" w:color="auto"/>
                           <w:left w:val="single" w:sz="4" w:space="0" w:color="auto"/>
@@ -5958,8 +5937,8 @@
                         <w:r>
                           <w:rPr>
                             <w:rFonts w:ascii="Calibri" w:hAnsi="Calibri" w:cs="Calibri"/>
-                            <w:sz w:val="16"/>
-                            <w:szCs w:val="16"/>
+                            <w:sz w:val="18"/>
+                            <w:szCs w:val="18"/>
                           </w:rPr>
                           <w:t>77</w:t>
                         </w:r>
@@ -5967,7 +5946,7 @@
                     </w:tc>
                     <w:tc>
                       <w:tcPr>
-                        <w:tcW w:w="440" w:type="dxa"/>
+                        <w:tcW w:w="345" w:type="dxa"/>
                         <w:tcBorders>
                           <w:top w:val="single" w:sz="4" w:space="0" w:color="auto"/>
                           <w:left w:val="single" w:sz="4" w:space="0" w:color="auto"/>
@@ -5990,8 +5969,8 @@
                         <w:r>
                           <w:rPr>
                             <w:rFonts w:ascii="Calibri" w:hAnsi="Calibri" w:cs="Calibri"/>
-                            <w:sz w:val="16"/>
-                            <w:szCs w:val="16"/>
+                            <w:sz w:val="18"/>
+                            <w:szCs w:val="18"/>
                           </w:rPr>
                           <w:t>76</w:t>
                         </w:r>
@@ -5999,7 +5978,7 @@
                     </w:tc>
                     <w:tc>
                       <w:tcPr>
-                        <w:tcW w:w="440" w:type="dxa"/>
+                        <w:tcW w:w="345" w:type="dxa"/>
                         <w:tcBorders>
                           <w:top w:val="single" w:sz="4" w:space="0" w:color="auto"/>
                           <w:left w:val="single" w:sz="4" w:space="0" w:color="auto"/>
@@ -6022,8 +6001,8 @@
                         <w:r>
                           <w:rPr>
                             <w:rFonts w:ascii="Calibri" w:hAnsi="Calibri" w:cs="Calibri"/>
-                            <w:sz w:val="16"/>
-                            <w:szCs w:val="16"/>
+                            <w:sz w:val="18"/>
+                            <w:szCs w:val="18"/>
                           </w:rPr>
                           <w:t>75</w:t>
                         </w:r>
@@ -6031,7 +6010,7 @@
                     </w:tc>
                     <w:tc>
                       <w:tcPr>
-                        <w:tcW w:w="440" w:type="dxa"/>
+                        <w:tcW w:w="345" w:type="dxa"/>
                         <w:tcBorders>
                           <w:top w:val="single" w:sz="4" w:space="0" w:color="auto"/>
                           <w:left w:val="single" w:sz="4" w:space="0" w:color="auto"/>
@@ -6054,8 +6033,8 @@
                         <w:r>
                           <w:rPr>
                             <w:rFonts w:ascii="Calibri" w:hAnsi="Calibri" w:cs="Calibri"/>
-                            <w:sz w:val="16"/>
-                            <w:szCs w:val="16"/>
+                            <w:sz w:val="18"/>
+                            <w:szCs w:val="18"/>
                           </w:rPr>
                           <w:t>74</w:t>
                         </w:r>
@@ -6063,7 +6042,7 @@
                     </w:tc>
                     <w:tc>
                       <w:tcPr>
-                        <w:tcW w:w="440" w:type="dxa"/>
+                        <w:tcW w:w="345" w:type="dxa"/>
                         <w:tcBorders>
                           <w:top w:val="single" w:sz="4" w:space="0" w:color="auto"/>
                           <w:left w:val="single" w:sz="4" w:space="0" w:color="auto"/>
@@ -6086,8 +6065,8 @@
                         <w:r>
                           <w:rPr>
                             <w:rFonts w:ascii="Calibri" w:hAnsi="Calibri" w:cs="Calibri"/>
-                            <w:sz w:val="16"/>
-                            <w:szCs w:val="16"/>
+                            <w:sz w:val="18"/>
+                            <w:szCs w:val="18"/>
                           </w:rPr>
                           <w:t>73</w:t>
                         </w:r>
@@ -6095,7 +6074,7 @@
                     </w:tc>
                     <w:tc>
                       <w:tcPr>
-                        <w:tcW w:w="440" w:type="dxa"/>
+                        <w:tcW w:w="345" w:type="dxa"/>
                         <w:tcBorders>
                           <w:top w:val="single" w:sz="4" w:space="0" w:color="auto"/>
                           <w:left w:val="single" w:sz="4" w:space="0" w:color="auto"/>
@@ -6118,8 +6097,8 @@
                         <w:r>
                           <w:rPr>
                             <w:rFonts w:ascii="Calibri" w:hAnsi="Calibri" w:cs="Calibri"/>
-                            <w:sz w:val="16"/>
-                            <w:szCs w:val="16"/>
+                            <w:sz w:val="18"/>
+                            <w:szCs w:val="18"/>
                           </w:rPr>
                           <w:t>72</w:t>
                         </w:r>
@@ -6127,7 +6106,7 @@
                     </w:tc>
                     <w:tc>
                       <w:tcPr>
-                        <w:tcW w:w="440" w:type="dxa"/>
+                        <w:tcW w:w="345" w:type="dxa"/>
                         <w:tcBorders>
                           <w:top w:val="single" w:sz="4" w:space="0" w:color="auto"/>
                           <w:left w:val="single" w:sz="4" w:space="0" w:color="auto"/>
@@ -6150,8 +6129,8 @@
                         <w:r>
                           <w:rPr>
                             <w:rFonts w:ascii="Calibri" w:hAnsi="Calibri" w:cs="Calibri"/>
-                            <w:sz w:val="16"/>
-                            <w:szCs w:val="16"/>
+                            <w:sz w:val="18"/>
+                            <w:szCs w:val="18"/>
                           </w:rPr>
                           <w:t>71</w:t>
                         </w:r>
@@ -6160,11 +6139,11 @@
                   </w:tr>
                   <w:tr>
                     <w:trPr>
-                      <w:trHeight w:hRule="exact" w:val="440"/>
+                      <w:trHeight w:hRule="exact" w:val="345"/>
                     </w:trPr>
                     <w:tc>
                       <w:tcPr>
-                        <w:tcW w:w="440" w:type="dxa"/>
+                        <w:tcW w:w="345" w:type="dxa"/>
                         <w:tcBorders>
                           <w:top w:val="single" w:sz="4" w:space="0" w:color="auto"/>
                           <w:left w:val="single" w:sz="4" w:space="0" w:color="auto"/>
@@ -6187,8 +6166,8 @@
                         <w:r>
                           <w:rPr>
                             <w:rFonts w:ascii="Calibri" w:hAnsi="Calibri" w:cs="Calibri"/>
-                            <w:sz w:val="16"/>
-                            <w:szCs w:val="16"/>
+                            <w:sz w:val="18"/>
+                            <w:szCs w:val="18"/>
                           </w:rPr>
                           <w:t>81</w:t>
                         </w:r>
@@ -6196,7 +6175,7 @@
                     </w:tc>
                     <w:tc>
                       <w:tcPr>
-                        <w:tcW w:w="440" w:type="dxa"/>
+                        <w:tcW w:w="345" w:type="dxa"/>
                         <w:tcBorders>
                           <w:top w:val="single" w:sz="4" w:space="0" w:color="auto"/>
                           <w:left w:val="single" w:sz="4" w:space="0" w:color="auto"/>
@@ -6219,8 +6198,8 @@
                         <w:r>
                           <w:rPr>
                             <w:rFonts w:ascii="Calibri" w:hAnsi="Calibri" w:cs="Calibri"/>
-                            <w:sz w:val="16"/>
-                            <w:szCs w:val="16"/>
+                            <w:sz w:val="18"/>
+                            <w:szCs w:val="18"/>
                           </w:rPr>
                           <w:t>82</w:t>
                         </w:r>
@@ -6228,7 +6207,7 @@
                     </w:tc>
                     <w:tc>
                       <w:tcPr>
-                        <w:tcW w:w="440" w:type="dxa"/>
+                        <w:tcW w:w="345" w:type="dxa"/>
                         <w:tcBorders>
                           <w:top w:val="single" w:sz="4" w:space="0" w:color="auto"/>
                           <w:left w:val="single" w:sz="4" w:space="0" w:color="auto"/>
@@ -6251,8 +6230,8 @@
                         <w:r>
                           <w:rPr>
                             <w:rFonts w:ascii="Calibri" w:hAnsi="Calibri" w:cs="Calibri"/>
-                            <w:sz w:val="16"/>
-                            <w:szCs w:val="16"/>
+                            <w:sz w:val="18"/>
+                            <w:szCs w:val="18"/>
                           </w:rPr>
                           <w:t>83</w:t>
                         </w:r>
@@ -6260,7 +6239,7 @@
                     </w:tc>
                     <w:tc>
                       <w:tcPr>
-                        <w:tcW w:w="440" w:type="dxa"/>
+                        <w:tcW w:w="345" w:type="dxa"/>
                         <w:tcBorders>
                           <w:top w:val="single" w:sz="4" w:space="0" w:color="auto"/>
                           <w:left w:val="single" w:sz="4" w:space="0" w:color="auto"/>
@@ -6283,8 +6262,8 @@
                         <w:r>
                           <w:rPr>
                             <w:rFonts w:ascii="Calibri" w:hAnsi="Calibri" w:cs="Calibri"/>
-                            <w:sz w:val="16"/>
-                            <w:szCs w:val="16"/>
+                            <w:sz w:val="18"/>
+                            <w:szCs w:val="18"/>
                           </w:rPr>
                           <w:t>84</w:t>
                         </w:r>
@@ -6292,7 +6271,7 @@
                     </w:tc>
                     <w:tc>
                       <w:tcPr>
-                        <w:tcW w:w="440" w:type="dxa"/>
+                        <w:tcW w:w="345" w:type="dxa"/>
                         <w:tcBorders>
                           <w:top w:val="single" w:sz="4" w:space="0" w:color="auto"/>
                           <w:left w:val="single" w:sz="4" w:space="0" w:color="auto"/>
@@ -6315,8 +6294,8 @@
                         <w:r>
                           <w:rPr>
                             <w:rFonts w:ascii="Calibri" w:hAnsi="Calibri" w:cs="Calibri"/>
-                            <w:sz w:val="16"/>
-                            <w:szCs w:val="16"/>
+                            <w:sz w:val="18"/>
+                            <w:szCs w:val="18"/>
                           </w:rPr>
                           <w:t>85</w:t>
                         </w:r>
@@ -6324,7 +6303,7 @@
                     </w:tc>
                     <w:tc>
                       <w:tcPr>
-                        <w:tcW w:w="440" w:type="dxa"/>
+                        <w:tcW w:w="345" w:type="dxa"/>
                         <w:tcBorders>
                           <w:top w:val="single" w:sz="4" w:space="0" w:color="auto"/>
                           <w:left w:val="single" w:sz="4" w:space="0" w:color="auto"/>
@@ -6347,8 +6326,8 @@
                         <w:r>
                           <w:rPr>
                             <w:rFonts w:ascii="Calibri" w:hAnsi="Calibri" w:cs="Calibri"/>
-                            <w:sz w:val="16"/>
-                            <w:szCs w:val="16"/>
+                            <w:sz w:val="18"/>
+                            <w:szCs w:val="18"/>
                           </w:rPr>
                           <w:t>86</w:t>
                         </w:r>
@@ -6356,7 +6335,7 @@
                     </w:tc>
                     <w:tc>
                       <w:tcPr>
-                        <w:tcW w:w="440" w:type="dxa"/>
+                        <w:tcW w:w="345" w:type="dxa"/>
                         <w:tcBorders>
                           <w:top w:val="single" w:sz="4" w:space="0" w:color="auto"/>
                           <w:left w:val="single" w:sz="4" w:space="0" w:color="auto"/>
@@ -6379,8 +6358,8 @@
                         <w:r>
                           <w:rPr>
                             <w:rFonts w:ascii="Calibri" w:hAnsi="Calibri" w:cs="Calibri"/>
-                            <w:sz w:val="16"/>
-                            <w:szCs w:val="16"/>
+                            <w:sz w:val="18"/>
+                            <w:szCs w:val="18"/>
                           </w:rPr>
                           <w:t>87</w:t>
                         </w:r>
@@ -6388,7 +6367,7 @@
                     </w:tc>
                     <w:tc>
                       <w:tcPr>
-                        <w:tcW w:w="440" w:type="dxa"/>
+                        <w:tcW w:w="345" w:type="dxa"/>
                         <w:tcBorders>
                           <w:top w:val="single" w:sz="4" w:space="0" w:color="auto"/>
                           <w:left w:val="single" w:sz="4" w:space="0" w:color="auto"/>
@@ -6411,8 +6390,8 @@
                         <w:r>
                           <w:rPr>
                             <w:rFonts w:ascii="Calibri" w:hAnsi="Calibri" w:cs="Calibri"/>
-                            <w:sz w:val="16"/>
-                            <w:szCs w:val="16"/>
+                            <w:sz w:val="18"/>
+                            <w:szCs w:val="18"/>
                           </w:rPr>
                           <w:t>88</w:t>
                         </w:r>
@@ -6420,7 +6399,7 @@
                     </w:tc>
                     <w:tc>
                       <w:tcPr>
-                        <w:tcW w:w="440" w:type="dxa"/>
+                        <w:tcW w:w="345" w:type="dxa"/>
                         <w:tcBorders>
                           <w:top w:val="single" w:sz="4" w:space="0" w:color="auto"/>
                           <w:left w:val="single" w:sz="4" w:space="0" w:color="auto"/>
@@ -6443,8 +6422,8 @@
                         <w:r>
                           <w:rPr>
                             <w:rFonts w:ascii="Calibri" w:hAnsi="Calibri" w:cs="Calibri"/>
-                            <w:sz w:val="16"/>
-                            <w:szCs w:val="16"/>
+                            <w:sz w:val="18"/>
+                            <w:szCs w:val="18"/>
                           </w:rPr>
                           <w:t>89</w:t>
                         </w:r>
@@ -6452,7 +6431,7 @@
                     </w:tc>
                     <w:tc>
                       <w:tcPr>
-                        <w:tcW w:w="440" w:type="dxa"/>
+                        <w:tcW w:w="345" w:type="dxa"/>
                         <w:tcBorders>
                           <w:top w:val="single" w:sz="4" w:space="0" w:color="auto"/>
                           <w:left w:val="single" w:sz="4" w:space="0" w:color="auto"/>
@@ -6475,8 +6454,8 @@
                         <w:r>
                           <w:rPr>
                             <w:rFonts w:ascii="Calibri" w:hAnsi="Calibri" w:cs="Calibri"/>
-                            <w:sz w:val="16"/>
-                            <w:szCs w:val="16"/>
+                            <w:sz w:val="18"/>
+                            <w:szCs w:val="18"/>
                           </w:rPr>
                           <w:t>90</w:t>
                         </w:r>
@@ -6485,11 +6464,11 @@
                   </w:tr>
                   <w:tr>
                     <w:trPr>
-                      <w:trHeight w:hRule="exact" w:val="440"/>
+                      <w:trHeight w:hRule="exact" w:val="345"/>
                     </w:trPr>
                     <w:tc>
                       <w:tcPr>
-                        <w:tcW w:w="440" w:type="dxa"/>
+                        <w:tcW w:w="345" w:type="dxa"/>
                         <w:tcBorders>
                           <w:top w:val="single" w:sz="4" w:space="0" w:color="auto"/>
                           <w:left w:val="single" w:sz="4" w:space="0" w:color="auto"/>
@@ -6512,8 +6491,8 @@
                         <w:r>
                           <w:rPr>
                             <w:rFonts w:ascii="Calibri" w:hAnsi="Calibri" w:cs="Calibri"/>
-                            <w:sz w:val="16"/>
-                            <w:szCs w:val="16"/>
+                            <w:sz w:val="18"/>
+                            <w:szCs w:val="18"/>
                           </w:rPr>
                           <w:t>100</w:t>
                         </w:r>
@@ -6521,7 +6500,7 @@
                     </w:tc>
                     <w:tc>
                       <w:tcPr>
-                        <w:tcW w:w="440" w:type="dxa"/>
+                        <w:tcW w:w="345" w:type="dxa"/>
                         <w:tcBorders>
                           <w:top w:val="single" w:sz="4" w:space="0" w:color="auto"/>
                           <w:left w:val="single" w:sz="4" w:space="0" w:color="auto"/>
@@ -6544,8 +6523,8 @@
                         <w:r>
                           <w:rPr>
                             <w:rFonts w:ascii="Calibri" w:hAnsi="Calibri" w:cs="Calibri"/>
-                            <w:sz w:val="16"/>
-                            <w:szCs w:val="16"/>
+                            <w:sz w:val="18"/>
+                            <w:szCs w:val="18"/>
                           </w:rPr>
                           <w:t>99</w:t>
                         </w:r>
@@ -6553,7 +6532,7 @@
                     </w:tc>
                     <w:tc>
                       <w:tcPr>
-                        <w:tcW w:w="440" w:type="dxa"/>
+                        <w:tcW w:w="345" w:type="dxa"/>
                         <w:tcBorders>
                           <w:top w:val="single" w:sz="4" w:space="0" w:color="auto"/>
                           <w:left w:val="single" w:sz="4" w:space="0" w:color="auto"/>
@@ -6576,8 +6555,8 @@
                         <w:r>
                           <w:rPr>
                             <w:rFonts w:ascii="Calibri" w:hAnsi="Calibri" w:cs="Calibri"/>
-                            <w:sz w:val="16"/>
-                            <w:szCs w:val="16"/>
+                            <w:sz w:val="18"/>
+                            <w:szCs w:val="18"/>
                           </w:rPr>
                           <w:t>98</w:t>
                         </w:r>
@@ -6585,7 +6564,7 @@
                     </w:tc>
                     <w:tc>
                       <w:tcPr>
-                        <w:tcW w:w="440" w:type="dxa"/>
+                        <w:tcW w:w="345" w:type="dxa"/>
                         <w:tcBorders>
                           <w:top w:val="single" w:sz="4" w:space="0" w:color="auto"/>
                           <w:left w:val="single" w:sz="4" w:space="0" w:color="auto"/>
@@ -6608,8 +6587,8 @@
                         <w:r>
                           <w:rPr>
                             <w:rFonts w:ascii="Calibri" w:hAnsi="Calibri" w:cs="Calibri"/>
-                            <w:sz w:val="16"/>
-                            <w:szCs w:val="16"/>
+                            <w:sz w:val="18"/>
+                            <w:szCs w:val="18"/>
                           </w:rPr>
                           <w:t>97</w:t>
                         </w:r>
@@ -6617,7 +6596,7 @@
                     </w:tc>
                     <w:tc>
                       <w:tcPr>
-                        <w:tcW w:w="440" w:type="dxa"/>
+                        <w:tcW w:w="345" w:type="dxa"/>
                         <w:tcBorders>
                           <w:top w:val="single" w:sz="4" w:space="0" w:color="auto"/>
                           <w:left w:val="single" w:sz="4" w:space="0" w:color="auto"/>
@@ -6640,8 +6619,8 @@
                         <w:r>
                           <w:rPr>
                             <w:rFonts w:ascii="Calibri" w:hAnsi="Calibri" w:cs="Calibri"/>
-                            <w:sz w:val="16"/>
-                            <w:szCs w:val="16"/>
+                            <w:sz w:val="18"/>
+                            <w:szCs w:val="18"/>
                           </w:rPr>
                           <w:t>96</w:t>
                         </w:r>
@@ -6649,7 +6628,7 @@
                     </w:tc>
                     <w:tc>
                       <w:tcPr>
-                        <w:tcW w:w="440" w:type="dxa"/>
+                        <w:tcW w:w="345" w:type="dxa"/>
                         <w:tcBorders>
                           <w:top w:val="single" w:sz="4" w:space="0" w:color="auto"/>
                           <w:left w:val="single" w:sz="4" w:space="0" w:color="auto"/>
@@ -6672,8 +6651,8 @@
                         <w:r>
                           <w:rPr>
                             <w:rFonts w:ascii="Calibri" w:hAnsi="Calibri" w:cs="Calibri"/>
-                            <w:sz w:val="16"/>
-                            <w:szCs w:val="16"/>
+                            <w:sz w:val="18"/>
+                            <w:szCs w:val="18"/>
                           </w:rPr>
                           <w:t>95</w:t>
                         </w:r>
@@ -6681,7 +6660,7 @@
                     </w:tc>
                     <w:tc>
                       <w:tcPr>
-                        <w:tcW w:w="440" w:type="dxa"/>
+                        <w:tcW w:w="345" w:type="dxa"/>
                         <w:tcBorders>
                           <w:top w:val="single" w:sz="4" w:space="0" w:color="auto"/>
                           <w:left w:val="single" w:sz="4" w:space="0" w:color="auto"/>
@@ -6704,8 +6683,8 @@
                         <w:r>
                           <w:rPr>
                             <w:rFonts w:ascii="Calibri" w:hAnsi="Calibri" w:cs="Calibri"/>
-                            <w:sz w:val="16"/>
-                            <w:szCs w:val="16"/>
+                            <w:sz w:val="18"/>
+                            <w:szCs w:val="18"/>
                           </w:rPr>
                           <w:t>94</w:t>
                         </w:r>
@@ -6713,7 +6692,7 @@
                     </w:tc>
                     <w:tc>
                       <w:tcPr>
-                        <w:tcW w:w="440" w:type="dxa"/>
+                        <w:tcW w:w="345" w:type="dxa"/>
                         <w:tcBorders>
                           <w:top w:val="single" w:sz="4" w:space="0" w:color="auto"/>
                           <w:left w:val="single" w:sz="4" w:space="0" w:color="auto"/>
@@ -6736,8 +6715,8 @@
                         <w:r>
                           <w:rPr>
                             <w:rFonts w:ascii="Calibri" w:hAnsi="Calibri" w:cs="Calibri"/>
-                            <w:sz w:val="16"/>
-                            <w:szCs w:val="16"/>
+                            <w:sz w:val="18"/>
+                            <w:szCs w:val="18"/>
                           </w:rPr>
                           <w:t>93</w:t>
                         </w:r>
@@ -6745,7 +6724,7 @@
                     </w:tc>
                     <w:tc>
                       <w:tcPr>
-                        <w:tcW w:w="440" w:type="dxa"/>
+                        <w:tcW w:w="345" w:type="dxa"/>
                         <w:tcBorders>
                           <w:top w:val="single" w:sz="4" w:space="0" w:color="auto"/>
                           <w:left w:val="single" w:sz="4" w:space="0" w:color="auto"/>
@@ -6768,8 +6747,8 @@
                         <w:r>
                           <w:rPr>
                             <w:rFonts w:ascii="Calibri" w:hAnsi="Calibri" w:cs="Calibri"/>
-                            <w:sz w:val="16"/>
-                            <w:szCs w:val="16"/>
+                            <w:sz w:val="18"/>
+                            <w:szCs w:val="18"/>
                           </w:rPr>
                           <w:t>92</w:t>
                         </w:r>
@@ -6777,7 +6756,7 @@
                     </w:tc>
                     <w:tc>
                       <w:tcPr>
-                        <w:tcW w:w="440" w:type="dxa"/>
+                        <w:tcW w:w="345" w:type="dxa"/>
                         <w:tcBorders>
                           <w:top w:val="single" w:sz="4" w:space="0" w:color="auto"/>
                           <w:left w:val="single" w:sz="4" w:space="0" w:color="auto"/>
@@ -6800,8 +6779,8 @@
                         <w:r>
                           <w:rPr>
                             <w:rFonts w:ascii="Calibri" w:hAnsi="Calibri" w:cs="Calibri"/>
-                            <w:sz w:val="16"/>
-                            <w:szCs w:val="16"/>
+                            <w:sz w:val="18"/>
+                            <w:szCs w:val="18"/>
                           </w:rPr>
                           <w:t>91</w:t>
                         </w:r>
@@ -6811,7 +6790,11 @@
                 </w:tbl>
                 <w:p>
                   <w:pPr>
-                    <w:spacing w:before="0" w:after="0" w:line="240" w:lineRule="auto"/>
+                    <w:spacing w:before="0" w:after="0" w:line="20" w:lineRule="exact"/>
+                    <w:rPr>
+                      <w:sz w:val="2"/>
+                      <w:szCs w:val="2"/>
+                    </w:rPr>
                   </w:pPr>
                 </w:p>
               </w:tc>
@@ -6819,7 +6802,11 @@
           </w:tbl>
           <w:p>
             <w:pPr>
-              <w:spacing w:before="0" w:after="0" w:line="240" w:lineRule="auto"/>
+              <w:spacing w:before="0" w:after="0" w:line="20" w:lineRule="exact"/>
+              <w:rPr>
+                <w:sz w:val="2"/>
+                <w:szCs w:val="2"/>
+              </w:rPr>
             </w:pPr>
           </w:p>
         </w:tc>

</xml_diff>

<commit_message>
Spread the two charts apart and open up room to write
Figure now spans the full width of the blue box: 300-twip end columns and a
2796-twip gutter, so the charts sit near the edges with a clear channel
between them instead of huddling in the middle.

Each question carries 2 inches of blank space beneath it for student work.
Still three pages; the Green task and resource sheet are untouched.

Co-Authored-By: Claude Opus 5 (1M context) <noreply@anthropic.com>
</commit_message>
<xml_diff>
--- a/week-2-listening-questioning/week-2-thinker-doer.docx
+++ b/week-2-listening-questioning/week-2-thinker-doer.docx
@@ -87,7 +87,7 @@
           </w:tcPr>
           <w:tbl>
             <w:tblPr>
-              <w:tblW w:w="7200" w:type="dxa"/>
+              <w:tblW w:w="10296" w:type="dxa"/>
               <w:tblLayout w:type="fixed"/>
               <w:jc w:val="center"/>
               <w:tblBorders>
@@ -106,14 +106,42 @@
               </w:tblCellMar>
             </w:tblPr>
             <w:tblGrid>
+              <w:gridCol w:w="300"/>
+              <w:gridCol w:w="3450"/>
+              <w:gridCol w:w="2796"/>
               <w:gridCol w:w="3450"/>
               <w:gridCol w:w="300"/>
-              <w:gridCol w:w="3450"/>
             </w:tblGrid>
             <w:tr>
               <w:trPr>
                 <w:jc w:val="center"/>
               </w:trPr>
+              <w:tc>
+                <w:tcPr>
+                  <w:tcW w:w="300" w:type="dxa"/>
+                  <w:tcBorders>
+                    <w:top w:val="nil"/>
+                    <w:left w:val="nil"/>
+                    <w:bottom w:val="nil"/>
+                    <w:right w:val="nil"/>
+                  </w:tcBorders>
+                  <w:tcMar>
+                    <w:top w:w="0" w:type="dxa"/>
+                    <w:left w:w="0" w:type="dxa"/>
+                    <w:bottom w:w="0" w:type="dxa"/>
+                    <w:right w:w="0" w:type="dxa"/>
+                  </w:tcMar>
+                </w:tcPr>
+                <w:p>
+                  <w:pPr>
+                    <w:spacing w:before="0" w:after="0" w:line="20" w:lineRule="exact"/>
+                    <w:rPr>
+                      <w:sz w:val="2"/>
+                      <w:szCs w:val="2"/>
+                    </w:rPr>
+                  </w:pPr>
+                </w:p>
+              </w:tc>
               <w:tc>
                 <w:tcPr>
                   <w:tcW w:w="3450" w:type="dxa"/>
@@ -3451,7 +3479,7 @@
               </w:tc>
               <w:tc>
                 <w:tcPr>
-                  <w:tcW w:w="300" w:type="dxa"/>
+                  <w:tcW w:w="2796" w:type="dxa"/>
                   <w:tcBorders>
                     <w:top w:val="nil"/>
                     <w:left w:val="nil"/>
@@ -6798,6 +6826,32 @@
                   </w:pPr>
                 </w:p>
               </w:tc>
+              <w:tc>
+                <w:tcPr>
+                  <w:tcW w:w="300" w:type="dxa"/>
+                  <w:tcBorders>
+                    <w:top w:val="nil"/>
+                    <w:left w:val="nil"/>
+                    <w:bottom w:val="nil"/>
+                    <w:right w:val="nil"/>
+                  </w:tcBorders>
+                  <w:tcMar>
+                    <w:top w:w="0" w:type="dxa"/>
+                    <w:left w:w="0" w:type="dxa"/>
+                    <w:bottom w:w="0" w:type="dxa"/>
+                    <w:right w:w="0" w:type="dxa"/>
+                  </w:tcMar>
+                </w:tcPr>
+                <w:p>
+                  <w:pPr>
+                    <w:spacing w:before="0" w:after="0" w:line="20" w:lineRule="exact"/>
+                    <w:rPr>
+                      <w:sz w:val="2"/>
+                      <w:szCs w:val="2"/>
+                    </w:rPr>
+                  </w:pPr>
+                </w:p>
+              </w:tc>
             </w:tr>
           </w:tbl>
           <w:p>
@@ -6819,7 +6873,7 @@
     </w:p>
     <w:p>
       <w:pPr>
-        <w:spacing w:after="200" w:line="276" w:lineRule="auto"/>
+        <w:spacing w:after="2880" w:line="276" w:lineRule="auto"/>
       </w:pPr>
       <w:r>
         <w:rPr>
@@ -6850,7 +6904,7 @@
     </w:p>
     <w:p>
       <w:pPr>
-        <w:spacing w:after="200" w:line="276" w:lineRule="auto"/>
+        <w:spacing w:after="2880" w:line="276" w:lineRule="auto"/>
       </w:pPr>
       <w:r>
         <w:rPr>

</xml_diff>

<commit_message>
Bring the resource-sheet chart down to 4 inches
Squaring it at the original 1051-twip column width made it 7.3" across --
most of the page. Now 576 twips: 0.4" cells, 4" square, centred.

Co-Authored-By: Claude Opus 5 (1M context) <noreply@anthropic.com>
</commit_message>
<xml_diff>
--- a/week-2-listening-questioning/week-2-thinker-doer.docx
+++ b/week-2-listening-questioning/week-2-thinker-doer.docx
@@ -7232,7 +7232,8 @@
       <w:tblPr>
         <w:tblLayout w:type="fixed"/>
         <w:tblStyle w:val="TableGrid"/>
-        <w:tblW w:w="0" w:type="auto"/>
+        <w:tblW w:w="5760" w:type="dxa"/>
+        <w:jc w:val="center"/>
         <w:tblBorders>
           <w:top w:val="single" w:sz="4" w:space="0" w:color="auto"/>
           <w:left w:val="single" w:sz="4" w:space="0" w:color="auto"/>
@@ -7250,24 +7251,25 @@
         <w:tblLook w:firstRow="1" w:firstColumn="1" w:noVBand="1"/>
       </w:tblPr>
       <w:tblGrid>
-        <w:gridCol w:w="1051"/>
-        <w:gridCol w:w="1051"/>
-        <w:gridCol w:w="1051"/>
-        <w:gridCol w:w="1051"/>
-        <w:gridCol w:w="1051"/>
-        <w:gridCol w:w="1051"/>
-        <w:gridCol w:w="1051"/>
-        <w:gridCol w:w="1051"/>
-        <w:gridCol w:w="1051"/>
-        <w:gridCol w:w="1051"/>
+        <w:gridCol w:w="576"/>
+        <w:gridCol w:w="576"/>
+        <w:gridCol w:w="576"/>
+        <w:gridCol w:w="576"/>
+        <w:gridCol w:w="576"/>
+        <w:gridCol w:w="576"/>
+        <w:gridCol w:w="576"/>
+        <w:gridCol w:w="576"/>
+        <w:gridCol w:w="576"/>
+        <w:gridCol w:w="576"/>
       </w:tblGrid>
       <w:tr>
         <w:trPr>
-          <w:trHeight w:hRule="exact" w:val="1051"/>
+          <w:jc w:val="center"/>
+          <w:trHeight w:hRule="exact" w:val="576"/>
         </w:trPr>
         <w:tc>
           <w:tcPr>
-            <w:tcW w:w="1051" w:type="dxa"/>
+            <w:tcW w:w="576" w:type="dxa"/>
             <w:tcBorders>
               <w:top w:val="single" w:sz="4" w:space="0" w:color="auto"/>
               <w:left w:val="single" w:sz="4" w:space="0" w:color="auto"/>
@@ -7298,7 +7300,7 @@
         </w:tc>
         <w:tc>
           <w:tcPr>
-            <w:tcW w:w="1051" w:type="dxa"/>
+            <w:tcW w:w="576" w:type="dxa"/>
             <w:tcBorders>
               <w:top w:val="single" w:sz="4" w:space="0" w:color="auto"/>
               <w:left w:val="single" w:sz="4" w:space="0" w:color="auto"/>
@@ -7329,7 +7331,7 @@
         </w:tc>
         <w:tc>
           <w:tcPr>
-            <w:tcW w:w="1051" w:type="dxa"/>
+            <w:tcW w:w="576" w:type="dxa"/>
             <w:tcBorders>
               <w:top w:val="single" w:sz="4" w:space="0" w:color="auto"/>
               <w:left w:val="single" w:sz="4" w:space="0" w:color="auto"/>
@@ -7360,7 +7362,7 @@
         </w:tc>
         <w:tc>
           <w:tcPr>
-            <w:tcW w:w="1051" w:type="dxa"/>
+            <w:tcW w:w="576" w:type="dxa"/>
             <w:tcBorders>
               <w:top w:val="single" w:sz="4" w:space="0" w:color="auto"/>
               <w:left w:val="single" w:sz="4" w:space="0" w:color="auto"/>
@@ -7391,7 +7393,7 @@
         </w:tc>
         <w:tc>
           <w:tcPr>
-            <w:tcW w:w="1051" w:type="dxa"/>
+            <w:tcW w:w="576" w:type="dxa"/>
             <w:tcBorders>
               <w:top w:val="single" w:sz="4" w:space="0" w:color="auto"/>
               <w:left w:val="single" w:sz="4" w:space="0" w:color="auto"/>
@@ -7422,7 +7424,7 @@
         </w:tc>
         <w:tc>
           <w:tcPr>
-            <w:tcW w:w="1051" w:type="dxa"/>
+            <w:tcW w:w="576" w:type="dxa"/>
             <w:tcBorders>
               <w:top w:val="single" w:sz="4" w:space="0" w:color="auto"/>
               <w:left w:val="single" w:sz="4" w:space="0" w:color="auto"/>
@@ -7453,7 +7455,7 @@
         </w:tc>
         <w:tc>
           <w:tcPr>
-            <w:tcW w:w="1051" w:type="dxa"/>
+            <w:tcW w:w="576" w:type="dxa"/>
             <w:tcBorders>
               <w:top w:val="single" w:sz="4" w:space="0" w:color="auto"/>
               <w:left w:val="single" w:sz="4" w:space="0" w:color="auto"/>
@@ -7484,7 +7486,7 @@
         </w:tc>
         <w:tc>
           <w:tcPr>
-            <w:tcW w:w="1051" w:type="dxa"/>
+            <w:tcW w:w="576" w:type="dxa"/>
             <w:tcBorders>
               <w:top w:val="single" w:sz="4" w:space="0" w:color="auto"/>
               <w:left w:val="single" w:sz="4" w:space="0" w:color="auto"/>
@@ -7515,7 +7517,7 @@
         </w:tc>
         <w:tc>
           <w:tcPr>
-            <w:tcW w:w="1051" w:type="dxa"/>
+            <w:tcW w:w="576" w:type="dxa"/>
             <w:tcBorders>
               <w:top w:val="single" w:sz="4" w:space="0" w:color="auto"/>
               <w:left w:val="single" w:sz="4" w:space="0" w:color="auto"/>
@@ -7546,7 +7548,7 @@
         </w:tc>
         <w:tc>
           <w:tcPr>
-            <w:tcW w:w="1051" w:type="dxa"/>
+            <w:tcW w:w="576" w:type="dxa"/>
             <w:tcBorders>
               <w:top w:val="single" w:sz="4" w:space="0" w:color="auto"/>
               <w:left w:val="single" w:sz="4" w:space="0" w:color="auto"/>
@@ -7578,11 +7580,12 @@
       </w:tr>
       <w:tr>
         <w:trPr>
-          <w:trHeight w:hRule="exact" w:val="1051"/>
+          <w:jc w:val="center"/>
+          <w:trHeight w:hRule="exact" w:val="576"/>
         </w:trPr>
         <w:tc>
           <w:tcPr>
-            <w:tcW w:w="1051" w:type="dxa"/>
+            <w:tcW w:w="576" w:type="dxa"/>
             <w:tcBorders>
               <w:top w:val="single" w:sz="4" w:space="0" w:color="auto"/>
               <w:left w:val="single" w:sz="4" w:space="0" w:color="auto"/>
@@ -7613,7 +7616,7 @@
         </w:tc>
         <w:tc>
           <w:tcPr>
-            <w:tcW w:w="1051" w:type="dxa"/>
+            <w:tcW w:w="576" w:type="dxa"/>
             <w:tcBorders>
               <w:top w:val="single" w:sz="4" w:space="0" w:color="auto"/>
               <w:left w:val="single" w:sz="4" w:space="0" w:color="auto"/>
@@ -7644,7 +7647,7 @@
         </w:tc>
         <w:tc>
           <w:tcPr>
-            <w:tcW w:w="1051" w:type="dxa"/>
+            <w:tcW w:w="576" w:type="dxa"/>
             <w:tcBorders>
               <w:top w:val="single" w:sz="4" w:space="0" w:color="auto"/>
               <w:left w:val="single" w:sz="4" w:space="0" w:color="auto"/>
@@ -7675,7 +7678,7 @@
         </w:tc>
         <w:tc>
           <w:tcPr>
-            <w:tcW w:w="1051" w:type="dxa"/>
+            <w:tcW w:w="576" w:type="dxa"/>
             <w:tcBorders>
               <w:top w:val="single" w:sz="4" w:space="0" w:color="auto"/>
               <w:left w:val="single" w:sz="4" w:space="0" w:color="auto"/>
@@ -7706,7 +7709,7 @@
         </w:tc>
         <w:tc>
           <w:tcPr>
-            <w:tcW w:w="1051" w:type="dxa"/>
+            <w:tcW w:w="576" w:type="dxa"/>
             <w:tcBorders>
               <w:top w:val="single" w:sz="4" w:space="0" w:color="auto"/>
               <w:left w:val="single" w:sz="4" w:space="0" w:color="auto"/>
@@ -7737,7 +7740,7 @@
         </w:tc>
         <w:tc>
           <w:tcPr>
-            <w:tcW w:w="1051" w:type="dxa"/>
+            <w:tcW w:w="576" w:type="dxa"/>
             <w:tcBorders>
               <w:top w:val="single" w:sz="4" w:space="0" w:color="auto"/>
               <w:left w:val="single" w:sz="4" w:space="0" w:color="auto"/>
@@ -7768,7 +7771,7 @@
         </w:tc>
         <w:tc>
           <w:tcPr>
-            <w:tcW w:w="1051" w:type="dxa"/>
+            <w:tcW w:w="576" w:type="dxa"/>
             <w:tcBorders>
               <w:top w:val="single" w:sz="4" w:space="0" w:color="auto"/>
               <w:left w:val="single" w:sz="4" w:space="0" w:color="auto"/>
@@ -7799,7 +7802,7 @@
         </w:tc>
         <w:tc>
           <w:tcPr>
-            <w:tcW w:w="1051" w:type="dxa"/>
+            <w:tcW w:w="576" w:type="dxa"/>
             <w:tcBorders>
               <w:top w:val="single" w:sz="4" w:space="0" w:color="auto"/>
               <w:left w:val="single" w:sz="4" w:space="0" w:color="auto"/>
@@ -7830,7 +7833,7 @@
         </w:tc>
         <w:tc>
           <w:tcPr>
-            <w:tcW w:w="1051" w:type="dxa"/>
+            <w:tcW w:w="576" w:type="dxa"/>
             <w:tcBorders>
               <w:top w:val="single" w:sz="4" w:space="0" w:color="auto"/>
               <w:left w:val="single" w:sz="4" w:space="0" w:color="auto"/>
@@ -7861,7 +7864,7 @@
         </w:tc>
         <w:tc>
           <w:tcPr>
-            <w:tcW w:w="1051" w:type="dxa"/>
+            <w:tcW w:w="576" w:type="dxa"/>
             <w:tcBorders>
               <w:top w:val="single" w:sz="4" w:space="0" w:color="auto"/>
               <w:left w:val="single" w:sz="4" w:space="0" w:color="auto"/>
@@ -7893,11 +7896,12 @@
       </w:tr>
       <w:tr>
         <w:trPr>
-          <w:trHeight w:hRule="exact" w:val="1051"/>
+          <w:jc w:val="center"/>
+          <w:trHeight w:hRule="exact" w:val="576"/>
         </w:trPr>
         <w:tc>
           <w:tcPr>
-            <w:tcW w:w="1051" w:type="dxa"/>
+            <w:tcW w:w="576" w:type="dxa"/>
             <w:tcBorders>
               <w:top w:val="single" w:sz="4" w:space="0" w:color="auto"/>
               <w:left w:val="single" w:sz="4" w:space="0" w:color="auto"/>
@@ -7928,7 +7932,7 @@
         </w:tc>
         <w:tc>
           <w:tcPr>
-            <w:tcW w:w="1051" w:type="dxa"/>
+            <w:tcW w:w="576" w:type="dxa"/>
             <w:tcBorders>
               <w:top w:val="single" w:sz="4" w:space="0" w:color="auto"/>
               <w:left w:val="single" w:sz="4" w:space="0" w:color="auto"/>
@@ -7959,7 +7963,7 @@
         </w:tc>
         <w:tc>
           <w:tcPr>
-            <w:tcW w:w="1051" w:type="dxa"/>
+            <w:tcW w:w="576" w:type="dxa"/>
             <w:tcBorders>
               <w:top w:val="single" w:sz="4" w:space="0" w:color="auto"/>
               <w:left w:val="single" w:sz="4" w:space="0" w:color="auto"/>
@@ -7990,7 +7994,7 @@
         </w:tc>
         <w:tc>
           <w:tcPr>
-            <w:tcW w:w="1051" w:type="dxa"/>
+            <w:tcW w:w="576" w:type="dxa"/>
             <w:tcBorders>
               <w:top w:val="single" w:sz="4" w:space="0" w:color="auto"/>
               <w:left w:val="single" w:sz="4" w:space="0" w:color="auto"/>
@@ -8021,7 +8025,7 @@
         </w:tc>
         <w:tc>
           <w:tcPr>
-            <w:tcW w:w="1051" w:type="dxa"/>
+            <w:tcW w:w="576" w:type="dxa"/>
             <w:tcBorders>
               <w:top w:val="single" w:sz="4" w:space="0" w:color="auto"/>
               <w:left w:val="single" w:sz="4" w:space="0" w:color="auto"/>
@@ -8052,7 +8056,7 @@
         </w:tc>
         <w:tc>
           <w:tcPr>
-            <w:tcW w:w="1051" w:type="dxa"/>
+            <w:tcW w:w="576" w:type="dxa"/>
             <w:tcBorders>
               <w:top w:val="single" w:sz="4" w:space="0" w:color="auto"/>
               <w:left w:val="single" w:sz="4" w:space="0" w:color="auto"/>
@@ -8083,7 +8087,7 @@
         </w:tc>
         <w:tc>
           <w:tcPr>
-            <w:tcW w:w="1051" w:type="dxa"/>
+            <w:tcW w:w="576" w:type="dxa"/>
             <w:tcBorders>
               <w:top w:val="single" w:sz="4" w:space="0" w:color="auto"/>
               <w:left w:val="single" w:sz="4" w:space="0" w:color="auto"/>
@@ -8114,7 +8118,7 @@
         </w:tc>
         <w:tc>
           <w:tcPr>
-            <w:tcW w:w="1051" w:type="dxa"/>
+            <w:tcW w:w="576" w:type="dxa"/>
             <w:tcBorders>
               <w:top w:val="single" w:sz="4" w:space="0" w:color="auto"/>
               <w:left w:val="single" w:sz="4" w:space="0" w:color="auto"/>
@@ -8145,7 +8149,7 @@
         </w:tc>
         <w:tc>
           <w:tcPr>
-            <w:tcW w:w="1051" w:type="dxa"/>
+            <w:tcW w:w="576" w:type="dxa"/>
             <w:tcBorders>
               <w:top w:val="single" w:sz="4" w:space="0" w:color="auto"/>
               <w:left w:val="single" w:sz="4" w:space="0" w:color="auto"/>
@@ -8176,7 +8180,7 @@
         </w:tc>
         <w:tc>
           <w:tcPr>
-            <w:tcW w:w="1051" w:type="dxa"/>
+            <w:tcW w:w="576" w:type="dxa"/>
             <w:tcBorders>
               <w:top w:val="single" w:sz="4" w:space="0" w:color="auto"/>
               <w:left w:val="single" w:sz="4" w:space="0" w:color="auto"/>
@@ -8208,11 +8212,12 @@
       </w:tr>
       <w:tr>
         <w:trPr>
-          <w:trHeight w:hRule="exact" w:val="1051"/>
+          <w:jc w:val="center"/>
+          <w:trHeight w:hRule="exact" w:val="576"/>
         </w:trPr>
         <w:tc>
           <w:tcPr>
-            <w:tcW w:w="1051" w:type="dxa"/>
+            <w:tcW w:w="576" w:type="dxa"/>
             <w:tcBorders>
               <w:top w:val="single" w:sz="4" w:space="0" w:color="auto"/>
               <w:left w:val="single" w:sz="4" w:space="0" w:color="auto"/>
@@ -8243,7 +8248,7 @@
         </w:tc>
         <w:tc>
           <w:tcPr>
-            <w:tcW w:w="1051" w:type="dxa"/>
+            <w:tcW w:w="576" w:type="dxa"/>
             <w:tcBorders>
               <w:top w:val="single" w:sz="4" w:space="0" w:color="auto"/>
               <w:left w:val="single" w:sz="4" w:space="0" w:color="auto"/>
@@ -8274,7 +8279,7 @@
         </w:tc>
         <w:tc>
           <w:tcPr>
-            <w:tcW w:w="1051" w:type="dxa"/>
+            <w:tcW w:w="576" w:type="dxa"/>
             <w:tcBorders>
               <w:top w:val="single" w:sz="4" w:space="0" w:color="auto"/>
               <w:left w:val="single" w:sz="4" w:space="0" w:color="auto"/>
@@ -8305,7 +8310,7 @@
         </w:tc>
         <w:tc>
           <w:tcPr>
-            <w:tcW w:w="1051" w:type="dxa"/>
+            <w:tcW w:w="576" w:type="dxa"/>
             <w:tcBorders>
               <w:top w:val="single" w:sz="4" w:space="0" w:color="auto"/>
               <w:left w:val="single" w:sz="4" w:space="0" w:color="auto"/>
@@ -8336,7 +8341,7 @@
         </w:tc>
         <w:tc>
           <w:tcPr>
-            <w:tcW w:w="1051" w:type="dxa"/>
+            <w:tcW w:w="576" w:type="dxa"/>
             <w:tcBorders>
               <w:top w:val="single" w:sz="4" w:space="0" w:color="auto"/>
               <w:left w:val="single" w:sz="4" w:space="0" w:color="auto"/>
@@ -8367,7 +8372,7 @@
         </w:tc>
         <w:tc>
           <w:tcPr>
-            <w:tcW w:w="1051" w:type="dxa"/>
+            <w:tcW w:w="576" w:type="dxa"/>
             <w:tcBorders>
               <w:top w:val="single" w:sz="4" w:space="0" w:color="auto"/>
               <w:left w:val="single" w:sz="4" w:space="0" w:color="auto"/>
@@ -8398,7 +8403,7 @@
         </w:tc>
         <w:tc>
           <w:tcPr>
-            <w:tcW w:w="1051" w:type="dxa"/>
+            <w:tcW w:w="576" w:type="dxa"/>
             <w:tcBorders>
               <w:top w:val="single" w:sz="4" w:space="0" w:color="auto"/>
               <w:left w:val="single" w:sz="4" w:space="0" w:color="auto"/>
@@ -8429,7 +8434,7 @@
         </w:tc>
         <w:tc>
           <w:tcPr>
-            <w:tcW w:w="1051" w:type="dxa"/>
+            <w:tcW w:w="576" w:type="dxa"/>
             <w:tcBorders>
               <w:top w:val="single" w:sz="4" w:space="0" w:color="auto"/>
               <w:left w:val="single" w:sz="4" w:space="0" w:color="auto"/>
@@ -8460,7 +8465,7 @@
         </w:tc>
         <w:tc>
           <w:tcPr>
-            <w:tcW w:w="1051" w:type="dxa"/>
+            <w:tcW w:w="576" w:type="dxa"/>
             <w:tcBorders>
               <w:top w:val="single" w:sz="4" w:space="0" w:color="auto"/>
               <w:left w:val="single" w:sz="4" w:space="0" w:color="auto"/>
@@ -8491,7 +8496,7 @@
         </w:tc>
         <w:tc>
           <w:tcPr>
-            <w:tcW w:w="1051" w:type="dxa"/>
+            <w:tcW w:w="576" w:type="dxa"/>
             <w:tcBorders>
               <w:top w:val="single" w:sz="4" w:space="0" w:color="auto"/>
               <w:left w:val="single" w:sz="4" w:space="0" w:color="auto"/>
@@ -8523,11 +8528,12 @@
       </w:tr>
       <w:tr>
         <w:trPr>
-          <w:trHeight w:hRule="exact" w:val="1051"/>
+          <w:jc w:val="center"/>
+          <w:trHeight w:hRule="exact" w:val="576"/>
         </w:trPr>
         <w:tc>
           <w:tcPr>
-            <w:tcW w:w="1051" w:type="dxa"/>
+            <w:tcW w:w="576" w:type="dxa"/>
             <w:tcBorders>
               <w:top w:val="single" w:sz="4" w:space="0" w:color="auto"/>
               <w:left w:val="single" w:sz="4" w:space="0" w:color="auto"/>
@@ -8558,7 +8564,7 @@
         </w:tc>
         <w:tc>
           <w:tcPr>
-            <w:tcW w:w="1051" w:type="dxa"/>
+            <w:tcW w:w="576" w:type="dxa"/>
             <w:tcBorders>
               <w:top w:val="single" w:sz="4" w:space="0" w:color="auto"/>
               <w:left w:val="single" w:sz="4" w:space="0" w:color="auto"/>
@@ -8589,7 +8595,7 @@
         </w:tc>
         <w:tc>
           <w:tcPr>
-            <w:tcW w:w="1051" w:type="dxa"/>
+            <w:tcW w:w="576" w:type="dxa"/>
             <w:tcBorders>
               <w:top w:val="single" w:sz="4" w:space="0" w:color="auto"/>
               <w:left w:val="single" w:sz="4" w:space="0" w:color="auto"/>
@@ -8620,7 +8626,7 @@
         </w:tc>
         <w:tc>
           <w:tcPr>
-            <w:tcW w:w="1051" w:type="dxa"/>
+            <w:tcW w:w="576" w:type="dxa"/>
             <w:tcBorders>
               <w:top w:val="single" w:sz="4" w:space="0" w:color="auto"/>
               <w:left w:val="single" w:sz="4" w:space="0" w:color="auto"/>
@@ -8651,7 +8657,7 @@
         </w:tc>
         <w:tc>
           <w:tcPr>
-            <w:tcW w:w="1051" w:type="dxa"/>
+            <w:tcW w:w="576" w:type="dxa"/>
             <w:tcBorders>
               <w:top w:val="single" w:sz="4" w:space="0" w:color="auto"/>
               <w:left w:val="single" w:sz="4" w:space="0" w:color="auto"/>
@@ -8682,7 +8688,7 @@
         </w:tc>
         <w:tc>
           <w:tcPr>
-            <w:tcW w:w="1051" w:type="dxa"/>
+            <w:tcW w:w="576" w:type="dxa"/>
             <w:tcBorders>
               <w:top w:val="single" w:sz="4" w:space="0" w:color="auto"/>
               <w:left w:val="single" w:sz="4" w:space="0" w:color="auto"/>
@@ -8713,7 +8719,7 @@
         </w:tc>
         <w:tc>
           <w:tcPr>
-            <w:tcW w:w="1051" w:type="dxa"/>
+            <w:tcW w:w="576" w:type="dxa"/>
             <w:tcBorders>
               <w:top w:val="single" w:sz="4" w:space="0" w:color="auto"/>
               <w:left w:val="single" w:sz="4" w:space="0" w:color="auto"/>
@@ -8744,7 +8750,7 @@
         </w:tc>
         <w:tc>
           <w:tcPr>
-            <w:tcW w:w="1051" w:type="dxa"/>
+            <w:tcW w:w="576" w:type="dxa"/>
             <w:tcBorders>
               <w:top w:val="single" w:sz="4" w:space="0" w:color="auto"/>
               <w:left w:val="single" w:sz="4" w:space="0" w:color="auto"/>
@@ -8775,7 +8781,7 @@
         </w:tc>
         <w:tc>
           <w:tcPr>
-            <w:tcW w:w="1051" w:type="dxa"/>
+            <w:tcW w:w="576" w:type="dxa"/>
             <w:tcBorders>
               <w:top w:val="single" w:sz="4" w:space="0" w:color="auto"/>
               <w:left w:val="single" w:sz="4" w:space="0" w:color="auto"/>
@@ -8806,7 +8812,7 @@
         </w:tc>
         <w:tc>
           <w:tcPr>
-            <w:tcW w:w="1051" w:type="dxa"/>
+            <w:tcW w:w="576" w:type="dxa"/>
             <w:tcBorders>
               <w:top w:val="single" w:sz="4" w:space="0" w:color="auto"/>
               <w:left w:val="single" w:sz="4" w:space="0" w:color="auto"/>
@@ -8838,11 +8844,12 @@
       </w:tr>
       <w:tr>
         <w:trPr>
-          <w:trHeight w:hRule="exact" w:val="1051"/>
+          <w:jc w:val="center"/>
+          <w:trHeight w:hRule="exact" w:val="576"/>
         </w:trPr>
         <w:tc>
           <w:tcPr>
-            <w:tcW w:w="1051" w:type="dxa"/>
+            <w:tcW w:w="576" w:type="dxa"/>
             <w:tcBorders>
               <w:top w:val="single" w:sz="4" w:space="0" w:color="auto"/>
               <w:left w:val="single" w:sz="4" w:space="0" w:color="auto"/>
@@ -8873,7 +8880,7 @@
         </w:tc>
         <w:tc>
           <w:tcPr>
-            <w:tcW w:w="1051" w:type="dxa"/>
+            <w:tcW w:w="576" w:type="dxa"/>
             <w:tcBorders>
               <w:top w:val="single" w:sz="4" w:space="0" w:color="auto"/>
               <w:left w:val="single" w:sz="4" w:space="0" w:color="auto"/>
@@ -8904,7 +8911,7 @@
         </w:tc>
         <w:tc>
           <w:tcPr>
-            <w:tcW w:w="1051" w:type="dxa"/>
+            <w:tcW w:w="576" w:type="dxa"/>
             <w:tcBorders>
               <w:top w:val="single" w:sz="4" w:space="0" w:color="auto"/>
               <w:left w:val="single" w:sz="4" w:space="0" w:color="auto"/>
@@ -8935,7 +8942,7 @@
         </w:tc>
         <w:tc>
           <w:tcPr>
-            <w:tcW w:w="1051" w:type="dxa"/>
+            <w:tcW w:w="576" w:type="dxa"/>
             <w:tcBorders>
               <w:top w:val="single" w:sz="4" w:space="0" w:color="auto"/>
               <w:left w:val="single" w:sz="4" w:space="0" w:color="auto"/>
@@ -8966,7 +8973,7 @@
         </w:tc>
         <w:tc>
           <w:tcPr>
-            <w:tcW w:w="1051" w:type="dxa"/>
+            <w:tcW w:w="576" w:type="dxa"/>
             <w:tcBorders>
               <w:top w:val="single" w:sz="4" w:space="0" w:color="auto"/>
               <w:left w:val="single" w:sz="4" w:space="0" w:color="auto"/>
@@ -8997,7 +9004,7 @@
         </w:tc>
         <w:tc>
           <w:tcPr>
-            <w:tcW w:w="1051" w:type="dxa"/>
+            <w:tcW w:w="576" w:type="dxa"/>
             <w:tcBorders>
               <w:top w:val="single" w:sz="4" w:space="0" w:color="auto"/>
               <w:left w:val="single" w:sz="4" w:space="0" w:color="auto"/>
@@ -9028,7 +9035,7 @@
         </w:tc>
         <w:tc>
           <w:tcPr>
-            <w:tcW w:w="1051" w:type="dxa"/>
+            <w:tcW w:w="576" w:type="dxa"/>
             <w:tcBorders>
               <w:top w:val="single" w:sz="4" w:space="0" w:color="auto"/>
               <w:left w:val="single" w:sz="4" w:space="0" w:color="auto"/>
@@ -9059,7 +9066,7 @@
         </w:tc>
         <w:tc>
           <w:tcPr>
-            <w:tcW w:w="1051" w:type="dxa"/>
+            <w:tcW w:w="576" w:type="dxa"/>
             <w:tcBorders>
               <w:top w:val="single" w:sz="4" w:space="0" w:color="auto"/>
               <w:left w:val="single" w:sz="4" w:space="0" w:color="auto"/>
@@ -9090,7 +9097,7 @@
         </w:tc>
         <w:tc>
           <w:tcPr>
-            <w:tcW w:w="1051" w:type="dxa"/>
+            <w:tcW w:w="576" w:type="dxa"/>
             <w:tcBorders>
               <w:top w:val="single" w:sz="4" w:space="0" w:color="auto"/>
               <w:left w:val="single" w:sz="4" w:space="0" w:color="auto"/>
@@ -9121,7 +9128,7 @@
         </w:tc>
         <w:tc>
           <w:tcPr>
-            <w:tcW w:w="1051" w:type="dxa"/>
+            <w:tcW w:w="576" w:type="dxa"/>
             <w:tcBorders>
               <w:top w:val="single" w:sz="4" w:space="0" w:color="auto"/>
               <w:left w:val="single" w:sz="4" w:space="0" w:color="auto"/>
@@ -9153,11 +9160,12 @@
       </w:tr>
       <w:tr>
         <w:trPr>
-          <w:trHeight w:hRule="exact" w:val="1051"/>
+          <w:jc w:val="center"/>
+          <w:trHeight w:hRule="exact" w:val="576"/>
         </w:trPr>
         <w:tc>
           <w:tcPr>
-            <w:tcW w:w="1051" w:type="dxa"/>
+            <w:tcW w:w="576" w:type="dxa"/>
             <w:tcBorders>
               <w:top w:val="single" w:sz="4" w:space="0" w:color="auto"/>
               <w:left w:val="single" w:sz="4" w:space="0" w:color="auto"/>
@@ -9188,7 +9196,7 @@
         </w:tc>
         <w:tc>
           <w:tcPr>
-            <w:tcW w:w="1051" w:type="dxa"/>
+            <w:tcW w:w="576" w:type="dxa"/>
             <w:tcBorders>
               <w:top w:val="single" w:sz="4" w:space="0" w:color="auto"/>
               <w:left w:val="single" w:sz="4" w:space="0" w:color="auto"/>
@@ -9219,7 +9227,7 @@
         </w:tc>
         <w:tc>
           <w:tcPr>
-            <w:tcW w:w="1051" w:type="dxa"/>
+            <w:tcW w:w="576" w:type="dxa"/>
             <w:tcBorders>
               <w:top w:val="single" w:sz="4" w:space="0" w:color="auto"/>
               <w:left w:val="single" w:sz="4" w:space="0" w:color="auto"/>
@@ -9250,7 +9258,7 @@
         </w:tc>
         <w:tc>
           <w:tcPr>
-            <w:tcW w:w="1051" w:type="dxa"/>
+            <w:tcW w:w="576" w:type="dxa"/>
             <w:tcBorders>
               <w:top w:val="single" w:sz="4" w:space="0" w:color="auto"/>
               <w:left w:val="single" w:sz="4" w:space="0" w:color="auto"/>
@@ -9281,7 +9289,7 @@
         </w:tc>
         <w:tc>
           <w:tcPr>
-            <w:tcW w:w="1051" w:type="dxa"/>
+            <w:tcW w:w="576" w:type="dxa"/>
             <w:tcBorders>
               <w:top w:val="single" w:sz="4" w:space="0" w:color="auto"/>
               <w:left w:val="single" w:sz="4" w:space="0" w:color="auto"/>
@@ -9312,7 +9320,7 @@
         </w:tc>
         <w:tc>
           <w:tcPr>
-            <w:tcW w:w="1051" w:type="dxa"/>
+            <w:tcW w:w="576" w:type="dxa"/>
             <w:tcBorders>
               <w:top w:val="single" w:sz="4" w:space="0" w:color="auto"/>
               <w:left w:val="single" w:sz="4" w:space="0" w:color="auto"/>
@@ -9343,7 +9351,7 @@
         </w:tc>
         <w:tc>
           <w:tcPr>
-            <w:tcW w:w="1051" w:type="dxa"/>
+            <w:tcW w:w="576" w:type="dxa"/>
             <w:tcBorders>
               <w:top w:val="single" w:sz="4" w:space="0" w:color="auto"/>
               <w:left w:val="single" w:sz="4" w:space="0" w:color="auto"/>
@@ -9374,7 +9382,7 @@
         </w:tc>
         <w:tc>
           <w:tcPr>
-            <w:tcW w:w="1051" w:type="dxa"/>
+            <w:tcW w:w="576" w:type="dxa"/>
             <w:tcBorders>
               <w:top w:val="single" w:sz="4" w:space="0" w:color="auto"/>
               <w:left w:val="single" w:sz="4" w:space="0" w:color="auto"/>
@@ -9405,7 +9413,7 @@
         </w:tc>
         <w:tc>
           <w:tcPr>
-            <w:tcW w:w="1051" w:type="dxa"/>
+            <w:tcW w:w="576" w:type="dxa"/>
             <w:tcBorders>
               <w:top w:val="single" w:sz="4" w:space="0" w:color="auto"/>
               <w:left w:val="single" w:sz="4" w:space="0" w:color="auto"/>
@@ -9436,7 +9444,7 @@
         </w:tc>
         <w:tc>
           <w:tcPr>
-            <w:tcW w:w="1051" w:type="dxa"/>
+            <w:tcW w:w="576" w:type="dxa"/>
             <w:tcBorders>
               <w:top w:val="single" w:sz="4" w:space="0" w:color="auto"/>
               <w:left w:val="single" w:sz="4" w:space="0" w:color="auto"/>
@@ -9468,11 +9476,12 @@
       </w:tr>
       <w:tr>
         <w:trPr>
-          <w:trHeight w:hRule="exact" w:val="1051"/>
+          <w:jc w:val="center"/>
+          <w:trHeight w:hRule="exact" w:val="576"/>
         </w:trPr>
         <w:tc>
           <w:tcPr>
-            <w:tcW w:w="1051" w:type="dxa"/>
+            <w:tcW w:w="576" w:type="dxa"/>
             <w:tcBorders>
               <w:top w:val="single" w:sz="4" w:space="0" w:color="auto"/>
               <w:left w:val="single" w:sz="4" w:space="0" w:color="auto"/>
@@ -9503,7 +9512,7 @@
         </w:tc>
         <w:tc>
           <w:tcPr>
-            <w:tcW w:w="1051" w:type="dxa"/>
+            <w:tcW w:w="576" w:type="dxa"/>
             <w:tcBorders>
               <w:top w:val="single" w:sz="4" w:space="0" w:color="auto"/>
               <w:left w:val="single" w:sz="4" w:space="0" w:color="auto"/>
@@ -9534,7 +9543,7 @@
         </w:tc>
         <w:tc>
           <w:tcPr>
-            <w:tcW w:w="1051" w:type="dxa"/>
+            <w:tcW w:w="576" w:type="dxa"/>
             <w:tcBorders>
               <w:top w:val="single" w:sz="4" w:space="0" w:color="auto"/>
               <w:left w:val="single" w:sz="4" w:space="0" w:color="auto"/>
@@ -9565,7 +9574,7 @@
         </w:tc>
         <w:tc>
           <w:tcPr>
-            <w:tcW w:w="1051" w:type="dxa"/>
+            <w:tcW w:w="576" w:type="dxa"/>
             <w:tcBorders>
               <w:top w:val="single" w:sz="4" w:space="0" w:color="auto"/>
               <w:left w:val="single" w:sz="4" w:space="0" w:color="auto"/>
@@ -9596,7 +9605,7 @@
         </w:tc>
         <w:tc>
           <w:tcPr>
-            <w:tcW w:w="1051" w:type="dxa"/>
+            <w:tcW w:w="576" w:type="dxa"/>
             <w:tcBorders>
               <w:top w:val="single" w:sz="4" w:space="0" w:color="auto"/>
               <w:left w:val="single" w:sz="4" w:space="0" w:color="auto"/>
@@ -9627,7 +9636,7 @@
         </w:tc>
         <w:tc>
           <w:tcPr>
-            <w:tcW w:w="1051" w:type="dxa"/>
+            <w:tcW w:w="576" w:type="dxa"/>
             <w:tcBorders>
               <w:top w:val="single" w:sz="4" w:space="0" w:color="auto"/>
               <w:left w:val="single" w:sz="4" w:space="0" w:color="auto"/>
@@ -9658,7 +9667,7 @@
         </w:tc>
         <w:tc>
           <w:tcPr>
-            <w:tcW w:w="1051" w:type="dxa"/>
+            <w:tcW w:w="576" w:type="dxa"/>
             <w:tcBorders>
               <w:top w:val="single" w:sz="4" w:space="0" w:color="auto"/>
               <w:left w:val="single" w:sz="4" w:space="0" w:color="auto"/>
@@ -9689,7 +9698,7 @@
         </w:tc>
         <w:tc>
           <w:tcPr>
-            <w:tcW w:w="1051" w:type="dxa"/>
+            <w:tcW w:w="576" w:type="dxa"/>
             <w:tcBorders>
               <w:top w:val="single" w:sz="4" w:space="0" w:color="auto"/>
               <w:left w:val="single" w:sz="4" w:space="0" w:color="auto"/>
@@ -9720,7 +9729,7 @@
         </w:tc>
         <w:tc>
           <w:tcPr>
-            <w:tcW w:w="1051" w:type="dxa"/>
+            <w:tcW w:w="576" w:type="dxa"/>
             <w:tcBorders>
               <w:top w:val="single" w:sz="4" w:space="0" w:color="auto"/>
               <w:left w:val="single" w:sz="4" w:space="0" w:color="auto"/>
@@ -9751,7 +9760,7 @@
         </w:tc>
         <w:tc>
           <w:tcPr>
-            <w:tcW w:w="1051" w:type="dxa"/>
+            <w:tcW w:w="576" w:type="dxa"/>
             <w:tcBorders>
               <w:top w:val="single" w:sz="4" w:space="0" w:color="auto"/>
               <w:left w:val="single" w:sz="4" w:space="0" w:color="auto"/>
@@ -9783,11 +9792,12 @@
       </w:tr>
       <w:tr>
         <w:trPr>
-          <w:trHeight w:hRule="exact" w:val="1051"/>
+          <w:jc w:val="center"/>
+          <w:trHeight w:hRule="exact" w:val="576"/>
         </w:trPr>
         <w:tc>
           <w:tcPr>
-            <w:tcW w:w="1051" w:type="dxa"/>
+            <w:tcW w:w="576" w:type="dxa"/>
             <w:tcBorders>
               <w:top w:val="single" w:sz="4" w:space="0" w:color="auto"/>
               <w:left w:val="single" w:sz="4" w:space="0" w:color="auto"/>
@@ -9818,7 +9828,7 @@
         </w:tc>
         <w:tc>
           <w:tcPr>
-            <w:tcW w:w="1051" w:type="dxa"/>
+            <w:tcW w:w="576" w:type="dxa"/>
             <w:tcBorders>
               <w:top w:val="single" w:sz="4" w:space="0" w:color="auto"/>
               <w:left w:val="single" w:sz="4" w:space="0" w:color="auto"/>
@@ -9849,7 +9859,7 @@
         </w:tc>
         <w:tc>
           <w:tcPr>
-            <w:tcW w:w="1051" w:type="dxa"/>
+            <w:tcW w:w="576" w:type="dxa"/>
             <w:tcBorders>
               <w:top w:val="single" w:sz="4" w:space="0" w:color="auto"/>
               <w:left w:val="single" w:sz="4" w:space="0" w:color="auto"/>
@@ -9880,7 +9890,7 @@
         </w:tc>
         <w:tc>
           <w:tcPr>
-            <w:tcW w:w="1051" w:type="dxa"/>
+            <w:tcW w:w="576" w:type="dxa"/>
             <w:tcBorders>
               <w:top w:val="single" w:sz="4" w:space="0" w:color="auto"/>
               <w:left w:val="single" w:sz="4" w:space="0" w:color="auto"/>
@@ -9911,7 +9921,7 @@
         </w:tc>
         <w:tc>
           <w:tcPr>
-            <w:tcW w:w="1051" w:type="dxa"/>
+            <w:tcW w:w="576" w:type="dxa"/>
             <w:tcBorders>
               <w:top w:val="single" w:sz="4" w:space="0" w:color="auto"/>
               <w:left w:val="single" w:sz="4" w:space="0" w:color="auto"/>
@@ -9942,7 +9952,7 @@
         </w:tc>
         <w:tc>
           <w:tcPr>
-            <w:tcW w:w="1051" w:type="dxa"/>
+            <w:tcW w:w="576" w:type="dxa"/>
             <w:tcBorders>
               <w:top w:val="single" w:sz="4" w:space="0" w:color="auto"/>
               <w:left w:val="single" w:sz="4" w:space="0" w:color="auto"/>
@@ -9973,7 +9983,7 @@
         </w:tc>
         <w:tc>
           <w:tcPr>
-            <w:tcW w:w="1051" w:type="dxa"/>
+            <w:tcW w:w="576" w:type="dxa"/>
             <w:tcBorders>
               <w:top w:val="single" w:sz="4" w:space="0" w:color="auto"/>
               <w:left w:val="single" w:sz="4" w:space="0" w:color="auto"/>
@@ -10004,7 +10014,7 @@
         </w:tc>
         <w:tc>
           <w:tcPr>
-            <w:tcW w:w="1051" w:type="dxa"/>
+            <w:tcW w:w="576" w:type="dxa"/>
             <w:tcBorders>
               <w:top w:val="single" w:sz="4" w:space="0" w:color="auto"/>
               <w:left w:val="single" w:sz="4" w:space="0" w:color="auto"/>
@@ -10035,7 +10045,7 @@
         </w:tc>
         <w:tc>
           <w:tcPr>
-            <w:tcW w:w="1051" w:type="dxa"/>
+            <w:tcW w:w="576" w:type="dxa"/>
             <w:tcBorders>
               <w:top w:val="single" w:sz="4" w:space="0" w:color="auto"/>
               <w:left w:val="single" w:sz="4" w:space="0" w:color="auto"/>
@@ -10066,7 +10076,7 @@
         </w:tc>
         <w:tc>
           <w:tcPr>
-            <w:tcW w:w="1051" w:type="dxa"/>
+            <w:tcW w:w="576" w:type="dxa"/>
             <w:tcBorders>
               <w:top w:val="single" w:sz="4" w:space="0" w:color="auto"/>
               <w:left w:val="single" w:sz="4" w:space="0" w:color="auto"/>
@@ -10098,11 +10108,12 @@
       </w:tr>
       <w:tr>
         <w:trPr>
-          <w:trHeight w:hRule="exact" w:val="1051"/>
+          <w:jc w:val="center"/>
+          <w:trHeight w:hRule="exact" w:val="576"/>
         </w:trPr>
         <w:tc>
           <w:tcPr>
-            <w:tcW w:w="1051" w:type="dxa"/>
+            <w:tcW w:w="576" w:type="dxa"/>
             <w:tcBorders>
               <w:top w:val="single" w:sz="4" w:space="0" w:color="auto"/>
               <w:left w:val="single" w:sz="4" w:space="0" w:color="auto"/>
@@ -10133,7 +10144,7 @@
         </w:tc>
         <w:tc>
           <w:tcPr>
-            <w:tcW w:w="1051" w:type="dxa"/>
+            <w:tcW w:w="576" w:type="dxa"/>
             <w:tcBorders>
               <w:top w:val="single" w:sz="4" w:space="0" w:color="auto"/>
               <w:left w:val="single" w:sz="4" w:space="0" w:color="auto"/>
@@ -10164,7 +10175,7 @@
         </w:tc>
         <w:tc>
           <w:tcPr>
-            <w:tcW w:w="1051" w:type="dxa"/>
+            <w:tcW w:w="576" w:type="dxa"/>
             <w:tcBorders>
               <w:top w:val="single" w:sz="4" w:space="0" w:color="auto"/>
               <w:left w:val="single" w:sz="4" w:space="0" w:color="auto"/>
@@ -10195,7 +10206,7 @@
         </w:tc>
         <w:tc>
           <w:tcPr>
-            <w:tcW w:w="1051" w:type="dxa"/>
+            <w:tcW w:w="576" w:type="dxa"/>
             <w:tcBorders>
               <w:top w:val="single" w:sz="4" w:space="0" w:color="auto"/>
               <w:left w:val="single" w:sz="4" w:space="0" w:color="auto"/>
@@ -10226,7 +10237,7 @@
         </w:tc>
         <w:tc>
           <w:tcPr>
-            <w:tcW w:w="1051" w:type="dxa"/>
+            <w:tcW w:w="576" w:type="dxa"/>
             <w:tcBorders>
               <w:top w:val="single" w:sz="4" w:space="0" w:color="auto"/>
               <w:left w:val="single" w:sz="4" w:space="0" w:color="auto"/>
@@ -10257,7 +10268,7 @@
         </w:tc>
         <w:tc>
           <w:tcPr>
-            <w:tcW w:w="1051" w:type="dxa"/>
+            <w:tcW w:w="576" w:type="dxa"/>
             <w:tcBorders>
               <w:top w:val="single" w:sz="4" w:space="0" w:color="auto"/>
               <w:left w:val="single" w:sz="4" w:space="0" w:color="auto"/>
@@ -10288,7 +10299,7 @@
         </w:tc>
         <w:tc>
           <w:tcPr>
-            <w:tcW w:w="1051" w:type="dxa"/>
+            <w:tcW w:w="576" w:type="dxa"/>
             <w:tcBorders>
               <w:top w:val="single" w:sz="4" w:space="0" w:color="auto"/>
               <w:left w:val="single" w:sz="4" w:space="0" w:color="auto"/>
@@ -10319,7 +10330,7 @@
         </w:tc>
         <w:tc>
           <w:tcPr>
-            <w:tcW w:w="1051" w:type="dxa"/>
+            <w:tcW w:w="576" w:type="dxa"/>
             <w:tcBorders>
               <w:top w:val="single" w:sz="4" w:space="0" w:color="auto"/>
               <w:left w:val="single" w:sz="4" w:space="0" w:color="auto"/>
@@ -10350,7 +10361,7 @@
         </w:tc>
         <w:tc>
           <w:tcPr>
-            <w:tcW w:w="1051" w:type="dxa"/>
+            <w:tcW w:w="576" w:type="dxa"/>
             <w:tcBorders>
               <w:top w:val="single" w:sz="4" w:space="0" w:color="auto"/>
               <w:left w:val="single" w:sz="4" w:space="0" w:color="auto"/>
@@ -10381,7 +10392,7 @@
         </w:tc>
         <w:tc>
           <w:tcPr>
-            <w:tcW w:w="1051" w:type="dxa"/>
+            <w:tcW w:w="576" w:type="dxa"/>
             <w:tcBorders>
               <w:top w:val="single" w:sz="4" w:space="0" w:color="auto"/>
               <w:left w:val="single" w:sz="4" w:space="0" w:color="auto"/>

</xml_diff>

<commit_message>
Remove the empty header band and the blank page-break paragraph
Every page started 0.9" down instead of at the 0.6" top margin: the file
referenced a header (header1.xml) holding nothing but an empty paragraph,
and Word still reserves the band for it. Reference and part both removed.

Page 2 sat lower still, at 1.25", because its page break rode on a blank
paragraph ahead of the Green heading. The break now lives on the heading
itself and the blank paragraph is gone.

All three pages now begin at 0.64".

Co-Authored-By: Claude Opus 5 (1M context) <noreply@anthropic.com>
</commit_message>
<xml_diff>
--- a/week-2-listening-questioning/week-2-thinker-doer.docx
+++ b/week-2-listening-questioning/week-2-thinker-doer.docx
@@ -6952,12 +6952,6 @@
     <w:p>
       <w:pPr>
         <w:pageBreakBefore/>
-        <w:spacing w:after="200" w:line="276" w:lineRule="auto"/>
-      </w:pPr>
-      <w:r/>
-    </w:p>
-    <w:p>
-      <w:pPr>
         <w:pStyle w:val="Heading1"/>
         <w:spacing w:before="0"/>
       </w:pPr>
@@ -20614,23 +20608,12 @@
       </w:pPr>
     </w:p>
     <w:sectPr>
-      <w:headerReference w:type="default" r:id="rId_new_header_default"/>
       <w:pgSz w:w="12240" w:h="15840"/>
       <w:pgMar w:top="864" w:right="864" w:bottom="864" w:left="864" w:header="720" w:footer="720" w:gutter="0"/>
       <w:docGrid w:linePitch="360"/>
     </w:sectPr>
   </w:body>
 </w:document>
-</file>
-
-<file path=word/header1.xml><?xml version="1.0" encoding="utf-8"?>
-<w:hdr xmlns:wpc="http://schemas.microsoft.com/office/word/2010/wordprocessingCanvas" xmlns:mc="http://schemas.openxmlformats.org/markup-compatibility/2006" xmlns:o="urn:schemas-microsoft-com:office:office" xmlns:r="http://schemas.openxmlformats.org/officeDocument/2006/relationships" xmlns:m="http://schemas.openxmlformats.org/officeDocument/2006/math" xmlns:v="urn:schemas-microsoft-com:vml" xmlns:wp14="http://schemas.microsoft.com/office/word/2010/wordprocessingDrawing" xmlns:wp="http://schemas.openxmlformats.org/drawingml/2006/wordprocessingDrawing" xmlns:w10="urn:schemas-microsoft-com:office:word" xmlns:w="http://schemas.openxmlformats.org/wordprocessingml/2006/main" xmlns:w14="http://schemas.microsoft.com/office/word/2010/wordml" xmlns:w15="http://schemas.microsoft.com/office/word/2012/wordml" xmlns:w16se="http://schemas.microsoft.com/office/word/2015/wordml/symex" xmlns:w16cid="http://schemas.microsoft.com/office/word/2016/wordml/cid" xmlns:w16="http://schemas.microsoft.com/office/word/2018/wordml" xmlns:w16cex="http://schemas.microsoft.com/office/word/2018/wordml/cex" xmlns:w16sdtdh="http://schemas.microsoft.com/office/word/2020/wordml/sdtdatahash" xmlns:wne="http://schemas.microsoft.com/office/word/2006/wordml" xmlns:wpg="http://schemas.microsoft.com/office/word/2010/wordprocessingGroup" xmlns:wps="http://schemas.microsoft.com/office/word/2010/wordprocessingShape">
-  <w:p>
-    <w:pPr>
-      <w:spacing w:after="200" w:line="276" w:lineRule="auto"/>
-    </w:pPr>
-  </w:p>
-</w:hdr>
 </file>
 
 <file path=word/numbering.xml><?xml version="1.0" encoding="utf-8"?>

</xml_diff>